<commit_message>
fix(he1): compute tau calibration and q* on beta-1 (reproduces 7/7 plateau and q*=0.05)
</commit_message>
<xml_diff>
--- a/docs/Correcciones_Documento_Principal.docx
+++ b/docs/Correcciones_Documento_Principal.docx
@@ -2266,6 +2266,53 @@
       </w:r>
       <w:r>
         <w:t xml:space="preserve"> reformularse para β₁ (única forma de obtener el plateau 7/7). La app implementa βk (fiel al pie) y reporta el máximo obtenido.</w:t>
+      </w:r>
+    </w:p>
+    <w:p>
+      <w:r>
+        <w:rPr>
+          <w:b/>
+        </w:rPr>
+        <w:t>Resolución adoptada (medición de la app):</w:t>
+      </w:r>
+      <w:r>
+        <w:t xml:space="preserve"> la calibración (Fig. 5.1) y H.E.1c se computan sobre </w:t>
+      </w:r>
+      <w:r>
+        <w:rPr>
+          <w:b/>
+        </w:rPr>
+        <w:t>β₁</w:t>
+      </w:r>
+      <w:r>
+        <w:t xml:space="preserve"> —el invariante que la filtración controla—. Con β₁, la calibración alcanza </w:t>
+      </w:r>
+      <w:r>
+        <w:rPr>
+          <w:b/>
+        </w:rPr>
+        <w:t>7/7</w:t>
+      </w:r>
+      <w:r>
+        <w:t xml:space="preserve"> en τ ∈ [0.15, 0.18] (τ = 0.15 en el borde inferior, como el documento) y H.E.1c da </w:t>
+      </w:r>
+      <w:r>
+        <w:rPr>
+          <w:b/>
+        </w:rPr>
+        <w:t>q\* ≈ 0.05 ∈ [0.05, 0.10]</w:t>
+      </w:r>
+      <w:r>
+        <w:t xml:space="preserve"> (acierto 0.99 para q ≤ 0.05, 0.68 para q = 0.10). Con βk (β₀ umbralizado) no se alcanza ni el plateau 7/7 ni el q* del documento. </w:t>
+      </w:r>
+      <w:r>
+        <w:rPr>
+          <w:b/>
+        </w:rPr>
+        <w:t>Acción:</w:t>
+      </w:r>
+      <w:r>
+        <w:t xml:space="preserve"> cambiar «βk» por «β₁» en el pie de la Fig. 5.1, en la Fig. 5.2(a) y en las filas «Acierto de βk» de la Tabla 5.5.</w:t>
       </w:r>
     </w:p>
     <w:p>

</xml_diff>

<commit_message>
fix(he1): split beta-k chart and beta-1 q-star, seed catalog, update item 13
</commit_message>
<xml_diff>
--- a/docs/Correcciones_Documento_Principal.docx
+++ b/docs/Correcciones_Documento_Principal.docx
@@ -2276,7 +2276,16 @@
         <w:t>Resolución adoptada (medición de la app):</w:t>
       </w:r>
       <w:r>
-        <w:t xml:space="preserve"> la calibración (Fig. 5.1) y H.E.1c se computan sobre </w:t>
+        <w:t xml:space="preserve"> la calibración (Fig. 5.1) y el criterio de </w:t>
+      </w:r>
+      <w:r>
+        <w:rPr>
+          <w:b/>
+        </w:rPr>
+        <w:t>q\</w:t>
+      </w:r>
+      <w:r>
+        <w:t xml:space="preserve">* (H.E.1c) se computan sobre </w:t>
       </w:r>
       <w:r>
         <w:rPr>
@@ -2285,7 +2294,25 @@
         <w:t>β₁</w:t>
       </w:r>
       <w:r>
-        <w:t xml:space="preserve"> —el invariante que la filtración controla—. Con β₁, la calibración alcanza </w:t>
+        <w:t xml:space="preserve"> —el invariante que la filtración controla—; la </w:t>
+      </w:r>
+      <w:r>
+        <w:rPr>
+          <w:b/>
+        </w:rPr>
+        <w:t>Fig. 5.2(a)</w:t>
+      </w:r>
+      <w:r>
+        <w:t xml:space="preserve"> grafica </w:t>
+      </w:r>
+      <w:r>
+        <w:rPr>
+          <w:b/>
+        </w:rPr>
+        <w:t>βk = (β₀, β₁)</w:t>
+      </w:r>
+      <w:r>
+        <w:t xml:space="preserve"> como el documento. Con β₁, la calibración alcanza </w:t>
       </w:r>
       <w:r>
         <w:rPr>
@@ -2303,7 +2330,7 @@
         <w:t>q\* ≈ 0.05 ∈ [0.05, 0.10]</w:t>
       </w:r>
       <w:r>
-        <w:t xml:space="preserve"> (acierto 0.99 para q ≤ 0.05, 0.68 para q = 0.10). Con βk (β₀ umbralizado) no se alcanza ni el plateau 7/7 ni el q* del documento. </w:t>
+        <w:t xml:space="preserve"> (acierto 0.99 para q ≤ 0.05). Con βk (β₀ umbralizado) no se alcanza ni el plateau 7/7 ni el q* del documento. </w:t>
       </w:r>
       <w:r>
         <w:rPr>
@@ -2312,7 +2339,7 @@
         <w:t>Acción:</w:t>
       </w:r>
       <w:r>
-        <w:t xml:space="preserve"> cambiar «βk» por «β₁» en el pie de la Fig. 5.1, en la Fig. 5.2(a) y en las filas «Acierto de βk» de la Tabla 5.5.</w:t>
+        <w:t xml:space="preserve"> cambiar «βk» por «β₁» en el pie de la Fig. 5.1, en el criterio de q* y en las filas «Acierto de βk» de la Tabla 5.5; la Fig. 5.2(a) sí queda en βk.</w:t>
       </w:r>
     </w:p>
     <w:p>

</xml_diff>

<commit_message>
feat(fig-5.1): reimplement calibration with corrected catalog and normalized noise (Items 29-30)
Reproduce Fig. 5.1 exactly as the corrected Cap. V PDF: tau* = 0.175 is the
only grid point with 7/7 hits of (beta_0, beta_1).

- analysis/calibracion.py: independent catalog C0 (seeds 900+i), 0.025 grid,
  margins over the measurement catalog C
- sampling.py: corrected catalog geometry (dos_circulos r=0.6/sep 3, toro r=0.8,
  anillo r in [0.75,1], gaussian truncated at 2 sigma) and noise
  sigma = q*diam(X)/sqrt(d)
- he_protocols.py: TAU_CALIBRADO = 0.175, calibrar_tau delegates to calibracion
- figuras.py: fig_51_calibracion with a light/dark theme parameter; app page
  H.E.1 renders the same matplotlib figure as its single source of truth
- docs: Item 29 (dimension-normalized noise), Item 30 (corrected catalog),
  Item 13 retracted, traceability row updated
</commit_message>
<xml_diff>
--- a/docs/Correcciones_Documento_Principal.docx
+++ b/docs/Correcciones_Documento_Principal.docx
@@ -1462,6 +1462,129 @@
         <w:rPr>
           <w:b/>
         </w:rPr>
+        <w:t>Estado: IMPLEMENTADO.</w:t>
+      </w:r>
+      <w:r>
+        <w:t xml:space="preserve"> La Fig. 5.3 (app y </w:t>
+      </w:r>
+      <w:r>
+        <w:rPr>
+          <w:rFonts w:ascii="Consolas" w:hAnsi="Consolas"/>
+          <w:sz w:val="20"/>
+        </w:rPr>
+        <w:t>visualization.figuras</w:t>
+      </w:r>
+      <w:r>
+        <w:t xml:space="preserve">) grafica </w:t>
+      </w:r>
+      <w:r>
+        <w:rPr>
+          <w:rFonts w:ascii="Consolas" w:hAnsi="Consolas"/>
+          <w:sz w:val="20"/>
+        </w:rPr>
+        <w:t>dB/dH</w:t>
+      </w:r>
+      <w:r>
+        <w:t xml:space="preserve"> vs la cota </w:t>
+      </w:r>
+      <w:r>
+        <w:rPr>
+          <w:rFonts w:ascii="Consolas" w:hAnsi="Consolas"/>
+          <w:sz w:val="20"/>
+        </w:rPr>
+        <w:t>2</w:t>
+      </w:r>
+      <w:r>
+        <w:t xml:space="preserve"> con barras de error. Medición R=100, n=400: máximo </w:t>
+      </w:r>
+      <w:r>
+        <w:rPr>
+          <w:rFonts w:ascii="Consolas" w:hAnsi="Consolas"/>
+          <w:sz w:val="20"/>
+        </w:rPr>
+        <w:t>dB/dH = 1.92 &lt; 2</w:t>
+      </w:r>
+      <w:r>
+        <w:t xml:space="preserve">, todas las curvas por debajo de la cota y ninguna la toca — consistente con la observación del documento. La antigua cota normalizada </w:t>
+      </w:r>
+      <w:r>
+        <w:rPr>
+          <w:rFonts w:ascii="Consolas" w:hAnsi="Consolas"/>
+          <w:sz w:val="20"/>
+        </w:rPr>
+        <w:t>dB/diam ≤ 2q</w:t>
+      </w:r>
+      <w:r>
+        <w:t xml:space="preserve"> se retira (no es consecuencia del teorema).</w:t>
+      </w:r>
+    </w:p>
+    <w:p>
+      <w:r>
+        <w:t xml:space="preserve">&gt; </w:t>
+      </w:r>
+      <w:r>
+        <w:rPr>
+          <w:b/>
+        </w:rPr>
+        <w:t>Actualización (Item 25):</w:t>
+      </w:r>
+      <w:r>
+        <w:t xml:space="preserve"> por decisión posterior del autor, la Fig. 5.3 </w:t>
+      </w:r>
+      <w:r>
+        <w:rPr>
+          <w:b/>
+        </w:rPr>
+        <w:t>vuelve a la forma literal del PDF</w:t>
+      </w:r>
+      <w:r>
+        <w:t xml:space="preserve"> (</w:t>
+      </w:r>
+      <w:r>
+        <w:rPr>
+          <w:rFonts w:ascii="Consolas" w:hAnsi="Consolas"/>
+          <w:sz w:val="20"/>
+        </w:rPr>
+        <w:t>dB/diam(X)</w:t>
+      </w:r>
+      <w:r>
+        <w:t xml:space="preserve"> vs </w:t>
+      </w:r>
+      <w:r>
+        <w:rPr>
+          <w:rFonts w:ascii="Consolas" w:hAnsi="Consolas"/>
+          <w:sz w:val="20"/>
+        </w:rPr>
+        <w:t>2q</w:t>
+      </w:r>
+      <w:r>
+        <w:t xml:space="preserve">). Este Item queda </w:t>
+      </w:r>
+      <w:r>
+        <w:rPr>
+          <w:b/>
+        </w:rPr>
+        <w:t>superado</w:t>
+      </w:r>
+      <w:r>
+        <w:t xml:space="preserve"> por el Item 25 en lo que respecta a la figura; el análisis matemático (la cota </w:t>
+      </w:r>
+      <w:r>
+        <w:rPr>
+          <w:rFonts w:ascii="Consolas" w:hAnsi="Consolas"/>
+          <w:sz w:val="20"/>
+        </w:rPr>
+        <w:t>dB/diam ≤ 2q</w:t>
+      </w:r>
+      <w:r>
+        <w:t xml:space="preserve"> no es consecuencia del teorema y no se sostiene con la métrica exacta) sigue siendo válido y se conserva como nota.</w:t>
+      </w:r>
+    </w:p>
+    <w:p>
+      <w:r>
+        <w:rPr>
+          <w:b/>
+        </w:rPr>
         <w:t>Razón (con evidencia):</w:t>
       </w:r>
       <w:r>
@@ -1762,6 +1885,146 @@
     </w:p>
     <w:p>
       <w:r>
+        <w:t xml:space="preserve">&gt; </w:t>
+      </w:r>
+      <w:r>
+        <w:rPr>
+          <w:b/>
+        </w:rPr>
+        <w:t>Re-medición (Item 29):</w:t>
+      </w:r>
+      <w:r>
+        <w:t xml:space="preserve"> con el ruido corregido </w:t>
+      </w:r>
+      <w:r>
+        <w:rPr>
+          <w:rFonts w:ascii="Consolas" w:hAnsi="Consolas"/>
+          <w:sz w:val="20"/>
+        </w:rPr>
+        <w:t>σ = q·diam/√d</w:t>
+      </w:r>
+      <w:r>
+        <w:t xml:space="preserve"> y el catálogo</w:t>
+      </w:r>
+    </w:p>
+    <w:p>
+      <w:r>
+        <w:t xml:space="preserve">&gt; corregido (Item 30), R = 20, n = 400, q = 0,10: </w:t>
+      </w:r>
+      <w:r>
+        <w:rPr>
+          <w:rFonts w:ascii="Consolas" w:hAnsi="Consolas"/>
+          <w:sz w:val="20"/>
+        </w:rPr>
+        <w:t>frac(dB/diam ≤ 2q)</w:t>
+      </w:r>
+      <w:r>
+        <w:t xml:space="preserve"> = 0,00 (círculo),</w:t>
+      </w:r>
+    </w:p>
+    <w:p>
+      <w:r>
+        <w:t xml:space="preserve">&gt; 0,50 (anillo), 1,00 (toro), 1,00 (disco); </w:t>
+      </w:r>
+      <w:r>
+        <w:rPr>
+          <w:rFonts w:ascii="Consolas" w:hAnsi="Consolas"/>
+          <w:sz w:val="20"/>
+        </w:rPr>
+        <w:t>frac(dB ≤ 2dH)</w:t>
+      </w:r>
+      <w:r>
+        <w:t xml:space="preserve"> = </w:t>
+      </w:r>
+      <w:r>
+        <w:rPr>
+          <w:b/>
+        </w:rPr>
+        <w:t>1,00 en las cuatro</w:t>
+      </w:r>
+      <w:r>
+        <w:t>;</w:t>
+      </w:r>
+    </w:p>
+    <w:p>
+      <w:r>
+        <w:t xml:space="preserve">&gt; máximo </w:t>
+      </w:r>
+      <w:r>
+        <w:rPr>
+          <w:rFonts w:ascii="Consolas" w:hAnsi="Consolas"/>
+          <w:sz w:val="20"/>
+        </w:rPr>
+        <w:t>dB/dH</w:t>
+      </w:r>
+      <w:r>
+        <w:t xml:space="preserve"> = 1,47. El ruido más suave deja al </w:t>
+      </w:r>
+      <w:r>
+        <w:rPr>
+          <w:b/>
+        </w:rPr>
+        <w:t>toro</w:t>
+      </w:r>
+      <w:r>
+        <w:t xml:space="preserve"> por debajo de </w:t>
+      </w:r>
+      <w:r>
+        <w:rPr>
+          <w:rFonts w:ascii="Consolas" w:hAnsi="Consolas"/>
+          <w:sz w:val="20"/>
+        </w:rPr>
+        <w:t>2q</w:t>
+      </w:r>
+      <w:r>
+        <w:t xml:space="preserve"> (antes</w:t>
+      </w:r>
+    </w:p>
+    <w:p>
+      <w:r>
+        <w:t xml:space="preserve">&gt; 0,45), pero </w:t>
+      </w:r>
+      <w:r>
+        <w:rPr>
+          <w:b/>
+        </w:rPr>
+        <w:t>círculo y anillo siguen violándola</w:t>
+      </w:r>
+      <w:r>
+        <w:t>: la conclusión —</w:t>
+      </w:r>
+      <w:r>
+        <w:rPr>
+          <w:rFonts w:ascii="Consolas" w:hAnsi="Consolas"/>
+          <w:sz w:val="20"/>
+        </w:rPr>
+        <w:t>2q·diam</w:t>
+      </w:r>
+      <w:r>
+        <w:t xml:space="preserve"> no es</w:t>
+      </w:r>
+    </w:p>
+    <w:p>
+      <w:r>
+        <w:t xml:space="preserve">&gt; consecuencia del teorema— </w:t>
+      </w:r>
+      <w:r>
+        <w:rPr>
+          <w:b/>
+        </w:rPr>
+        <w:t>se mantiene</w:t>
+      </w:r>
+      <w:r>
+        <w:t>. Pendiente de la pasada 5.2/5.3 recalcular</w:t>
+      </w:r>
+    </w:p>
+    <w:p>
+      <w:r>
+        <w:t>&gt; todo el barrido con R = 100.</w:t>
+      </w:r>
+    </w:p>
+    <w:p>
+      <w:r>
         <w:rPr>
           <w:b/>
         </w:rPr>
@@ -1910,6 +2173,86 @@
       </w:pPr>
       <w:r>
         <w:t>Item 13 — Fig. 5.1: la definición βk no reproduce su plateau 7/7</w:t>
+      </w:r>
+    </w:p>
+    <w:p>
+      <w:r>
+        <w:t xml:space="preserve">&gt; </w:t>
+      </w:r>
+      <w:r>
+        <w:rPr>
+          <w:b/>
+        </w:rPr>
+        <w:t>RETRACTADO por el Item 30.</w:t>
+      </w:r>
+      <w:r>
+        <w:t xml:space="preserve"> La premisa de este item («con βk no existe ventana 7/7»)</w:t>
+      </w:r>
+    </w:p>
+    <w:p>
+      <w:r>
+        <w:t xml:space="preserve">&gt; era </w:t>
+      </w:r>
+      <w:r>
+        <w:rPr>
+          <w:b/>
+        </w:rPr>
+        <w:t>falsa</w:t>
+      </w:r>
+      <w:r>
+        <w:t>: provenía de un catálogo con geometría equivocada y de una gaussiana sin</w:t>
+      </w:r>
+    </w:p>
+    <w:p>
+      <w:r>
+        <w:t xml:space="preserve">&gt; truncar. Con el catálogo corregido (Item 30), </w:t>
+      </w:r>
+      <w:r>
+        <w:rPr>
+          <w:b/>
+        </w:rPr>
+        <w:t>βk = (β₀, β₁) sí alcanza 7/7</w:t>
+      </w:r>
+      <w:r>
+        <w:t>, en un</w:t>
+      </w:r>
+    </w:p>
+    <w:p>
+      <w:r>
+        <w:t xml:space="preserve">&gt; único punto </w:t>
+      </w:r>
+      <w:r>
+        <w:rPr>
+          <w:b/>
+        </w:rPr>
+        <w:t>τ\* = 0,175</w:t>
+      </w:r>
+      <w:r>
+        <w:t>. Se conserva el item íntegro por trazabilidad; la</w:t>
+      </w:r>
+    </w:p>
+    <w:p>
+      <w:r>
+        <w:t xml:space="preserve">&gt; «Resolución adoptada» de abajo (calibrar sobre β₁) </w:t>
+      </w:r>
+      <w:r>
+        <w:rPr>
+          <w:b/>
+        </w:rPr>
+        <w:t>queda anulada</w:t>
+      </w:r>
+      <w:r>
+        <w:t>: la calibración</w:t>
+      </w:r>
+    </w:p>
+    <w:p>
+      <w:r>
+        <w:t>&gt; vuelve a βk, como dice el pie de la figura. Solo queda pendiente recalcular q\* y la</w:t>
+      </w:r>
+    </w:p>
+    <w:p>
+      <w:r>
+        <w:t>&gt; Tabla 5.5 con τ = 0,175 (pasada de la Fig. 5.2).</w:t>
       </w:r>
     </w:p>
     <w:p>
@@ -2340,6 +2683,4395 @@
       </w:r>
       <w:r>
         <w:t xml:space="preserve"> cambiar «βk» por «β₁» en el pie de la Fig. 5.1, en el criterio de q* y en las filas «Acierto de βk» de la Tabla 5.5; la Fig. 5.2(a) sí queda en βk.</w:t>
+      </w:r>
+    </w:p>
+    <w:p>
+      <w:pPr>
+        <w:pStyle w:val="Heading1"/>
+      </w:pPr>
+      <w:r>
+        <w:t>Item 14 — Implementación exacta de la distancia bottleneck</w:t>
+      </w:r>
+    </w:p>
+    <w:p>
+      <w:r>
+        <w:rPr>
+          <w:b/>
+        </w:rPr>
+        <w:t>Antes:</w:t>
+      </w:r>
+      <w:r>
+        <w:t xml:space="preserve"> </w:t>
+      </w:r>
+      <w:r>
+        <w:rPr>
+          <w:rFonts w:ascii="Consolas" w:hAnsi="Consolas"/>
+          <w:sz w:val="20"/>
+        </w:rPr>
+        <w:t>topology.bottleneck_distance</w:t>
+      </w:r>
+      <w:r>
+        <w:t xml:space="preserve"> era una heurística greedy con norma L2</w:t>
+      </w:r>
+    </w:p>
+    <w:p>
+      <w:r>
+        <w:t xml:space="preserve">(vecino más cercano + proyección a la diagonal). Además, en </w:t>
+      </w:r>
+      <w:r>
+        <w:rPr>
+          <w:rFonts w:ascii="Consolas" w:hAnsi="Consolas"/>
+          <w:sz w:val="20"/>
+        </w:rPr>
+        <w:t>he_protocols.bottleneck_cota</w:t>
+      </w:r>
+    </w:p>
+    <w:p>
+      <w:r>
+        <w:t xml:space="preserve">y </w:t>
+      </w:r>
+      <w:r>
+        <w:rPr>
+          <w:rFonts w:ascii="Consolas" w:hAnsi="Consolas"/>
+          <w:sz w:val="20"/>
+        </w:rPr>
+        <w:t>stability.verificar_cota_bottleneck</w:t>
+      </w:r>
+      <w:r>
+        <w:t xml:space="preserve"> un diagrama vacío devolvía </w:t>
+      </w:r>
+      <w:r>
+        <w:rPr>
+          <w:rFonts w:ascii="Consolas" w:hAnsi="Consolas"/>
+          <w:sz w:val="20"/>
+        </w:rPr>
+        <w:t>0.0</w:t>
+      </w:r>
+      <w:r>
+        <w:t>, ocultando</w:t>
+      </w:r>
+    </w:p>
+    <w:p>
+      <w:r>
+        <w:t>violaciones.</w:t>
+      </w:r>
+    </w:p>
+    <w:p>
+      <w:r>
+        <w:rPr>
+          <w:b/>
+        </w:rPr>
+        <w:t>Después:</w:t>
+      </w:r>
+      <w:r>
+        <w:t xml:space="preserve"> la distancia se calcula con la </w:t>
+      </w:r>
+      <w:r>
+        <w:rPr>
+          <w:b/>
+        </w:rPr>
+        <w:t>definición estándar exacta</w:t>
+      </w:r>
+    </w:p>
+    <w:p>
+      <w:r>
+        <w:t>(Cohen-Steiner et al. 2007): costo L∞ y emparejamiento resuelto por asignación</w:t>
+      </w:r>
+    </w:p>
+    <w:p>
+      <w:r>
+        <w:t>húngara (</w:t>
+      </w:r>
+      <w:r>
+        <w:rPr>
+          <w:rFonts w:ascii="Consolas" w:hAnsi="Consolas"/>
+          <w:sz w:val="20"/>
+        </w:rPr>
+        <w:t>scipy.optimize.linear_sum_assignment</w:t>
+      </w:r>
+      <w:r>
+        <w:t xml:space="preserve">) sobre </w:t>
+      </w:r>
+      <w:r>
+        <w:rPr>
+          <w:rFonts w:ascii="Consolas" w:hAnsi="Consolas"/>
+          <w:sz w:val="20"/>
+        </w:rPr>
+        <w:t>(A ∪ Δ)</w:t>
+      </w:r>
+      <w:r>
+        <w:t xml:space="preserve"> vs </w:t>
+      </w:r>
+      <w:r>
+        <w:rPr>
+          <w:rFonts w:ascii="Consolas" w:hAnsi="Consolas"/>
+          <w:sz w:val="20"/>
+        </w:rPr>
+        <w:t>(B ∪ Δ)</w:t>
+      </w:r>
+      <w:r>
+        <w:t>,</w:t>
+      </w:r>
+    </w:p>
+    <w:p>
+      <w:r>
+        <w:t>con costo punto–diagonal = persistencia/2. Los diagramas vacíos se resuelven</w:t>
+      </w:r>
+    </w:p>
+    <w:p>
+      <w:r>
+        <w:t>contra la diagonal, nunca como 0.</w:t>
+      </w:r>
+    </w:p>
+    <w:p>
+      <w:r>
+        <w:rPr>
+          <w:b/>
+        </w:rPr>
+        <w:t>Razón (con evidencia):</w:t>
+      </w:r>
+      <w:r>
+        <w:t xml:space="preserve"> la heurística subestimaba o sobreestimaba dB de forma</w:t>
+      </w:r>
+    </w:p>
+    <w:p>
+      <w:r>
+        <w:t>no sistemática (p. ej. círculo H₁: 0.674 vs exacto 0.672; toro H₀: 0.738 vs 0.761).</w:t>
+      </w:r>
+    </w:p>
+    <w:p>
+      <w:r>
+        <w:t xml:space="preserve">La Tabla 1.1 declara el instrumento como </w:t>
+      </w:r>
+      <w:r>
+        <w:rPr>
+          <w:rFonts w:ascii="Consolas" w:hAnsi="Consolas"/>
+          <w:sz w:val="20"/>
+        </w:rPr>
+        <w:t>Persim 0.3</w:t>
+      </w:r>
+      <w:r>
+        <w:t>; la versión exacta coincide</w:t>
+      </w:r>
+    </w:p>
+    <w:p>
+      <w:r>
+        <w:t>con persim/gudhi pero sin dependencia adicional.</w:t>
+      </w:r>
+    </w:p>
+    <w:p>
+      <w:r>
+        <w:rPr>
+          <w:b/>
+        </w:rPr>
+        <w:t>Consecuencia:</w:t>
+      </w:r>
+      <w:r>
+        <w:t xml:space="preserve"> la verificación de H.E.1a pasa a ser concluyente. Con la métrica</w:t>
+      </w:r>
+    </w:p>
+    <w:p>
+      <w:r>
+        <w:t xml:space="preserve">exacta, </w:t>
+      </w:r>
+      <w:r>
+        <w:rPr>
+          <w:rFonts w:ascii="Consolas" w:hAnsi="Consolas"/>
+          <w:sz w:val="20"/>
+        </w:rPr>
+        <w:t>dB ≤ 2·dH</w:t>
+      </w:r>
+      <w:r>
+        <w:t xml:space="preserve"> se cumple en </w:t>
+      </w:r>
+      <w:r>
+        <w:rPr>
+          <w:b/>
+        </w:rPr>
+        <w:t>20/20</w:t>
+      </w:r>
+      <w:r>
+        <w:t xml:space="preserve"> réplicas por nube (q = 0.10). El corolario</w:t>
+      </w:r>
+    </w:p>
+    <w:p>
+      <w:r>
+        <w:t xml:space="preserve">normalizado </w:t>
+      </w:r>
+      <w:r>
+        <w:rPr>
+          <w:rFonts w:ascii="Consolas" w:hAnsi="Consolas"/>
+          <w:sz w:val="20"/>
+        </w:rPr>
+        <w:t>dB/diam ≤ 2q</w:t>
+      </w:r>
+      <w:r>
+        <w:t xml:space="preserve"> —no implicado por el teorema— falla en círculo (0/20) y</w:t>
+      </w:r>
+    </w:p>
+    <w:p>
+      <w:r>
+        <w:t>dos_círculos (1/20), en línea con el Item 11.</w:t>
+      </w:r>
+    </w:p>
+    <w:p>
+      <w:pPr>
+        <w:pStyle w:val="Heading1"/>
+      </w:pPr>
+      <w:r>
+        <w:t>Item 15 — Veredicto H.E.2b: se excluye p = 1</w:t>
+      </w:r>
+    </w:p>
+    <w:p>
+      <w:r>
+        <w:rPr>
+          <w:b/>
+        </w:rPr>
+        <w:t>Antes:</w:t>
+      </w:r>
+      <w:r>
+        <w:t xml:space="preserve"> el veredicto final del barrido evaluaba la invariancia de β₁ sobre</w:t>
+      </w:r>
+    </w:p>
+    <w:p>
+      <w:r>
+        <w:rPr>
+          <w:rFonts w:ascii="Consolas" w:hAnsi="Consolas"/>
+          <w:sz w:val="20"/>
+        </w:rPr>
+        <w:t>p ∈ {1,2,3,4}</w:t>
+      </w:r>
+      <w:r>
+        <w:t xml:space="preserve">. Como </w:t>
+      </w:r>
+      <w:r>
+        <w:rPr>
+          <w:rFonts w:ascii="Consolas" w:hAnsi="Consolas"/>
+          <w:sz w:val="20"/>
+        </w:rPr>
+        <w:t>p = 1</w:t>
+      </w:r>
+      <w:r>
+        <w:t xml:space="preserve"> no penaliza (diseño gris, β₁ = 0 sin frontera</w:t>
+      </w:r>
+    </w:p>
+    <w:p>
+      <w:r>
+        <w:t>sólido/vacío), el veredicto se marcaba "varía" aunque el método fuera correcto.</w:t>
+      </w:r>
+    </w:p>
+    <w:p>
+      <w:r>
+        <w:rPr>
+          <w:b/>
+        </w:rPr>
+        <w:t>Después:</w:t>
+      </w:r>
+      <w:r>
+        <w:t xml:space="preserve"> la invariancia se evalúa sobre </w:t>
+      </w:r>
+      <w:r>
+        <w:rPr>
+          <w:rFonts w:ascii="Consolas" w:hAnsi="Consolas"/>
+          <w:sz w:val="20"/>
+        </w:rPr>
+        <w:t>p ∈ {2,3,4}</w:t>
+      </w:r>
+      <w:r>
+        <w:t xml:space="preserve"> (rango recomendado por</w:t>
+      </w:r>
+    </w:p>
+    <w:p>
+      <w:r>
+        <w:t>la literatura y por la propia §5.5.2 del documento), tanto en el barrido como en</w:t>
+      </w:r>
+    </w:p>
+    <w:p>
+      <w:r>
+        <w:t xml:space="preserve">el veredicto. </w:t>
+      </w:r>
+      <w:r>
+        <w:rPr>
+          <w:rFonts w:ascii="Consolas" w:hAnsi="Consolas"/>
+          <w:sz w:val="20"/>
+        </w:rPr>
+        <w:t>p = 1</w:t>
+      </w:r>
+      <w:r>
+        <w:t xml:space="preserve"> se reporta como referencia, no como invariante.</w:t>
+      </w:r>
+    </w:p>
+    <w:p>
+      <w:r>
+        <w:rPr>
+          <w:b/>
+        </w:rPr>
+        <w:t>Razón:</w:t>
+      </w:r>
+      <w:r>
+        <w:t xml:space="preserve"> H.E.2b afirma invariancia "en el rango recomendado"; incluir p = 1 es</w:t>
+      </w:r>
+    </w:p>
+    <w:p>
+      <w:r>
+        <w:t>un veto espurio.</w:t>
+      </w:r>
+    </w:p>
+    <w:p>
+      <w:pPr>
+        <w:pStyle w:val="Heading1"/>
+      </w:pPr>
+      <w:r>
+        <w:t>Item 16 — Techo de iteraciones, registro de entorno y reconstrucción E3</w:t>
+      </w:r>
+    </w:p>
+    <w:p>
+      <w:r>
+        <w:rPr>
+          <w:b/>
+        </w:rPr>
+        <w:t>Antes:</w:t>
+      </w:r>
+      <w:r>
+        <w:t xml:space="preserve"> la UI limitaba </w:t>
+      </w:r>
+      <w:r>
+        <w:rPr>
+          <w:rFonts w:ascii="Consolas" w:hAnsi="Consolas"/>
+          <w:sz w:val="20"/>
+        </w:rPr>
+        <w:t>max_iter</w:t>
+      </w:r>
+      <w:r>
+        <w:t xml:space="preserve"> a 200; no se exportaba registro de entorno;</w:t>
+      </w:r>
+    </w:p>
+    <w:p>
+      <w:r>
+        <w:t>las figuras solo se rasterizaban desde la sesión de Streamlit.</w:t>
+      </w:r>
+    </w:p>
+    <w:p>
+      <w:r>
+        <w:rPr>
+          <w:b/>
+        </w:rPr>
+        <w:t>Después:</w:t>
+      </w:r>
+    </w:p>
+    <w:p>
+      <w:pPr>
+        <w:pStyle w:val="ListBullet"/>
+      </w:pPr>
+      <w:r>
+        <w:rPr>
+          <w:rFonts w:ascii="Consolas" w:hAnsi="Consolas"/>
+          <w:sz w:val="20"/>
+        </w:rPr>
+        <w:t>max_iter</w:t>
+      </w:r>
+      <w:r>
+        <w:t xml:space="preserve"> por defecto 300 (Algoritmo 2, paso 24), ajustable en UI hasta 500.</w:t>
+      </w:r>
+    </w:p>
+    <w:p>
+      <w:pPr>
+        <w:pStyle w:val="ListBullet"/>
+      </w:pPr>
+      <w:r>
+        <w:t xml:space="preserve">Cada ZIP incorpora </w:t>
+      </w:r>
+      <w:r>
+        <w:rPr>
+          <w:rFonts w:ascii="Consolas" w:hAnsi="Consolas"/>
+          <w:sz w:val="20"/>
+        </w:rPr>
+        <w:t>entorno.json</w:t>
+      </w:r>
+      <w:r>
+        <w:t xml:space="preserve"> (entregable E5): Python, plataforma, versiones</w:t>
+      </w:r>
+    </w:p>
+    <w:p>
+      <w:r>
+        <w:t>de paquetes, semilla y parámetros de la corrida.</w:t>
+      </w:r>
+    </w:p>
+    <w:p>
+      <w:pPr>
+        <w:pStyle w:val="ListBullet"/>
+      </w:pPr>
+      <w:r>
+        <w:t xml:space="preserve">Nuevo módulo </w:t>
+      </w:r>
+      <w:r>
+        <w:rPr>
+          <w:rFonts w:ascii="Consolas" w:hAnsi="Consolas"/>
+          <w:sz w:val="20"/>
+        </w:rPr>
+        <w:t>src/tda/visualization/figuras.py</w:t>
+      </w:r>
+      <w:r>
+        <w:t xml:space="preserve"> (entregable E3): reconstruye las</w:t>
+      </w:r>
+    </w:p>
+    <w:p>
+      <w:r>
+        <w:t xml:space="preserve">figuras 5.1–5.7 </w:t>
+      </w:r>
+      <w:r>
+        <w:rPr>
+          <w:b/>
+        </w:rPr>
+        <w:t>sin Streamlit</w:t>
+      </w:r>
+      <w:r>
+        <w:t>, por script, desde los protocolos o CSV, con</w:t>
+      </w:r>
+    </w:p>
+    <w:p>
+      <w:r>
+        <w:t xml:space="preserve">los ejes y escalas del documento. CLI: </w:t>
+      </w:r>
+      <w:r>
+        <w:rPr>
+          <w:rFonts w:ascii="Consolas" w:hAnsi="Consolas"/>
+          <w:sz w:val="20"/>
+        </w:rPr>
+        <w:t>python -m tda.visualization.figuras --todos</w:t>
+      </w:r>
+      <w:r>
+        <w:t>.</w:t>
+      </w:r>
+    </w:p>
+    <w:p>
+      <w:r>
+        <w:rPr>
+          <w:b/>
+        </w:rPr>
+        <w:t>Razón:</w:t>
+      </w:r>
+      <w:r>
+        <w:t xml:space="preserve"> reproducibilidad verificable (F6) y trazabilidad de las figuras.</w:t>
+      </w:r>
+    </w:p>
+    <w:p>
+      <w:pPr>
+        <w:pStyle w:val="Heading1"/>
+      </w:pPr>
+      <w:r>
+        <w:t>Item 17 — Fig. 5.6: β₁ = 0 en el PDF (RETRACTA una lectura previa)</w:t>
+      </w:r>
+    </w:p>
+    <w:p>
+      <w:r>
+        <w:rPr>
+          <w:b/>
+        </w:rPr>
+        <w:t>Corrección:</w:t>
+      </w:r>
+      <w:r>
+        <w:t xml:space="preserve"> una versión anterior de este documento afirmó que la Fig. 5.6 del PDF</w:t>
+      </w:r>
+    </w:p>
+    <w:p>
+      <w:r>
+        <w:t>mostraba $\beta_1 = 3$. La inspección directa de la imagen del PDF (pág. 48, render a</w:t>
+      </w:r>
+    </w:p>
+    <w:p>
+      <w:r>
+        <w:t xml:space="preserve">300 dpi) muestra que la línea verde de $\beta_1$ está </w:t>
+      </w:r>
+      <w:r>
+        <w:rPr>
+          <w:b/>
+        </w:rPr>
+        <w:t>en 0</w:t>
+      </w:r>
+      <w:r>
+        <w:t xml:space="preserve"> (alineada con el </w:t>
+      </w:r>
+      <w:r>
+        <w:rPr>
+          <w:rFonts w:ascii="Consolas" w:hAnsi="Consolas"/>
+          <w:sz w:val="20"/>
+        </w:rPr>
+        <w:t>0</w:t>
+      </w:r>
+      <w:r>
+        <w:t xml:space="preserve"> del</w:t>
+      </w:r>
+    </w:p>
+    <w:p>
+      <w:r>
+        <w:t xml:space="preserve">eje derecho). Por lo tanto </w:t>
+      </w:r>
+      <w:r>
+        <w:rPr>
+          <w:b/>
+        </w:rPr>
+        <w:t>coincide con el software</w:t>
+      </w:r>
+      <w:r>
+        <w:t xml:space="preserve"> ($\beta_1 = 0$, estable en todo</w:t>
+      </w:r>
+    </w:p>
+    <w:p>
+      <w:r>
+        <w:t>el barrido de malla cuadrada). No hay inconsistencia de $\beta_1$; la afirmación previa</w:t>
+      </w:r>
+    </w:p>
+    <w:p>
+      <w:r>
+        <w:t xml:space="preserve">queda </w:t>
+      </w:r>
+      <w:r>
+        <w:rPr>
+          <w:b/>
+        </w:rPr>
+        <w:t>retirada</w:t>
+      </w:r>
+      <w:r>
+        <w:t>.</w:t>
+      </w:r>
+    </w:p>
+    <w:p>
+      <w:r>
+        <w:rPr>
+          <w:b/>
+        </w:rPr>
+        <w:t>Razón del error:</w:t>
+      </w:r>
+      <w:r>
+        <w:t xml:space="preserve"> se tomó el $\beta_1 = 3$ del caso base (viga 60×30, Figs. 5.4–5.5)</w:t>
+      </w:r>
+    </w:p>
+    <w:p>
+      <w:r>
+        <w:t>y se atribuyó por error a la Fig. 5.6 (dominio cuadrado).</w:t>
+      </w:r>
+    </w:p>
+    <w:p>
+      <w:pPr>
+        <w:pStyle w:val="Heading1"/>
+      </w:pPr>
+      <w:r>
+        <w:t>Item 18 — Fig. 5.7: el barrido de umbral debe usar el Método B (GUDHI)</w:t>
+      </w:r>
+    </w:p>
+    <w:p>
+      <w:r>
+        <w:rPr>
+          <w:b/>
+        </w:rPr>
+        <w:t>Hecho (con evidencia):</w:t>
+      </w:r>
+      <w:r>
+        <w:t xml:space="preserve"> el barrido de binarización sobre la viga 60×30 da resultados</w:t>
+      </w:r>
+    </w:p>
+    <w:p>
+      <w:r>
+        <w:t>opuestos según el método para $u \ge 0.90$:</w:t>
+      </w:r>
+    </w:p>
+    <w:tbl>
+      <w:tblPr>
+        <w:tblStyle w:val="LightGrid-Accent1"/>
+        <w:tblW w:type="auto" w:w="0"/>
+        <w:tblLook w:firstColumn="1" w:firstRow="1" w:lastColumn="0" w:lastRow="0" w:noHBand="0" w:noVBand="1" w:val="04A0"/>
+      </w:tblPr>
+      <w:tblGrid>
+        <w:gridCol w:w="2880"/>
+        <w:gridCol w:w="2880"/>
+        <w:gridCol w:w="2880"/>
+      </w:tblGrid>
+      <w:tr>
+        <w:tc>
+          <w:tcPr>
+            <w:tcW w:type="dxa" w:w="2880"/>
+          </w:tcPr>
+          <w:p>
+            <w:r>
+              <w:rPr>
+                <w:b/>
+              </w:rPr>
+            </w:r>
+            <w:r>
+              <w:rPr>
+                <w:b/>
+              </w:rPr>
+              <w:t>$u$</w:t>
+            </w:r>
+          </w:p>
+        </w:tc>
+        <w:tc>
+          <w:tcPr>
+            <w:tcW w:type="dxa" w:w="2880"/>
+          </w:tcPr>
+          <w:p>
+            <w:r>
+              <w:rPr>
+                <w:b/>
+              </w:rPr>
+            </w:r>
+            <w:r>
+              <w:rPr>
+                <w:b/>
+              </w:rPr>
+              <w:t>Euler (A) $\beta_0/\beta_1$</w:t>
+            </w:r>
+          </w:p>
+        </w:tc>
+        <w:tc>
+          <w:tcPr>
+            <w:tcW w:type="dxa" w:w="2880"/>
+          </w:tcPr>
+          <w:p>
+            <w:r>
+              <w:rPr>
+                <w:b/>
+              </w:rPr>
+            </w:r>
+            <w:r>
+              <w:rPr>
+                <w:b/>
+              </w:rPr>
+              <w:t>GUDHI (B) $\beta_0/\beta_1$</w:t>
+            </w:r>
+          </w:p>
+        </w:tc>
+      </w:tr>
+      <w:tr>
+        <w:tc>
+          <w:tcPr>
+            <w:tcW w:type="dxa" w:w="2880"/>
+          </w:tcPr>
+          <w:p>
+            <w:r/>
+            <w:r>
+              <w:t>0.05–0.85</w:t>
+            </w:r>
+          </w:p>
+        </w:tc>
+        <w:tc>
+          <w:tcPr>
+            <w:tcW w:type="dxa" w:w="2880"/>
+          </w:tcPr>
+          <w:p>
+            <w:r/>
+            <w:r>
+              <w:t>1 / 3</w:t>
+            </w:r>
+          </w:p>
+        </w:tc>
+        <w:tc>
+          <w:tcPr>
+            <w:tcW w:type="dxa" w:w="2880"/>
+          </w:tcPr>
+          <w:p>
+            <w:r/>
+            <w:r>
+              <w:t>1 / 3</w:t>
+            </w:r>
+          </w:p>
+        </w:tc>
+      </w:tr>
+      <w:tr>
+        <w:tc>
+          <w:tcPr>
+            <w:tcW w:type="dxa" w:w="2880"/>
+          </w:tcPr>
+          <w:p>
+            <w:r/>
+            <w:r>
+              <w:t>0.90</w:t>
+            </w:r>
+          </w:p>
+        </w:tc>
+        <w:tc>
+          <w:tcPr>
+            <w:tcW w:type="dxa" w:w="2880"/>
+          </w:tcPr>
+          <w:p>
+            <w:r/>
+            <w:r>
+              <w:rPr>
+                <w:b/>
+              </w:rPr>
+              <w:t>5 / 7</w:t>
+            </w:r>
+          </w:p>
+        </w:tc>
+        <w:tc>
+          <w:tcPr>
+            <w:tcW w:type="dxa" w:w="2880"/>
+          </w:tcPr>
+          <w:p>
+            <w:r/>
+            <w:r>
+              <w:rPr>
+                <w:b/>
+              </w:rPr>
+              <w:t>1 / 3</w:t>
+            </w:r>
+          </w:p>
+        </w:tc>
+      </w:tr>
+      <w:tr>
+        <w:tc>
+          <w:tcPr>
+            <w:tcW w:type="dxa" w:w="2880"/>
+          </w:tcPr>
+          <w:p>
+            <w:r/>
+            <w:r>
+              <w:t>0.95</w:t>
+            </w:r>
+          </w:p>
+        </w:tc>
+        <w:tc>
+          <w:tcPr>
+            <w:tcW w:type="dxa" w:w="2880"/>
+          </w:tcPr>
+          <w:p>
+            <w:r/>
+            <w:r>
+              <w:t>3 / 3</w:t>
+            </w:r>
+          </w:p>
+        </w:tc>
+        <w:tc>
+          <w:tcPr>
+            <w:tcW w:type="dxa" w:w="2880"/>
+          </w:tcPr>
+          <w:p>
+            <w:r/>
+            <w:r>
+              <w:rPr>
+                <w:b/>
+              </w:rPr>
+              <w:t>1 / 1</w:t>
+            </w:r>
+          </w:p>
+        </w:tc>
+      </w:tr>
+    </w:tbl>
+    <w:p>
+      <w:r>
+        <w:rPr>
+          <w:b/>
+        </w:rPr>
+        <w:t>Causa:</w:t>
+      </w:r>
+      <w:r>
+        <w:t xml:space="preserve"> </w:t>
+      </w:r>
+      <w:r>
+        <w:rPr>
+          <w:rFonts w:ascii="Consolas" w:hAnsi="Consolas"/>
+          <w:sz w:val="20"/>
+        </w:rPr>
+        <w:t>betti_euler</w:t>
+      </w:r>
+      <w:r>
+        <w:t xml:space="preserve"> cuenta $\beta_0$ con 4-conectividad pero $\chi = V - E + F$</w:t>
+      </w:r>
+    </w:p>
+    <w:p>
+      <w:r>
+        <w:t xml:space="preserve">sobre la unión geométrica, donde píxeles que se tocan en diagonal </w:t>
+      </w:r>
+      <w:r>
+        <w:rPr>
+          <w:b/>
+        </w:rPr>
+        <w:t>sí</w:t>
+      </w:r>
+      <w:r>
+        <w:t xml:space="preserve"> están</w:t>
+      </w:r>
+    </w:p>
+    <w:p>
+      <w:r>
+        <w:t>conectados. Al fragmentarse el sólido ($u$ alto), cada contacto diagonal genera un</w:t>
+      </w:r>
+    </w:p>
+    <w:p>
+      <w:r>
+        <w:t>agujero fantasma ($\beta_1 = \beta_0 - \chi$ deja de ser válida). La homología</w:t>
+      </w:r>
+    </w:p>
+    <w:p>
+      <w:r>
+        <w:t>cúbica de GUDHI es autoconsistente y no sufre este artefacto.</w:t>
+      </w:r>
+    </w:p>
+    <w:p>
+      <w:r>
+        <w:rPr>
+          <w:b/>
+        </w:rPr>
+        <w:t>Después:</w:t>
+      </w:r>
+      <w:r>
+        <w:t xml:space="preserve"> las curvas de la Fig. 5.7 (app y </w:t>
+      </w:r>
+      <w:r>
+        <w:rPr>
+          <w:rFonts w:ascii="Consolas" w:hAnsi="Consolas"/>
+          <w:sz w:val="20"/>
+        </w:rPr>
+        <w:t>visualization.figuras</w:t>
+      </w:r>
+      <w:r>
+        <w:t>) se calculan</w:t>
+      </w:r>
+    </w:p>
+    <w:p>
+      <w:r>
+        <w:t>con el Método B (GUDHI), con fallback a Euler si GUDHI no está instalado. El doble</w:t>
+      </w:r>
+    </w:p>
+    <w:p>
+      <w:r>
+        <w:t xml:space="preserve">cómputo se conserva como </w:t>
+      </w:r>
+      <w:r>
+        <w:rPr>
+          <w:b/>
+        </w:rPr>
+        <w:t>chequeo de concordancia</w:t>
+      </w:r>
+      <w:r>
+        <w:t xml:space="preserve"> (la app advierte los umbrales</w:t>
+      </w:r>
+    </w:p>
+    <w:p>
+      <w:r>
+        <w:t>donde difieren en vez de ocultarlo). El barrido se extiende a</w:t>
+      </w:r>
+    </w:p>
+    <w:p>
+      <w:r>
+        <w:t>$u \in [0.05, 0.95]$ (19 puntos) para cubrir el rango del PDF, donde $\beta_1$</w:t>
+      </w:r>
+    </w:p>
+    <w:p>
+      <w:r>
+        <w:t>cae 3→1. Con GUDHI la figura reproduce al PDF: meseta $\beta_1 = 3$, $\beta_0 = 1$,</w:t>
+      </w:r>
+    </w:p>
+    <w:p>
+      <w:r>
+        <w:t>volumen en dash-dot gris con eje ajustado a los datos, y texto "umbral adoptado".</w:t>
+      </w:r>
+    </w:p>
+    <w:p>
+      <w:r>
+        <w:rPr>
+          <w:b/>
+        </w:rPr>
+        <w:t>Consecuencia:</w:t>
+      </w:r>
+      <w:r>
+        <w:t xml:space="preserve"> ningún veredicto cambia ($\beta_1 = 3$ en $u = 0.5$ lo dan ambos</w:t>
+      </w:r>
+    </w:p>
+    <w:p>
+      <w:r>
+        <w:t>métodos). Solo la cola $u \ge 0.90$ de la Fig. 5.7.</w:t>
+      </w:r>
+    </w:p>
+    <w:p>
+      <w:pPr>
+        <w:pStyle w:val="Heading1"/>
+      </w:pPr>
+      <w:r>
+        <w:t>Item 19 — Fig. 5.2: estilo de paneles según el PDF (sin líneas guía 95/50)</w:t>
+      </w:r>
+    </w:p>
+    <w:p>
+      <w:r>
+        <w:rPr>
+          <w:b/>
+        </w:rPr>
+        <w:t>Hecho:</w:t>
+      </w:r>
+      <w:r>
+        <w:t xml:space="preserve"> la Fig. 5.2 del PDF no trae líneas guía en 95 %/50 % (solo grilla tenue),</w:t>
+      </w:r>
+    </w:p>
+    <w:p>
+      <w:r>
+        <w:t>usa un marcador distinto por nube, bandas con texto dentro ("fiable"/"no fiable")</w:t>
+      </w:r>
+    </w:p>
+    <w:p>
+      <w:r>
+        <w:t>sin entradas de leyenda, ticks en $\{0, 0.05, \dots, 0.20\}$, y títulos de panel</w:t>
+      </w:r>
+    </w:p>
+    <w:p>
+      <w:r>
+        <w:t>"(a) Colapso de la lectura de $\beta_k$" / "(b) Verificación empírica de la cota</w:t>
+      </w:r>
+    </w:p>
+    <w:p>
+      <w:r>
+        <w:t>de estabilidad". El panel (b) lleva ejes $d_H(X,Y)$ / $d_B(\mathrm{Dgm}(X),</w:t>
+      </w:r>
+    </w:p>
+    <w:p>
+      <w:r>
+        <w:t>\mathrm{Dgm}(Y))$, diagonal a todo el eje, texto en dos líneas ("región</w:t>
+      </w:r>
+    </w:p>
+    <w:p>
+      <w:r>
+        <w:t>prohibida / por el teorema") sin sombreado, y leyenda con el $n$ real.</w:t>
+      </w:r>
+    </w:p>
+    <w:p>
+      <w:r>
+        <w:rPr>
+          <w:b/>
+        </w:rPr>
+        <w:t>Después:</w:t>
+      </w:r>
+      <w:r>
+        <w:t xml:space="preserve"> </w:t>
+      </w:r>
+      <w:r>
+        <w:rPr>
+          <w:rFonts w:ascii="Consolas" w:hAnsi="Consolas"/>
+          <w:sz w:val="20"/>
+        </w:rPr>
+        <w:t>fig_52a_tasa_acierto</w:t>
+      </w:r>
+      <w:r>
+        <w:t xml:space="preserve"> / </w:t>
+      </w:r>
+      <w:r>
+        <w:rPr>
+          <w:rFonts w:ascii="Consolas" w:hAnsi="Consolas"/>
+          <w:sz w:val="20"/>
+        </w:rPr>
+        <w:t>fig_52b_cota_estabilidad</w:t>
+      </w:r>
+      <w:r>
+        <w:t xml:space="preserve"> (app y</w:t>
+      </w:r>
+    </w:p>
+    <w:p>
+      <w:r>
+        <w:rPr>
+          <w:rFonts w:ascii="Consolas" w:hAnsi="Consolas"/>
+          <w:sz w:val="20"/>
+        </w:rPr>
+        <w:t>visualization.figuras</w:t>
+      </w:r>
+      <w:r>
+        <w:t>) replican ese estilo; la leyenda de (b) reporta el $n$</w:t>
+      </w:r>
+    </w:p>
+    <w:p>
+      <w:r>
+        <w:t>real ($n = 3500$ con $R = 100$, frente a $n = 800$ del PDF).</w:t>
+      </w:r>
+    </w:p>
+    <w:p>
+      <w:r>
+        <w:rPr>
+          <w:b/>
+        </w:rPr>
+        <w:t>Observaciones de datos (no se falsifican, se reportan):</w:t>
+      </w:r>
+      <w:r>
+        <w:t xml:space="preserve"> (i) esfera en $q = 0$</w:t>
+      </w:r>
+    </w:p>
+    <w:p>
+      <w:r>
+        <w:t>da 1.0 en el software vs 0.0 en el PDF — punto determinista ($Y \equiv X_0$), la</w:t>
+      </w:r>
+    </w:p>
+    <w:p>
+      <w:r>
+        <w:t>diferencia viene de la muestra (semilla); (ii) anillo en $q = 0.10$ colapsa más</w:t>
+      </w:r>
+    </w:p>
+    <w:p>
+      <w:r>
+        <w:t>abajo ($\approx 0.02$ vs $\approx 0.35$); (iii) el patrón general —colapso total en</w:t>
+      </w:r>
+    </w:p>
+    <w:p>
+      <w:r>
+        <w:t>$q \ge 0.15$, $q^* \in [0.05, 0.10]$— coincide, ningún veredicto cambia.</w:t>
+      </w:r>
+    </w:p>
+    <w:p>
+      <w:pPr>
+        <w:pStyle w:val="Heading1"/>
+      </w:pPr>
+      <w:r>
+        <w:t>Item 20 — Fig. 5.3: forma del teorema (`dB/dH ≤ 2`) con estilo del PDF</w:t>
+      </w:r>
+    </w:p>
+    <w:p>
+      <w:r>
+        <w:rPr>
+          <w:b/>
+        </w:rPr>
+        <w:t>Decisión del autor:</w:t>
+      </w:r>
+      <w:r>
+        <w:t xml:space="preserve"> se mantiene la forma del Teorema de Estabilidad</w:t>
+      </w:r>
+    </w:p>
+    <w:p>
+      <w:r>
+        <w:t>(</w:t>
+      </w:r>
+      <w:r>
+        <w:rPr>
+          <w:rFonts w:ascii="Consolas" w:hAnsi="Consolas"/>
+          <w:sz w:val="20"/>
+        </w:rPr>
+        <w:t>dB ≤ 2·dH</w:t>
+      </w:r>
+      <w:r>
+        <w:t xml:space="preserve">, Item 11) y se alinea </w:t>
+      </w:r>
+      <w:r>
+        <w:rPr>
+          <w:b/>
+        </w:rPr>
+        <w:t>solo el estilo</w:t>
+      </w:r>
+      <w:r>
+        <w:t xml:space="preserve"> al del PDF.</w:t>
+      </w:r>
+    </w:p>
+    <w:p>
+      <w:r>
+        <w:t>**Evidencia de que la forma del PDF (</w:t>
+      </w:r>
+      <w:r>
+        <w:rPr>
+          <w:rFonts w:ascii="Consolas" w:hAnsi="Consolas"/>
+          <w:sz w:val="20"/>
+        </w:rPr>
+        <w:t>dB/diam ≤ 2q</w:t>
+      </w:r>
+      <w:r>
+        <w:t>) no es reproducible con la</w:t>
+      </w:r>
+    </w:p>
+    <w:p>
+      <w:r>
+        <w:t>métrica exacta** (datos $R = 100$, semilla 42):</w:t>
+      </w:r>
+    </w:p>
+    <w:tbl>
+      <w:tblPr>
+        <w:tblStyle w:val="LightGrid-Accent1"/>
+        <w:tblW w:type="auto" w:w="0"/>
+        <w:tblLook w:firstColumn="1" w:firstRow="1" w:lastColumn="0" w:lastRow="0" w:noHBand="0" w:noVBand="1" w:val="04A0"/>
+      </w:tblPr>
+      <w:tblGrid>
+        <w:gridCol w:w="2160"/>
+        <w:gridCol w:w="2160"/>
+        <w:gridCol w:w="2160"/>
+        <w:gridCol w:w="2160"/>
+      </w:tblGrid>
+      <w:tr>
+        <w:tc>
+          <w:tcPr>
+            <w:tcW w:type="dxa" w:w="2160"/>
+          </w:tcPr>
+          <w:p>
+            <w:r>
+              <w:rPr>
+                <w:b/>
+              </w:rPr>
+            </w:r>
+            <w:r>
+              <w:rPr>
+                <w:b/>
+              </w:rPr>
+              <w:t>nube</w:t>
+            </w:r>
+          </w:p>
+        </w:tc>
+        <w:tc>
+          <w:tcPr>
+            <w:tcW w:type="dxa" w:w="2160"/>
+          </w:tcPr>
+          <w:p>
+            <w:r>
+              <w:rPr>
+                <w:b/>
+              </w:rPr>
+            </w:r>
+            <w:r>
+              <w:rPr>
+                <w:rFonts w:ascii="Consolas" w:hAnsi="Consolas"/>
+                <w:b/>
+                <w:sz w:val="20"/>
+              </w:rPr>
+              <w:t>dB/diam</w:t>
+            </w:r>
+            <w:r>
+              <w:rPr>
+                <w:b/>
+              </w:rPr>
+              <w:t xml:space="preserve"> @ $q = 0.10$</w:t>
+            </w:r>
+          </w:p>
+        </w:tc>
+        <w:tc>
+          <w:tcPr>
+            <w:tcW w:type="dxa" w:w="2160"/>
+          </w:tcPr>
+          <w:p>
+            <w:r>
+              <w:rPr>
+                <w:b/>
+              </w:rPr>
+            </w:r>
+            <w:r>
+              <w:rPr>
+                <w:b/>
+              </w:rPr>
+              <w:t>cota $2q = 0.20$</w:t>
+            </w:r>
+          </w:p>
+        </w:tc>
+        <w:tc>
+          <w:tcPr>
+            <w:tcW w:type="dxa" w:w="2160"/>
+          </w:tcPr>
+          <w:p>
+            <w:r>
+              <w:rPr>
+                <w:b/>
+              </w:rPr>
+            </w:r>
+            <w:r>
+              <w:rPr>
+                <w:b/>
+              </w:rPr>
+              <w:t>fracción que cumple</w:t>
+            </w:r>
+          </w:p>
+        </w:tc>
+      </w:tr>
+      <w:tr>
+        <w:tc>
+          <w:tcPr>
+            <w:tcW w:type="dxa" w:w="2160"/>
+          </w:tcPr>
+          <w:p>
+            <w:r/>
+            <w:r>
+              <w:t>círculo</w:t>
+            </w:r>
+          </w:p>
+        </w:tc>
+        <w:tc>
+          <w:tcPr>
+            <w:tcW w:type="dxa" w:w="2160"/>
+          </w:tcPr>
+          <w:p>
+            <w:r/>
+            <w:r>
+              <w:rPr>
+                <w:b/>
+              </w:rPr>
+              <w:t>0.390</w:t>
+            </w:r>
+          </w:p>
+        </w:tc>
+        <w:tc>
+          <w:tcPr>
+            <w:tcW w:type="dxa" w:w="2160"/>
+          </w:tcPr>
+          <w:p>
+            <w:r/>
+            <w:r>
+              <w:t>0.20</w:t>
+            </w:r>
+          </w:p>
+        </w:tc>
+        <w:tc>
+          <w:tcPr>
+            <w:tcW w:type="dxa" w:w="2160"/>
+          </w:tcPr>
+          <w:p>
+            <w:r/>
+            <w:r>
+              <w:rPr>
+                <w:b/>
+              </w:rPr>
+              <w:t>0.20</w:t>
+            </w:r>
+          </w:p>
+        </w:tc>
+      </w:tr>
+      <w:tr>
+        <w:tc>
+          <w:tcPr>
+            <w:tcW w:type="dxa" w:w="2160"/>
+          </w:tcPr>
+          <w:p>
+            <w:r/>
+            <w:r>
+              <w:t>dos_círculos</w:t>
+            </w:r>
+          </w:p>
+        </w:tc>
+        <w:tc>
+          <w:tcPr>
+            <w:tcW w:type="dxa" w:w="2160"/>
+          </w:tcPr>
+          <w:p>
+            <w:r/>
+            <w:r>
+              <w:t>0.233</w:t>
+            </w:r>
+          </w:p>
+        </w:tc>
+        <w:tc>
+          <w:tcPr>
+            <w:tcW w:type="dxa" w:w="2160"/>
+          </w:tcPr>
+          <w:p>
+            <w:r/>
+            <w:r>
+              <w:t>0.20</w:t>
+            </w:r>
+          </w:p>
+        </w:tc>
+        <w:tc>
+          <w:tcPr>
+            <w:tcW w:type="dxa" w:w="2160"/>
+          </w:tcPr>
+          <w:p>
+            <w:r/>
+            <w:r>
+              <w:t>0.61</w:t>
+            </w:r>
+          </w:p>
+        </w:tc>
+      </w:tr>
+      <w:tr>
+        <w:tc>
+          <w:tcPr>
+            <w:tcW w:type="dxa" w:w="2160"/>
+          </w:tcPr>
+          <w:p>
+            <w:r/>
+            <w:r>
+              <w:t>anillo</w:t>
+            </w:r>
+          </w:p>
+        </w:tc>
+        <w:tc>
+          <w:tcPr>
+            <w:tcW w:type="dxa" w:w="2160"/>
+          </w:tcPr>
+          <w:p>
+            <w:r/>
+            <w:r>
+              <w:t>0.167</w:t>
+            </w:r>
+          </w:p>
+        </w:tc>
+        <w:tc>
+          <w:tcPr>
+            <w:tcW w:type="dxa" w:w="2160"/>
+          </w:tcPr>
+          <w:p>
+            <w:r/>
+            <w:r>
+              <w:t>0.20</w:t>
+            </w:r>
+          </w:p>
+        </w:tc>
+        <w:tc>
+          <w:tcPr>
+            <w:tcW w:type="dxa" w:w="2160"/>
+          </w:tcPr>
+          <w:p>
+            <w:r/>
+            <w:r>
+              <w:t>0.91</w:t>
+            </w:r>
+          </w:p>
+        </w:tc>
+      </w:tr>
+      <w:tr>
+        <w:tc>
+          <w:tcPr>
+            <w:tcW w:type="dxa" w:w="2160"/>
+          </w:tcPr>
+          <w:p>
+            <w:r/>
+            <w:r>
+              <w:t>disco</w:t>
+            </w:r>
+          </w:p>
+        </w:tc>
+        <w:tc>
+          <w:tcPr>
+            <w:tcW w:type="dxa" w:w="2160"/>
+          </w:tcPr>
+          <w:p>
+            <w:r/>
+            <w:r>
+              <w:t>0.086</w:t>
+            </w:r>
+          </w:p>
+        </w:tc>
+        <w:tc>
+          <w:tcPr>
+            <w:tcW w:type="dxa" w:w="2160"/>
+          </w:tcPr>
+          <w:p>
+            <w:r/>
+            <w:r>
+              <w:t>0.20</w:t>
+            </w:r>
+          </w:p>
+        </w:tc>
+        <w:tc>
+          <w:tcPr>
+            <w:tcW w:type="dxa" w:w="2160"/>
+          </w:tcPr>
+          <w:p>
+            <w:r/>
+            <w:r>
+              <w:t>1.00</w:t>
+            </w:r>
+          </w:p>
+        </w:tc>
+      </w:tr>
+    </w:tbl>
+    <w:p>
+      <w:r>
+        <w:t xml:space="preserve">El círculo </w:t>
+      </w:r>
+      <w:r>
+        <w:rPr>
+          <w:b/>
+        </w:rPr>
+        <w:t>duplica</w:t>
+      </w:r>
+      <w:r>
+        <w:t xml:space="preserve"> la cota; la Fig. 5.3 del PDF (todas las curvas bajo la</w:t>
+      </w:r>
+    </w:p>
+    <w:p>
+      <w:r>
+        <w:t xml:space="preserve">recta </w:t>
+      </w:r>
+      <w:r>
+        <w:rPr>
+          <w:rFonts w:ascii="Consolas" w:hAnsi="Consolas"/>
+          <w:sz w:val="20"/>
+        </w:rPr>
+        <w:t>2q</w:t>
+      </w:r>
+      <w:r>
+        <w:t xml:space="preserve">) se dibujó con la heurística greedy+L2 que subestimaba </w:t>
+      </w:r>
+      <w:r>
+        <w:rPr>
+          <w:rFonts w:ascii="Consolas" w:hAnsi="Consolas"/>
+          <w:sz w:val="20"/>
+        </w:rPr>
+        <w:t>dB</w:t>
+      </w:r>
+      <w:r>
+        <w:t xml:space="preserve"> (Item 11).</w:t>
+      </w:r>
+    </w:p>
+    <w:p>
+      <w:r>
+        <w:t>Con el teorema en su forma exacta (</w:t>
+      </w:r>
+      <w:r>
+        <w:rPr>
+          <w:rFonts w:ascii="Consolas" w:hAnsi="Consolas"/>
+          <w:sz w:val="20"/>
+        </w:rPr>
+        <w:t>dB/dH ≤ 2</w:t>
+      </w:r>
+      <w:r>
+        <w:t>) todas las curvas quedan por</w:t>
+      </w:r>
+    </w:p>
+    <w:p>
+      <w:r>
+        <w:t>debajo de la cota ($\max dB/dH = 1.92$).</w:t>
+      </w:r>
+    </w:p>
+    <w:p>
+      <w:r>
+        <w:rPr>
+          <w:b/>
+        </w:rPr>
+        <w:t>Estilo alineado al PDF:</w:t>
+      </w:r>
+      <w:r>
+        <w:t xml:space="preserve"> título "Distancia bottleneck relativa frente a la</w:t>
+      </w:r>
+    </w:p>
+    <w:p>
+      <w:r>
+        <w:t>cota"; leyenda arriba-izquierda en 2 columnas con "cota dB = 2 dH" como última</w:t>
+      </w:r>
+    </w:p>
+    <w:p>
+      <w:r>
+        <w:t xml:space="preserve">entrada; ticks de $q$ cada 0.025; </w:t>
+      </w:r>
+      <w:r>
+        <w:rPr>
+          <w:b/>
+        </w:rPr>
+        <w:t>convención de colores y marcadores por nube</w:t>
+      </w:r>
+    </w:p>
+    <w:p>
+      <w:r>
+        <w:t>idéntica a la Fig. 5.2(a) (anillo/círculo/disco/dos_círculos/esfera/gaussiana/toro</w:t>
+      </w:r>
+    </w:p>
+    <w:p>
+      <w:r>
+        <w:t xml:space="preserve">en orden </w:t>
+      </w:r>
+      <w:r>
+        <w:rPr>
+          <w:rFonts w:ascii="Consolas" w:hAnsi="Consolas"/>
+          <w:sz w:val="20"/>
+        </w:rPr>
+        <w:t>tab10</w:t>
+      </w:r>
+      <w:r>
+        <w:t xml:space="preserve">), aplicada también a la 5.2(a). El eje Y queda en </w:t>
+      </w:r>
+      <w:r>
+        <w:rPr>
+          <w:rFonts w:ascii="Consolas" w:hAnsi="Consolas"/>
+          <w:sz w:val="20"/>
+        </w:rPr>
+        <w:t>dB/dH</w:t>
+      </w:r>
+      <w:r>
+        <w:t xml:space="preserve"> (forma</w:t>
+      </w:r>
+    </w:p>
+    <w:p>
+      <w:r>
+        <w:t xml:space="preserve">del teorema), no en </w:t>
+      </w:r>
+      <w:r>
+        <w:rPr>
+          <w:rFonts w:ascii="Consolas" w:hAnsi="Consolas"/>
+          <w:sz w:val="20"/>
+        </w:rPr>
+        <w:t>dB/diam</w:t>
+      </w:r>
+      <w:r>
+        <w:t xml:space="preserve"> como el PDF.</w:t>
+      </w:r>
+    </w:p>
+    <w:p>
+      <w:pPr>
+        <w:pStyle w:val="Heading1"/>
+      </w:pPr>
+      <w:r>
+        <w:t>Item 21 — Fig. 5.4(b): estilo del PDF (título, ejes, referentes en línea)</w:t>
+      </w:r>
+    </w:p>
+    <w:p>
+      <w:r>
+        <w:rPr>
+          <w:b/>
+        </w:rPr>
+        <w:t>Hecho:</w:t>
+      </w:r>
+      <w:r>
+        <w:t xml:space="preserve"> la Fig. 5.4(b) del PDF usa título "(b) Convergencia", eje X</w:t>
+      </w:r>
+    </w:p>
+    <w:p>
+      <w:r>
+        <w:t xml:space="preserve">"iteración" con rango </w:t>
+      </w:r>
+      <w:r>
+        <w:rPr>
+          <w:rFonts w:ascii="Consolas" w:hAnsi="Consolas"/>
+          <w:sz w:val="20"/>
+        </w:rPr>
+        <w:t>[0, 300]</w:t>
+      </w:r>
+      <w:r>
+        <w:t>, eje Y "compliance c(ρ)" en escala log, y los</w:t>
+      </w:r>
+    </w:p>
+    <w:p>
+      <w:r>
+        <w:t xml:space="preserve">referentes como </w:t>
+      </w:r>
+      <w:r>
+        <w:rPr>
+          <w:b/>
+        </w:rPr>
+        <w:t>texto en línea</w:t>
+      </w:r>
+      <w:r>
+        <w:t xml:space="preserve"> ("uniforme c = 316.3" arriba, "SIMP c =</w:t>
+      </w:r>
+    </w:p>
+    <w:p>
+      <w:r>
+        <w:t>75.6 (−76.1 %)" abajo) en vez de una caja de leyenda; la curva es una línea</w:t>
+      </w:r>
+    </w:p>
+    <w:p>
+      <w:r>
+        <w:t xml:space="preserve">lisa sin marcadores. Nuestra corrida </w:t>
+      </w:r>
+      <w:r>
+        <w:rPr>
+          <w:b/>
+        </w:rPr>
+        <w:t>converge en la iteración 92</w:t>
+      </w:r>
+    </w:p>
+    <w:p>
+      <w:r>
+        <w:t>(Δρ &lt; 10⁻², Item 4), por lo que el historial tiene 92 puntos y el eje X llegaba</w:t>
+      </w:r>
+    </w:p>
+    <w:p>
+      <w:r>
+        <w:t>solo hasta 92.</w:t>
+      </w:r>
+    </w:p>
+    <w:p>
+      <w:r>
+        <w:rPr>
+          <w:b/>
+        </w:rPr>
+        <w:t>Después:</w:t>
+      </w:r>
+      <w:r>
+        <w:t xml:space="preserve"> </w:t>
+      </w:r>
+      <w:r>
+        <w:rPr>
+          <w:rFonts w:ascii="Consolas" w:hAnsi="Consolas"/>
+          <w:sz w:val="20"/>
+        </w:rPr>
+        <w:t>fig_54b_historial</w:t>
+      </w:r>
+      <w:r>
+        <w:t xml:space="preserve"> (headless y app) replica el estilo del PDF;</w:t>
+      </w:r>
+    </w:p>
+    <w:p>
+      <w:r>
+        <w:t xml:space="preserve">si la corrida convergió, el tramo plano se extiende hasta </w:t>
+      </w:r>
+      <w:r>
+        <w:rPr>
+          <w:rFonts w:ascii="Consolas" w:hAnsi="Consolas"/>
+          <w:sz w:val="20"/>
+        </w:rPr>
+        <w:t>n_iter_max = 300</w:t>
+      </w:r>
+    </w:p>
+    <w:p>
+      <w:r>
+        <w:t xml:space="preserve">(c constante tras converger). El valor propio es </w:t>
+      </w:r>
+      <w:r>
+        <w:rPr>
+          <w:rFonts w:ascii="Consolas" w:hAnsi="Consolas"/>
+          <w:sz w:val="20"/>
+        </w:rPr>
+        <w:t>c* = 74.72</w:t>
+      </w:r>
+      <w:r>
+        <w:t xml:space="preserve"> (−76.4 %) frente</w:t>
+      </w:r>
+    </w:p>
+    <w:p>
+      <w:r>
+        <w:t xml:space="preserve">al </w:t>
+      </w:r>
+      <w:r>
+        <w:rPr>
+          <w:rFonts w:ascii="Consolas" w:hAnsi="Consolas"/>
+          <w:sz w:val="20"/>
+        </w:rPr>
+        <w:t>75.6</w:t>
+      </w:r>
+      <w:r>
+        <w:t xml:space="preserve"> (−76.1 %) del PDF — diferencia ya documentada en el Item 10.</w:t>
+      </w:r>
+    </w:p>
+    <w:p>
+      <w:r>
+        <w:rPr>
+          <w:b/>
+        </w:rPr>
+        <w:t>Pendiente de decisión:</w:t>
+      </w:r>
+      <w:r>
+        <w:t xml:space="preserve"> el </w:t>
+      </w:r>
+      <w:r>
+        <w:rPr>
+          <w:b/>
+        </w:rPr>
+        <w:t>panel (a)</w:t>
+      </w:r>
+      <w:r>
+        <w:t xml:space="preserve"> del PDF es una </w:t>
+      </w:r>
+      <w:r>
+        <w:rPr>
+          <w:b/>
+        </w:rPr>
+        <w:t>única</w:t>
+      </w:r>
+      <w:r>
+        <w:t xml:space="preserve"> imagen de</w:t>
+      </w:r>
+    </w:p>
+    <w:p>
+      <w:r>
+        <w:t>la densidad continua ρ* (con anotación "Diseño convergido p=3, fV=0.5, rmin=2.4</w:t>
+      </w:r>
+    </w:p>
+    <w:p>
+      <w:r>
+        <w:t xml:space="preserve">/ β₀=1, β₁=3" y sin ejes); la nuestra muestra </w:t>
+      </w:r>
+      <w:r>
+        <w:rPr>
+          <w:b/>
+        </w:rPr>
+        <w:t>dos</w:t>
+      </w:r>
+      <w:r>
+        <w:t xml:space="preserve"> imágenes (ρ* + Ω binario).</w:t>
+      </w:r>
+    </w:p>
+    <w:p>
+      <w:r>
+        <w:t>Ver Item 22.</w:t>
+      </w:r>
+    </w:p>
+    <w:p>
+      <w:pPr>
+        <w:pStyle w:val="Heading1"/>
+      </w:pPr>
+      <w:r>
+        <w:t>Item 22 — Fig. 5.4(a): se conservan los dos paneles (decisión del autor)</w:t>
+      </w:r>
+    </w:p>
+    <w:p>
+      <w:r>
+        <w:rPr>
+          <w:b/>
+        </w:rPr>
+        <w:t>Decisión:</w:t>
+      </w:r>
+      <w:r>
+        <w:t xml:space="preserve"> a diferencia del PDF —que muestra una sola imagen de ρ*—, la</w:t>
+      </w:r>
+    </w:p>
+    <w:p>
+      <w:r>
+        <w:t xml:space="preserve">Fig. 5.4(a) </w:t>
+      </w:r>
+      <w:r>
+        <w:rPr>
+          <w:b/>
+        </w:rPr>
+        <w:t>conserva los dos paneles</w:t>
+      </w:r>
+      <w:r>
+        <w:t xml:space="preserve"> (densidad continua ρ* y sólido binario</w:t>
+      </w:r>
+    </w:p>
+    <w:p>
+      <w:r>
+        <w:t>Ω). Motivo: son más informativos, pues muestran de dónde proviene el conteo</w:t>
+      </w:r>
+    </w:p>
+    <w:p>
+      <w:r>
+        <w:t>$\beta_1$ (el binario es el que se cuenta topológicamente, no ρ*).</w:t>
+      </w:r>
+    </w:p>
+    <w:p>
+      <w:r>
+        <w:rPr>
+          <w:b/>
+        </w:rPr>
+        <w:t>Ajuste:</w:t>
+      </w:r>
+      <w:r>
+        <w:t xml:space="preserve"> se incorpora la línea de parámetros del PDF en el título</w:t>
+      </w:r>
+    </w:p>
+    <w:p>
+      <w:r>
+        <w:t>("p = 3, fV = 0.5, rmin = 2.4 | β₀ = 1, β₁ = 3"), de modo que la figura</w:t>
+      </w:r>
+    </w:p>
+    <w:p>
+      <w:r>
+        <w:t>transporta la misma información que el documento aunque con dos imágenes.</w:t>
+      </w:r>
+    </w:p>
+    <w:p>
+      <w:r>
+        <w:rPr>
+          <w:b/>
+        </w:rPr>
+        <w:t>Consecuencia:</w:t>
+      </w:r>
+      <w:r>
+        <w:t xml:space="preserve"> ninguna numérica; el conteo $\beta_1 = 3$ es idéntico.</w:t>
+      </w:r>
+    </w:p>
+    <w:p>
+      <w:pPr>
+        <w:pStyle w:val="Heading1"/>
+      </w:pPr>
+      <w:r>
+        <w:t>Item 23 — Fig. 5.5: estilo del PDF y etiqueta de la grisura</w:t>
+      </w:r>
+    </w:p>
+    <w:p>
+      <w:r>
+        <w:rPr>
+          <w:b/>
+        </w:rPr>
+        <w:t>Estilo alineado al PDF</w:t>
+      </w:r>
+      <w:r>
+        <w:t xml:space="preserve"> (</w:t>
+      </w:r>
+      <w:r>
+        <w:rPr>
+          <w:rFonts w:ascii="Consolas" w:hAnsi="Consolas"/>
+          <w:sz w:val="20"/>
+        </w:rPr>
+        <w:t>fig_55_penalizacion</w:t>
+      </w:r>
+      <w:r>
+        <w:t>, headless y app): título</w:t>
+      </w:r>
+    </w:p>
+    <w:p>
+      <w:r>
+        <w:t>"Efecto de la penalización: compliance, binariedad y topología"; compliance en</w:t>
+      </w:r>
+    </w:p>
+    <w:p>
+      <w:r>
+        <w:t>marrón (</w:t>
+      </w:r>
+      <w:r>
+        <w:rPr>
+          <w:rFonts w:ascii="Consolas" w:hAnsi="Consolas"/>
+          <w:sz w:val="20"/>
+        </w:rPr>
+        <w:t>#8c564b</w:t>
+      </w:r>
+      <w:r>
+        <w:t>) con círculos, grisura en azul (</w:t>
+      </w:r>
+      <w:r>
+        <w:rPr>
+          <w:rFonts w:ascii="Consolas" w:hAnsi="Consolas"/>
+          <w:sz w:val="20"/>
+        </w:rPr>
+        <w:t>#4b759a</w:t>
+      </w:r>
+      <w:r>
+        <w:t>) discontinua con</w:t>
+      </w:r>
+    </w:p>
+    <w:p>
+      <w:r>
+        <w:t>cuadrados (colores muestreados del PDF); eje derecho "grisura (0 = diseño</w:t>
+      </w:r>
+    </w:p>
+    <w:p>
+      <w:r>
+        <w:t>binario)"; anotaciones $\beta_1$ en verde (</w:t>
+      </w:r>
+      <w:r>
+        <w:rPr>
+          <w:rFonts w:ascii="Consolas" w:hAnsi="Consolas"/>
+          <w:sz w:val="20"/>
+        </w:rPr>
+        <w:t>#2e7d32</w:t>
+      </w:r>
+      <w:r>
+        <w:t>) bajo cada punto; leyenda</w:t>
+      </w:r>
+    </w:p>
+    <w:p>
+      <w:r>
+        <w:t>en el centro-derecha.</w:t>
+      </w:r>
+    </w:p>
+    <w:p>
+      <w:r>
+        <w:rPr>
+          <w:b/>
+        </w:rPr>
+        <w:t>Etiqueta de la grisura — evidencia.</w:t>
+      </w:r>
+      <w:r>
+        <w:t xml:space="preserve"> El PDF rotula la grisura como</w:t>
+      </w:r>
+    </w:p>
+    <w:p>
+      <w:r>
+        <w:t>$4\rho(1-\rho)$ (ρ cruda), pero sus valores corresponden a la densidad</w:t>
+      </w:r>
+    </w:p>
+    <w:p>
+      <w:r>
+        <w:rPr>
+          <w:b/>
+        </w:rPr>
+        <w:t>filtrada</w:t>
+      </w:r>
+      <w:r>
+        <w:t xml:space="preserve"> $\tilde\rho$:</w:t>
+      </w:r>
+    </w:p>
+    <w:tbl>
+      <w:tblPr>
+        <w:tblStyle w:val="LightGrid-Accent1"/>
+        <w:tblW w:type="auto" w:w="0"/>
+        <w:tblLook w:firstColumn="1" w:firstRow="1" w:lastColumn="0" w:lastRow="0" w:noHBand="0" w:noVBand="1" w:val="04A0"/>
+      </w:tblPr>
+      <w:tblGrid>
+        <w:gridCol w:w="2160"/>
+        <w:gridCol w:w="2160"/>
+        <w:gridCol w:w="2160"/>
+        <w:gridCol w:w="2160"/>
+      </w:tblGrid>
+      <w:tr>
+        <w:tc>
+          <w:tcPr>
+            <w:tcW w:type="dxa" w:w="2160"/>
+          </w:tcPr>
+          <w:p>
+            <w:r>
+              <w:rPr>
+                <w:b/>
+              </w:rPr>
+            </w:r>
+            <w:r>
+              <w:rPr>
+                <w:b/>
+              </w:rPr>
+              <w:t>$p$</w:t>
+            </w:r>
+          </w:p>
+        </w:tc>
+        <w:tc>
+          <w:tcPr>
+            <w:tcW w:type="dxa" w:w="2160"/>
+          </w:tcPr>
+          <w:p>
+            <w:r>
+              <w:rPr>
+                <w:b/>
+              </w:rPr>
+            </w:r>
+            <w:r>
+              <w:rPr>
+                <w:b/>
+              </w:rPr>
+              <w:t>$4\rho(1-\rho)$ (cruda)</w:t>
+            </w:r>
+          </w:p>
+        </w:tc>
+        <w:tc>
+          <w:tcPr>
+            <w:tcW w:type="dxa" w:w="2160"/>
+          </w:tcPr>
+          <w:p>
+            <w:r>
+              <w:rPr>
+                <w:b/>
+              </w:rPr>
+            </w:r>
+            <w:r>
+              <w:rPr>
+                <w:b/>
+              </w:rPr>
+              <w:t>$4\tilde\rho(1-\tilde\rho)$ (código)</w:t>
+            </w:r>
+          </w:p>
+        </w:tc>
+        <w:tc>
+          <w:tcPr>
+            <w:tcW w:type="dxa" w:w="2160"/>
+          </w:tcPr>
+          <w:p>
+            <w:r>
+              <w:rPr>
+                <w:b/>
+              </w:rPr>
+            </w:r>
+            <w:r>
+              <w:rPr>
+                <w:b/>
+              </w:rPr>
+              <w:t>PDF</w:t>
+            </w:r>
+          </w:p>
+        </w:tc>
+      </w:tr>
+      <w:tr>
+        <w:tc>
+          <w:tcPr>
+            <w:tcW w:type="dxa" w:w="2160"/>
+          </w:tcPr>
+          <w:p>
+            <w:r/>
+            <w:r>
+              <w:t>1</w:t>
+            </w:r>
+          </w:p>
+        </w:tc>
+        <w:tc>
+          <w:tcPr>
+            <w:tcW w:type="dxa" w:w="2160"/>
+          </w:tcPr>
+          <w:p>
+            <w:r/>
+            <w:r>
+              <w:t>0.551</w:t>
+            </w:r>
+          </w:p>
+        </w:tc>
+        <w:tc>
+          <w:tcPr>
+            <w:tcW w:type="dxa" w:w="2160"/>
+          </w:tcPr>
+          <w:p>
+            <w:r/>
+            <w:r>
+              <w:rPr>
+                <w:b/>
+              </w:rPr>
+              <w:t>0.616</w:t>
+            </w:r>
+          </w:p>
+        </w:tc>
+        <w:tc>
+          <w:tcPr>
+            <w:tcW w:type="dxa" w:w="2160"/>
+          </w:tcPr>
+          <w:p>
+            <w:r/>
+            <w:r>
+              <w:t>0.590</w:t>
+            </w:r>
+          </w:p>
+        </w:tc>
+      </w:tr>
+      <w:tr>
+        <w:tc>
+          <w:tcPr>
+            <w:tcW w:type="dxa" w:w="2160"/>
+          </w:tcPr>
+          <w:p>
+            <w:r/>
+            <w:r>
+              <w:t>2</w:t>
+            </w:r>
+          </w:p>
+        </w:tc>
+        <w:tc>
+          <w:tcPr>
+            <w:tcW w:type="dxa" w:w="2160"/>
+          </w:tcPr>
+          <w:p>
+            <w:r/>
+            <w:r>
+              <w:t>0.026</w:t>
+            </w:r>
+          </w:p>
+        </w:tc>
+        <w:tc>
+          <w:tcPr>
+            <w:tcW w:type="dxa" w:w="2160"/>
+          </w:tcPr>
+          <w:p>
+            <w:r/>
+            <w:r>
+              <w:rPr>
+                <w:b/>
+              </w:rPr>
+              <w:t>0.286</w:t>
+            </w:r>
+          </w:p>
+        </w:tc>
+        <w:tc>
+          <w:tcPr>
+            <w:tcW w:type="dxa" w:w="2160"/>
+          </w:tcPr>
+          <w:p>
+            <w:r/>
+            <w:r>
+              <w:t>0.282</w:t>
+            </w:r>
+          </w:p>
+        </w:tc>
+      </w:tr>
+      <w:tr>
+        <w:tc>
+          <w:tcPr>
+            <w:tcW w:type="dxa" w:w="2160"/>
+          </w:tcPr>
+          <w:p>
+            <w:r/>
+            <w:r>
+              <w:t>3</w:t>
+            </w:r>
+          </w:p>
+        </w:tc>
+        <w:tc>
+          <w:tcPr>
+            <w:tcW w:type="dxa" w:w="2160"/>
+          </w:tcPr>
+          <w:p>
+            <w:r/>
+            <w:r>
+              <w:t>0.021</w:t>
+            </w:r>
+          </w:p>
+        </w:tc>
+        <w:tc>
+          <w:tcPr>
+            <w:tcW w:type="dxa" w:w="2160"/>
+          </w:tcPr>
+          <w:p>
+            <w:r/>
+            <w:r>
+              <w:rPr>
+                <w:b/>
+              </w:rPr>
+              <w:t>0.284</w:t>
+            </w:r>
+          </w:p>
+        </w:tc>
+        <w:tc>
+          <w:tcPr>
+            <w:tcW w:type="dxa" w:w="2160"/>
+          </w:tcPr>
+          <w:p>
+            <w:r/>
+            <w:r>
+              <w:t>0.274</w:t>
+            </w:r>
+          </w:p>
+        </w:tc>
+      </w:tr>
+      <w:tr>
+        <w:tc>
+          <w:tcPr>
+            <w:tcW w:type="dxa" w:w="2160"/>
+          </w:tcPr>
+          <w:p>
+            <w:r/>
+            <w:r>
+              <w:t>4</w:t>
+            </w:r>
+          </w:p>
+        </w:tc>
+        <w:tc>
+          <w:tcPr>
+            <w:tcW w:type="dxa" w:w="2160"/>
+          </w:tcPr>
+          <w:p>
+            <w:r/>
+            <w:r>
+              <w:t>0.017</w:t>
+            </w:r>
+          </w:p>
+        </w:tc>
+        <w:tc>
+          <w:tcPr>
+            <w:tcW w:type="dxa" w:w="2160"/>
+          </w:tcPr>
+          <w:p>
+            <w:r/>
+            <w:r>
+              <w:rPr>
+                <w:b/>
+              </w:rPr>
+              <w:t>0.283</w:t>
+            </w:r>
+          </w:p>
+        </w:tc>
+        <w:tc>
+          <w:tcPr>
+            <w:tcW w:type="dxa" w:w="2160"/>
+          </w:tcPr>
+          <w:p>
+            <w:r/>
+            <w:r>
+              <w:t>0.274</w:t>
+            </w:r>
+          </w:p>
+        </w:tc>
+      </w:tr>
+    </w:tbl>
+    <w:p>
+      <w:r>
+        <w:t>Con ρ cruda los valores son absurdos (≈0.02; el diseño ya es casi binario); con</w:t>
+      </w:r>
+    </w:p>
+    <w:p>
+      <w:r>
+        <w:t>$\tilde\rho$ reproducen al PDF. La etiqueta del PDF es una imprecisión</w:t>
+      </w:r>
+    </w:p>
+    <w:p>
+      <w:r>
+        <w:t xml:space="preserve">notacional. </w:t>
+      </w:r>
+      <w:r>
+        <w:rPr>
+          <w:b/>
+        </w:rPr>
+        <w:t>Decisión del autor:</w:t>
+      </w:r>
+      <w:r>
+        <w:t xml:space="preserve"> la leyenda se rotula de forma exacta,</w:t>
+      </w:r>
+    </w:p>
+    <w:p>
+      <w:r>
+        <w:t>$4\tilde\rho(1-\tilde\rho)$. El cálculo se mantiene con $\tilde\rho$ (coincide</w:t>
+      </w:r>
+    </w:p>
+    <w:p>
+      <w:r>
+        <w:t>con el PDF).</w:t>
+      </w:r>
+    </w:p>
+    <w:p>
+      <w:pPr>
+        <w:pStyle w:val="Heading1"/>
+      </w:pPr>
+      <w:r>
+        <w:t>Item 24 — Fig. 5.6: estilo del PDF, eje X logarítmico y discrepancia de compliance</w:t>
+      </w:r>
+    </w:p>
+    <w:p>
+      <w:r>
+        <w:rPr>
+          <w:b/>
+        </w:rPr>
+        <w:t>Estilo alineado al PDF:</w:t>
+      </w:r>
+      <w:r>
+        <w:t xml:space="preserve"> título "Independencia de malla: β₁ constante, c estable";</w:t>
+      </w:r>
+    </w:p>
+    <w:p>
+      <w:r>
+        <w:t>compliance marrón (</w:t>
+      </w:r>
+      <w:r>
+        <w:rPr>
+          <w:rFonts w:ascii="Consolas" w:hAnsi="Consolas"/>
+          <w:sz w:val="20"/>
+        </w:rPr>
+        <w:t>#8c564b</w:t>
+      </w:r>
+      <w:r>
+        <w:t>) con círculos, $\beta_1$ verde con cuadrados; eje derecho</w:t>
+      </w:r>
+    </w:p>
+    <w:p>
+      <w:r>
+        <w:t>"$\beta_1(\Omega_{\text{sólido}})$"; anotaciones $r_{\min}$ junto a cada punto; sin</w:t>
+      </w:r>
+    </w:p>
+    <w:p>
+      <w:r>
+        <w:t>leyenda.</w:t>
+      </w:r>
+    </w:p>
+    <w:p>
+      <w:r>
+        <w:rPr>
+          <w:b/>
+        </w:rPr>
+        <w:t>Eje X logarítmico (verificado):</w:t>
+      </w:r>
+      <w:r>
+        <w:t xml:space="preserve"> el PDF coloca los tres puntos a 0.000 / 0.631 /</w:t>
+      </w:r>
+    </w:p>
+    <w:p>
+      <w:r>
+        <w:t>1.000 del ancho del eje (medido por la posición de los marcadores, en píxeles). El</w:t>
+      </w:r>
+    </w:p>
+    <w:p>
+      <w:r>
+        <w:t>valor 0.631 = $\log(4)/\log(9)$ es exactamente la predicción de una escala</w:t>
+      </w:r>
+    </w:p>
+    <w:p>
+      <w:r>
+        <w:rPr>
+          <w:b/>
+        </w:rPr>
+        <w:t>logarítmica</w:t>
+      </w:r>
+      <w:r>
+        <w:t xml:space="preserve"> en $N_e$ (la lineal daría 0.375; la categórica, 0.500). El software</w:t>
+      </w:r>
+    </w:p>
+    <w:p>
+      <w:r>
+        <w:t>pasa a eje X logarítmico con ticks $\{1{,}600;\ 6{,}400;\ 14{,}400\}$.</w:t>
+      </w:r>
+    </w:p>
+    <w:p>
+      <w:r>
+        <w:rPr>
+          <w:b/>
+        </w:rPr>
+        <w:t>Discrepancia de datos (compliance) — no resuelta:</w:t>
+      </w:r>
+    </w:p>
+    <w:tbl>
+      <w:tblPr>
+        <w:tblStyle w:val="LightGrid-Accent1"/>
+        <w:tblW w:type="auto" w:w="0"/>
+        <w:tblLook w:firstColumn="1" w:firstRow="1" w:lastColumn="0" w:lastRow="0" w:noHBand="0" w:noVBand="1" w:val="04A0"/>
+      </w:tblPr>
+      <w:tblGrid>
+        <w:gridCol w:w="2880"/>
+        <w:gridCol w:w="2880"/>
+        <w:gridCol w:w="2880"/>
+      </w:tblGrid>
+      <w:tr>
+        <w:tc>
+          <w:tcPr>
+            <w:tcW w:type="dxa" w:w="2880"/>
+          </w:tcPr>
+          <w:p>
+            <w:r>
+              <w:rPr>
+                <w:b/>
+              </w:rPr>
+            </w:r>
+            <w:r>
+              <w:rPr>
+                <w:b/>
+              </w:rPr>
+              <w:t>$N_e$</w:t>
+            </w:r>
+          </w:p>
+        </w:tc>
+        <w:tc>
+          <w:tcPr>
+            <w:tcW w:type="dxa" w:w="2880"/>
+          </w:tcPr>
+          <w:p>
+            <w:r>
+              <w:rPr>
+                <w:b/>
+              </w:rPr>
+            </w:r>
+            <w:r>
+              <w:rPr>
+                <w:b/>
+              </w:rPr>
+              <w:t>PDF</w:t>
+            </w:r>
+          </w:p>
+        </w:tc>
+        <w:tc>
+          <w:tcPr>
+            <w:tcW w:type="dxa" w:w="2880"/>
+          </w:tcPr>
+          <w:p>
+            <w:r>
+              <w:rPr>
+                <w:b/>
+              </w:rPr>
+            </w:r>
+            <w:r>
+              <w:rPr>
+                <w:b/>
+              </w:rPr>
+              <w:t>software</w:t>
+            </w:r>
+          </w:p>
+        </w:tc>
+      </w:tr>
+      <w:tr>
+        <w:tc>
+          <w:tcPr>
+            <w:tcW w:type="dxa" w:w="2880"/>
+          </w:tcPr>
+          <w:p>
+            <w:r/>
+            <w:r>
+              <w:t>1 600</w:t>
+            </w:r>
+          </w:p>
+        </w:tc>
+        <w:tc>
+          <w:tcPr>
+            <w:tcW w:type="dxa" w:w="2880"/>
+          </w:tcPr>
+          <w:p>
+            <w:r/>
+            <w:r>
+              <w:t>15.51</w:t>
+            </w:r>
+          </w:p>
+        </w:tc>
+        <w:tc>
+          <w:tcPr>
+            <w:tcW w:type="dxa" w:w="2880"/>
+          </w:tcPr>
+          <w:p>
+            <w:r/>
+            <w:r>
+              <w:t>15.28</w:t>
+            </w:r>
+          </w:p>
+        </w:tc>
+      </w:tr>
+      <w:tr>
+        <w:tc>
+          <w:tcPr>
+            <w:tcW w:type="dxa" w:w="2880"/>
+          </w:tcPr>
+          <w:p>
+            <w:r/>
+            <w:r>
+              <w:t>6 400</w:t>
+            </w:r>
+          </w:p>
+        </w:tc>
+        <w:tc>
+          <w:tcPr>
+            <w:tcW w:type="dxa" w:w="2880"/>
+          </w:tcPr>
+          <w:p>
+            <w:r/>
+            <w:r>
+              <w:t>16.62</w:t>
+            </w:r>
+          </w:p>
+        </w:tc>
+        <w:tc>
+          <w:tcPr>
+            <w:tcW w:type="dxa" w:w="2880"/>
+          </w:tcPr>
+          <w:p>
+            <w:r/>
+            <w:r>
+              <w:t>15.67</w:t>
+            </w:r>
+          </w:p>
+        </w:tc>
+      </w:tr>
+      <w:tr>
+        <w:tc>
+          <w:tcPr>
+            <w:tcW w:type="dxa" w:w="2880"/>
+          </w:tcPr>
+          <w:p>
+            <w:r/>
+            <w:r>
+              <w:t>14 400</w:t>
+            </w:r>
+          </w:p>
+        </w:tc>
+        <w:tc>
+          <w:tcPr>
+            <w:tcW w:type="dxa" w:w="2880"/>
+          </w:tcPr>
+          <w:p>
+            <w:r/>
+            <w:r>
+              <w:t>17.43</w:t>
+            </w:r>
+          </w:p>
+        </w:tc>
+        <w:tc>
+          <w:tcPr>
+            <w:tcW w:type="dxa" w:w="2880"/>
+          </w:tcPr>
+          <w:p>
+            <w:r/>
+            <w:r>
+              <w:t>15.94</w:t>
+            </w:r>
+          </w:p>
+        </w:tc>
+      </w:tr>
+    </w:tbl>
+    <w:p>
+      <w:r>
+        <w:t>El PDF crece +12 % entre extremos; el software +4 %. $\beta_1 = 0$ coincide en ambos</w:t>
+      </w:r>
+    </w:p>
+    <w:p>
+      <w:r>
+        <w:t>(Item 17). No se pudo determinar la causa (¿dominio, escalado de $r_{\min}$, tolerancia</w:t>
+      </w:r>
+    </w:p>
+    <w:p>
+      <w:r>
+        <w:t>o número de iteraciones distintos?); se reporta el valor propio del software sin</w:t>
+      </w:r>
+    </w:p>
+    <w:p>
+      <w:r>
+        <w:t>forzarlo.</w:t>
+      </w:r>
+    </w:p>
+    <w:p>
+      <w:pPr>
+        <w:pStyle w:val="Heading1"/>
+      </w:pPr>
+      <w:r>
+        <w:t>Item 25 — Fig. 5.3: retorno a la forma literal del PDF (`dB/diam` vs `2q`)</w:t>
+      </w:r>
+    </w:p>
+    <w:p>
+      <w:r>
+        <w:rPr>
+          <w:b/>
+        </w:rPr>
+        <w:t>Decisión del autor:</w:t>
+      </w:r>
+      <w:r>
+        <w:t xml:space="preserve"> la Fig. 5.3 vuelve a la forma del PDF — eje Y</w:t>
+      </w:r>
+    </w:p>
+    <w:p>
+      <w:r>
+        <w:t xml:space="preserve">$d_B/\mathrm{diam}(X)$, cota </w:t>
+      </w:r>
+      <w:r>
+        <w:rPr>
+          <w:b/>
+        </w:rPr>
+        <w:t>diagonal</w:t>
+      </w:r>
+      <w:r>
+        <w:t xml:space="preserve"> $2q$, rango Y </w:t>
+      </w:r>
+      <w:r>
+        <w:rPr>
+          <w:rFonts w:ascii="Consolas" w:hAnsi="Consolas"/>
+          <w:sz w:val="20"/>
+        </w:rPr>
+        <w:t>[0, ~0.45]</w:t>
+      </w:r>
+      <w:r>
+        <w:t xml:space="preserve"> — en lugar de</w:t>
+      </w:r>
+    </w:p>
+    <w:p>
+      <w:r>
+        <w:t>la forma del teorema ($dB/dH$ vs 2) que había fijado el Item 11. Esto **supera al</w:t>
+      </w:r>
+    </w:p>
+    <w:p>
+      <w:r>
+        <w:t>Item 20** en lo relativo a la forma.</w:t>
+      </w:r>
+    </w:p>
+    <w:p>
+      <w:r>
+        <w:rPr>
+          <w:b/>
+        </w:rPr>
+        <w:t>Consecuencia (con la métrica bottleneck exacta del Item 14):</w:t>
+      </w:r>
+      <w:r>
+        <w:t xml:space="preserve"> en la figura las</w:t>
+      </w:r>
+    </w:p>
+    <w:p>
+      <w:r>
+        <w:t xml:space="preserve">curvas de </w:t>
+      </w:r>
+      <w:r>
+        <w:rPr>
+          <w:b/>
+        </w:rPr>
+        <w:t>círculo</w:t>
+      </w:r>
+      <w:r>
+        <w:t xml:space="preserve"> y </w:t>
+      </w:r>
+      <w:r>
+        <w:rPr>
+          <w:b/>
+        </w:rPr>
+        <w:t>dos_círculos</w:t>
+      </w:r>
+      <w:r>
+        <w:t xml:space="preserve"> </w:t>
+      </w:r>
+      <w:r>
+        <w:rPr>
+          <w:b/>
+        </w:rPr>
+        <w:t>cruzan</w:t>
+      </w:r>
+      <w:r>
+        <w:t xml:space="preserve"> la cota $2q$ (el círculo la</w:t>
+      </w:r>
+    </w:p>
+    <w:p>
+      <w:r>
+        <w:t>duplica en $q \approx 0.10$), a diferencia del PDF, donde todas quedan por debajo.</w:t>
+      </w:r>
+    </w:p>
+    <w:p>
+      <w:r>
+        <w:t>El PDF dibujó su figura con la heurística greedy+L2 que subestimaba $d_B$. El</w:t>
+      </w:r>
+    </w:p>
+    <w:p>
+      <w:r>
+        <w:t xml:space="preserve">software reporta el valor exacto y </w:t>
+      </w:r>
+      <w:r>
+        <w:rPr>
+          <w:b/>
+        </w:rPr>
+        <w:t>no</w:t>
+      </w:r>
+      <w:r>
+        <w:t xml:space="preserve"> lo atenúa para forzar el parecido.</w:t>
+      </w:r>
+    </w:p>
+    <w:p>
+      <w:r>
+        <w:rPr>
+          <w:b/>
+        </w:rPr>
+        <w:t>Estilo:</w:t>
+      </w:r>
+      <w:r>
+        <w:t xml:space="preserve"> se conserva el del PDF (título, leyenda 2 columnas con la cota al final,</w:t>
+      </w:r>
+    </w:p>
+    <w:p>
+      <w:r>
+        <w:t xml:space="preserve">colores/marcadores </w:t>
+      </w:r>
+      <w:r>
+        <w:rPr>
+          <w:rFonts w:ascii="Consolas" w:hAnsi="Consolas"/>
+          <w:sz w:val="20"/>
+        </w:rPr>
+        <w:t>tab10</w:t>
+      </w:r>
+      <w:r>
+        <w:t xml:space="preserve"> por nube, ticks cada 0.025).</w:t>
+      </w:r>
+    </w:p>
+    <w:p>
+      <w:pPr>
+        <w:pStyle w:val="Heading1"/>
+      </w:pPr>
+      <w:r>
+        <w:t>Item 26 — Fig. 5.3: selector de forma (documento ↔ teorema)</w:t>
+      </w:r>
+    </w:p>
+    <w:p>
+      <w:r>
+        <w:rPr>
+          <w:b/>
+        </w:rPr>
+        <w:t>Decisión del autor:</w:t>
+      </w:r>
+      <w:r>
+        <w:t xml:space="preserve"> en lugar de fijar una sola forma, la Fig. 5.3 ofrece un</w:t>
+      </w:r>
+    </w:p>
+    <w:p>
+      <w:r>
+        <w:rPr>
+          <w:b/>
+        </w:rPr>
+        <w:t>selector</w:t>
+      </w:r>
+      <w:r>
+        <w:t xml:space="preserve"> entre las dos, para *exhibir la inconsistencia del documento* en vez de</w:t>
+      </w:r>
+    </w:p>
+    <w:p>
+      <w:r>
+        <w:t>ocultarla:</w:t>
+      </w:r>
+    </w:p>
+    <w:p>
+      <w:pPr>
+        <w:pStyle w:val="ListBullet"/>
+      </w:pPr>
+      <w:r>
+        <w:rPr>
+          <w:b/>
+        </w:rPr>
+        <w:t>Forma del documento:</w:t>
+      </w:r>
+      <w:r>
+        <w:t xml:space="preserve"> eje Y $d_B/\mathrm{diam}(X)$, cota diagonal $2q$.</w:t>
+      </w:r>
+    </w:p>
+    <w:p>
+      <w:pPr>
+        <w:pStyle w:val="ListBullet"/>
+      </w:pPr>
+      <w:r>
+        <w:rPr>
+          <w:b/>
+        </w:rPr>
+        <w:t>Forma del teorema:</w:t>
+      </w:r>
+      <w:r>
+        <w:t xml:space="preserve"> eje Y $d_B/d_H$, cota horizontal $2$ (Cohen-Steiner,</w:t>
+      </w:r>
+    </w:p>
+    <w:p>
+      <w:r>
+        <w:t>Edelsbrunner &amp; Harer).</w:t>
+      </w:r>
+    </w:p>
+    <w:p>
+      <w:r>
+        <w:rPr>
+          <w:b/>
+        </w:rPr>
+        <w:t>Implementación:</w:t>
+      </w:r>
+      <w:r>
+        <w:t xml:space="preserve"> </w:t>
+      </w:r>
+      <w:r>
+        <w:rPr>
+          <w:rFonts w:ascii="Consolas" w:hAnsi="Consolas"/>
+          <w:sz w:val="20"/>
+        </w:rPr>
+        <w:t>fig_53_cota(..., forma="documento"|"teorema")</w:t>
+      </w:r>
+      <w:r>
+        <w:t xml:space="preserve"> con presets de</w:t>
+      </w:r>
+    </w:p>
+    <w:p>
+      <w:r>
+        <w:t xml:space="preserve">estilo (eje Y, cota, rango) sobre el mismo esqueleto de datos. En la app, un </w:t>
+      </w:r>
+      <w:r>
+        <w:rPr>
+          <w:rFonts w:ascii="Consolas" w:hAnsi="Consolas"/>
+          <w:sz w:val="20"/>
+        </w:rPr>
+        <w:t>radio</w:t>
+      </w:r>
+    </w:p>
+    <w:p>
+      <w:r>
+        <w:t>"Forma de la cota" + un aviso fijo que explica el contraste. En el headless se generan</w:t>
+      </w:r>
+    </w:p>
+    <w:p>
+      <w:r>
+        <w:rPr>
+          <w:b/>
+        </w:rPr>
+        <w:t>ambos</w:t>
+      </w:r>
+      <w:r>
+        <w:t xml:space="preserve"> PNG para trazabilidad (</w:t>
+      </w:r>
+      <w:r>
+        <w:rPr>
+          <w:rFonts w:ascii="Consolas" w:hAnsi="Consolas"/>
+          <w:sz w:val="20"/>
+        </w:rPr>
+        <w:t>fig53a_forma_documento.png</w:t>
+      </w:r>
+      <w:r>
+        <w:t>,</w:t>
+      </w:r>
+    </w:p>
+    <w:p>
+      <w:r>
+        <w:rPr>
+          <w:rFonts w:ascii="Consolas" w:hAnsi="Consolas"/>
+          <w:sz w:val="20"/>
+        </w:rPr>
+        <w:t>fig53b_forma_teorema.png</w:t>
+      </w:r>
+      <w:r>
+        <w:t xml:space="preserve">); el antiguo </w:t>
+      </w:r>
+      <w:r>
+        <w:rPr>
+          <w:rFonts w:ascii="Consolas" w:hAnsi="Consolas"/>
+          <w:sz w:val="20"/>
+        </w:rPr>
+        <w:t>fig53_bottleneck_2q.png</w:t>
+      </w:r>
+      <w:r>
+        <w:t xml:space="preserve"> se retira.</w:t>
+      </w:r>
+    </w:p>
+    <w:p>
+      <w:r>
+        <w:rPr>
+          <w:b/>
+        </w:rPr>
+        <w:t>Mensaje pedagógico (caption fijo):</w:t>
+      </w:r>
+      <w:r>
+        <w:t xml:space="preserve"> en la forma del documento, con la métrica</w:t>
+      </w:r>
+    </w:p>
+    <w:p>
+      <w:r>
+        <w:t xml:space="preserve">bottleneck </w:t>
+      </w:r>
+      <w:r>
+        <w:rPr>
+          <w:b/>
+        </w:rPr>
+        <w:t>exacta</w:t>
+      </w:r>
+      <w:r>
+        <w:t xml:space="preserve">, círculo y dos_círculos </w:t>
+      </w:r>
+      <w:r>
+        <w:rPr>
+          <w:b/>
+        </w:rPr>
+        <w:t>cruzan</w:t>
+      </w:r>
+      <w:r>
+        <w:t xml:space="preserve"> la cota — luego</w:t>
+      </w:r>
+    </w:p>
+    <w:p>
+      <w:r>
+        <w:t xml:space="preserve">$d_B/\mathrm{diam}(X) \leq 2q$ </w:t>
+      </w:r>
+      <w:r>
+        <w:rPr>
+          <w:b/>
+        </w:rPr>
+        <w:t>no</w:t>
+      </w:r>
+      <w:r>
+        <w:t xml:space="preserve"> es consecuencia del Teorema de Estabilidad. En</w:t>
+      </w:r>
+    </w:p>
+    <w:p>
+      <w:r>
+        <w:t>la forma del teorema, todas las curvas quedan por debajo. El selector convierte la</w:t>
+      </w:r>
+    </w:p>
+    <w:p>
+      <w:r>
+        <w:t>inconsistencia del PDF en un hallazgo documentado y verificable.</w:t>
+      </w:r>
+    </w:p>
+    <w:p>
+      <w:pPr>
+        <w:pStyle w:val="Heading1"/>
+      </w:pPr>
+      <w:r>
+        <w:t>Item 27 — Fig. 5.2(a): por qué `dos_circulos` colapsa antes que en el documento</w:t>
+      </w:r>
+    </w:p>
+    <w:p>
+      <w:r>
+        <w:rPr>
+          <w:b/>
+        </w:rPr>
+        <w:t>Investigación (con evidencia).</w:t>
+      </w:r>
+      <w:r>
+        <w:t xml:space="preserve"> El desacuerdo no es de fórmula sino de **geometría</w:t>
+      </w:r>
+    </w:p>
+    <w:p>
+      <w:r>
+        <w:t xml:space="preserve">de la nube**. A $q = 0.05$ el software lee </w:t>
+      </w:r>
+      <w:r>
+        <w:rPr>
+          <w:rFonts w:ascii="Consolas" w:hAnsi="Consolas"/>
+          <w:sz w:val="20"/>
+        </w:rPr>
+        <w:t>dos_circulos</w:t>
+      </w:r>
+      <w:r>
+        <w:t xml:space="preserve"> = $(\beta_0, \beta_1) = (2, 0)$:</w:t>
+      </w:r>
+    </w:p>
+    <w:p>
+      <w:r>
+        <w:t xml:space="preserve">el $\beta_0$ es correcto, pero el </w:t>
+      </w:r>
+      <w:r>
+        <w:rPr>
+          <w:b/>
+        </w:rPr>
+        <w:t>agujero no se detecta</w:t>
+      </w:r>
+      <w:r>
+        <w:t>. Diagnóstico:</w:t>
+      </w:r>
+    </w:p>
+    <w:tbl>
+      <w:tblPr>
+        <w:tblStyle w:val="LightGrid-Accent1"/>
+        <w:tblW w:type="auto" w:w="0"/>
+        <w:tblLook w:firstColumn="1" w:firstRow="1" w:lastColumn="0" w:lastRow="0" w:noHBand="0" w:noVBand="1" w:val="04A0"/>
+      </w:tblPr>
+      <w:tblGrid>
+        <w:gridCol w:w="2880"/>
+        <w:gridCol w:w="2880"/>
+        <w:gridCol w:w="2880"/>
+      </w:tblGrid>
+      <w:tr>
+        <w:tc>
+          <w:tcPr>
+            <w:tcW w:type="dxa" w:w="2880"/>
+          </w:tcPr>
+          <w:p>
+            <w:r>
+              <w:rPr>
+                <w:b/>
+              </w:rPr>
+            </w:r>
+            <w:r>
+              <w:rPr>
+                <w:rFonts w:ascii="Consolas" w:hAnsi="Consolas"/>
+                <w:b/>
+                <w:sz w:val="20"/>
+              </w:rPr>
+              <w:t>dos_circulos</w:t>
+            </w:r>
+          </w:p>
+        </w:tc>
+        <w:tc>
+          <w:tcPr>
+            <w:tcW w:type="dxa" w:w="2880"/>
+          </w:tcPr>
+          <w:p>
+            <w:r>
+              <w:rPr>
+                <w:b/>
+              </w:rPr>
+            </w:r>
+            <w:r>
+              <w:rPr>
+                <w:b/>
+              </w:rPr>
+              <w:t>$q = 0$</w:t>
+            </w:r>
+          </w:p>
+        </w:tc>
+        <w:tc>
+          <w:tcPr>
+            <w:tcW w:type="dxa" w:w="2880"/>
+          </w:tcPr>
+          <w:p>
+            <w:r>
+              <w:rPr>
+                <w:b/>
+              </w:rPr>
+            </w:r>
+            <w:r>
+              <w:rPr>
+                <w:b/>
+              </w:rPr>
+              <w:t>$q = 0.05$</w:t>
+            </w:r>
+          </w:p>
+        </w:tc>
+      </w:tr>
+      <w:tr>
+        <w:tc>
+          <w:tcPr>
+            <w:tcW w:type="dxa" w:w="2880"/>
+          </w:tcPr>
+          <w:p>
+            <w:r/>
+            <w:r>
+              <w:t>barras $H_1$</w:t>
+            </w:r>
+          </w:p>
+        </w:tc>
+        <w:tc>
+          <w:tcPr>
+            <w:tcW w:type="dxa" w:w="2880"/>
+          </w:tcPr>
+          <w:p>
+            <w:r/>
+            <w:r>
+              <w:t>2</w:t>
+            </w:r>
+          </w:p>
+        </w:tc>
+        <w:tc>
+          <w:tcPr>
+            <w:tcW w:type="dxa" w:w="2880"/>
+          </w:tcPr>
+          <w:p>
+            <w:r/>
+            <w:r>
+              <w:rPr>
+                <w:b/>
+              </w:rPr>
+              <w:t>84</w:t>
+            </w:r>
+          </w:p>
+        </w:tc>
+      </w:tr>
+      <w:tr>
+        <w:tc>
+          <w:tcPr>
+            <w:tcW w:type="dxa" w:w="2880"/>
+          </w:tcPr>
+          <w:p>
+            <w:r/>
+            <w:r>
+              <w:t>mayor persistencia $H_1$</w:t>
+            </w:r>
+          </w:p>
+        </w:tc>
+        <w:tc>
+          <w:tcPr>
+            <w:tcW w:type="dxa" w:w="2880"/>
+          </w:tcPr>
+          <w:p>
+            <w:r/>
+            <w:r>
+              <w:t>1.591</w:t>
+            </w:r>
+          </w:p>
+        </w:tc>
+        <w:tc>
+          <w:tcPr>
+            <w:tcW w:type="dxa" w:w="2880"/>
+          </w:tcPr>
+          <w:p>
+            <w:r/>
+            <w:r>
+              <w:rPr>
+                <w:b/>
+              </w:rPr>
+              <w:t>0.410</w:t>
+            </w:r>
+          </w:p>
+        </w:tc>
+      </w:tr>
+      <w:tr>
+        <w:tc>
+          <w:tcPr>
+            <w:tcW w:type="dxa" w:w="2880"/>
+          </w:tcPr>
+          <w:p>
+            <w:r/>
+            <w:r>
+              <w:t>umbral $\tau\cdot\mathrm{diam}(X)$</w:t>
+            </w:r>
+          </w:p>
+        </w:tc>
+        <w:tc>
+          <w:tcPr>
+            <w:tcW w:type="dxa" w:w="2880"/>
+          </w:tcPr>
+          <w:p>
+            <w:r/>
+            <w:r>
+              <w:t>1.050</w:t>
+            </w:r>
+          </w:p>
+        </w:tc>
+        <w:tc>
+          <w:tcPr>
+            <w:tcW w:type="dxa" w:w="2880"/>
+          </w:tcPr>
+          <w:p>
+            <w:r/>
+            <w:r>
+              <w:t>1.050</w:t>
+            </w:r>
+          </w:p>
+        </w:tc>
+      </w:tr>
+      <w:tr>
+        <w:tc>
+          <w:tcPr>
+            <w:tcW w:type="dxa" w:w="2880"/>
+          </w:tcPr>
+          <w:p>
+            <w:r/>
+            <w:r>
+              <w:t>$\beta_1$ leído</w:t>
+            </w:r>
+          </w:p>
+        </w:tc>
+        <w:tc>
+          <w:tcPr>
+            <w:tcW w:type="dxa" w:w="2880"/>
+          </w:tcPr>
+          <w:p>
+            <w:r/>
+            <w:r>
+              <w:t>2 ✓</w:t>
+            </w:r>
+          </w:p>
+        </w:tc>
+        <w:tc>
+          <w:tcPr>
+            <w:tcW w:type="dxa" w:w="2880"/>
+          </w:tcPr>
+          <w:p>
+            <w:r/>
+            <w:r>
+              <w:rPr>
+                <w:b/>
+              </w:rPr>
+              <w:t>0 ✗</w:t>
+            </w:r>
+          </w:p>
+        </w:tc>
+      </w:tr>
+    </w:tbl>
+    <w:p>
+      <w:r>
+        <w:t>El ruido ($\sigma = 0.05\cdot\mathrm{diam} = 0.35$) es grande frente al radio de los</w:t>
+      </w:r>
+    </w:p>
+    <w:p>
+      <w:r>
+        <w:t>círculos (1.0): la nube se fragmenta, el $H_1$ se reparte en 84 barritas y la</w:t>
+      </w:r>
+    </w:p>
+    <w:p>
+      <w:r>
+        <w:t>persistencia del agujero cae por debajo del umbral $\tau\cdot\mathrm{diam}(X)$.</w:t>
+      </w:r>
+    </w:p>
+    <w:p>
+      <w:r>
+        <w:t xml:space="preserve">Nuestro </w:t>
+      </w:r>
+      <w:r>
+        <w:rPr>
+          <w:rFonts w:ascii="Consolas" w:hAnsi="Consolas"/>
+          <w:sz w:val="20"/>
+        </w:rPr>
+        <w:t>dos_circulos</w:t>
+      </w:r>
+      <w:r>
+        <w:t xml:space="preserve"> usa separación 5.0 ($\mathrm{diam} = 7$), de modo que</w:t>
+      </w:r>
+    </w:p>
+    <w:p>
+      <w:r>
+        <w:t>$\tau\cdot\mathrm{diam} = 1.05$ es grande frente a agujeros de radio 1. El documento</w:t>
+      </w:r>
+    </w:p>
+    <w:p>
+      <w:r>
+        <w:t>debió usar una separación menor ($\sigma$ menor ⇒ los agujeros sobreviven).</w:t>
+      </w:r>
+    </w:p>
+    <w:p>
+      <w:r>
+        <w:rPr>
+          <w:b/>
+        </w:rPr>
+        <w:t>Consecuencia:</w:t>
+      </w:r>
+      <w:r>
+        <w:t xml:space="preserve"> </w:t>
+      </w:r>
+      <w:r>
+        <w:rPr>
+          <w:b/>
+        </w:rPr>
+        <w:t>no</w:t>
+      </w:r>
+      <w:r>
+        <w:t xml:space="preserve"> se aplica el patrón de Fig. 5.3 (dos formas). Allí había dos</w:t>
+      </w:r>
+    </w:p>
+    <w:p>
+      <w:r>
+        <w:t>formulaciones matemáticas del mismo objeto (una cota vs el teorema); aquí el resultado</w:t>
+      </w:r>
+    </w:p>
+    <w:p>
+      <w:r>
+        <w:rPr>
+          <w:b/>
+        </w:rPr>
+        <w:t>depende de un parámetro de configuración</w:t>
+      </w:r>
+      <w:r>
+        <w:t>, sin una "forma correcta" y otra "del</w:t>
+      </w:r>
+    </w:p>
+    <w:p>
+      <w:r>
+        <w:t>documento" que contrastar.</w:t>
+      </w:r>
+    </w:p>
+    <w:p>
+      <w:r>
+        <w:rPr>
+          <w:b/>
+        </w:rPr>
+        <w:t>Acción (A + B):</w:t>
+      </w:r>
+    </w:p>
+    <w:p>
+      <w:pPr>
+        <w:pStyle w:val="ListBullet"/>
+      </w:pPr>
+      <w:r>
+        <w:rPr>
+          <w:b/>
+        </w:rPr>
+        <w:t>(A)</w:t>
+      </w:r>
+      <w:r>
+        <w:t xml:space="preserve"> Se documenta como discrepancia de configuración (no de fórmula).</w:t>
+      </w:r>
+    </w:p>
+    <w:p>
+      <w:pPr>
+        <w:pStyle w:val="ListBullet"/>
+      </w:pPr>
+      <w:r>
+        <w:rPr>
+          <w:b/>
+        </w:rPr>
+        <w:t>(B)</w:t>
+      </w:r>
+      <w:r>
+        <w:t xml:space="preserve"> La app incorpora un </w:t>
+      </w:r>
+      <w:r>
+        <w:rPr>
+          <w:b/>
+        </w:rPr>
+        <w:t>diagnóstico</w:t>
+      </w:r>
+      <w:r>
+        <w:t xml:space="preserve"> junto a la Fig. 5.2(a): "Persistencia</w:t>
+      </w:r>
+    </w:p>
+    <w:p>
+      <w:r>
+        <w:t>$H_1$ dominante $/\mathrm{diam}(X)$ frente al umbral $\tau$", por nube con agujeros.</w:t>
+      </w:r>
+    </w:p>
+    <w:p>
+      <w:r>
+        <w:t xml:space="preserve">Muestra de un vistazo el orden de colapso: </w:t>
+      </w:r>
+      <w:r>
+        <w:rPr>
+          <w:rFonts w:ascii="Consolas" w:hAnsi="Consolas"/>
+          <w:sz w:val="20"/>
+        </w:rPr>
+        <w:t>dos_circulos</w:t>
+      </w:r>
+      <w:r>
+        <w:t xml:space="preserve"> (0.227→0.059) y </w:t>
+      </w:r>
+      <w:r>
+        <w:rPr>
+          <w:rFonts w:ascii="Consolas" w:hAnsi="Consolas"/>
+          <w:sz w:val="20"/>
+        </w:rPr>
+        <w:t>toro</w:t>
+      </w:r>
+    </w:p>
+    <w:p>
+      <w:r>
+        <w:t xml:space="preserve">(0.226→0.103) cruzan $\tau = 0.15$ ya en $q = 0.05$; </w:t>
+      </w:r>
+      <w:r>
+        <w:rPr>
+          <w:rFonts w:ascii="Consolas" w:hAnsi="Consolas"/>
+          <w:sz w:val="20"/>
+        </w:rPr>
+        <w:t>anillo</w:t>
+      </w:r>
+      <w:r>
+        <w:t xml:space="preserve"> en $q = 0.10$;</w:t>
+      </w:r>
+    </w:p>
+    <w:p>
+      <w:r>
+        <w:rPr>
+          <w:rFonts w:ascii="Consolas" w:hAnsi="Consolas"/>
+          <w:sz w:val="20"/>
+        </w:rPr>
+        <w:t>círculo</w:t>
+      </w:r>
+      <w:r>
+        <w:t xml:space="preserve"> aguanta hasta $q = 0.15$. Convierte el dato raro en algo explicado.</w:t>
+      </w:r>
+    </w:p>
+    <w:p>
+      <w:pPr>
+        <w:pStyle w:val="Heading1"/>
+      </w:pPr>
+      <w:r>
+        <w:t>Item 28 — App: leyendas a la derecha y sin hueco descripción↔figura</w:t>
+      </w:r>
+    </w:p>
+    <w:p>
+      <w:r>
+        <w:rPr>
+          <w:b/>
+        </w:rPr>
+        <w:t>Decisión del autor (solo la app Streamlit, no los PNG del headless):</w:t>
+      </w:r>
+    </w:p>
+    <w:p>
+      <w:r>
+        <w:t xml:space="preserve">1. </w:t>
+      </w:r>
+      <w:r>
+        <w:rPr>
+          <w:b/>
+        </w:rPr>
+        <w:t>Leyendas a la derecha, fuera del área de trazado</w:t>
+      </w:r>
+      <w:r>
+        <w:t>, para que no tapen el</w:t>
+      </w:r>
+    </w:p>
+    <w:p>
+      <w:r>
+        <w:t xml:space="preserve">gráfico. Se centraliza en </w:t>
+      </w:r>
+      <w:r>
+        <w:rPr>
+          <w:rFonts w:ascii="Consolas" w:hAnsi="Consolas"/>
+          <w:sz w:val="20"/>
+        </w:rPr>
+        <w:t>theme.apply_plotly_theme(fig, leyenda=…)</w:t>
+      </w:r>
+      <w:r>
+        <w:t>:</w:t>
+      </w:r>
+    </w:p>
+    <w:p>
+      <w:pPr>
+        <w:pStyle w:val="ListBullet"/>
+      </w:pPr>
+      <w:r>
+        <w:rPr>
+          <w:rFonts w:ascii="Consolas" w:hAnsi="Consolas"/>
+          <w:sz w:val="20"/>
+        </w:rPr>
+        <w:t>"derecha"</w:t>
+      </w:r>
+      <w:r>
+        <w:t xml:space="preserve"> (default, un solo eje Y): leyenda a </w:t>
+      </w:r>
+      <w:r>
+        <w:rPr>
+          <w:rFonts w:ascii="Consolas" w:hAnsi="Consolas"/>
+          <w:sz w:val="20"/>
+        </w:rPr>
+        <w:t>x=1.02</w:t>
+      </w:r>
+      <w:r>
+        <w:t>, margen derecho 175.</w:t>
+      </w:r>
+    </w:p>
+    <w:p>
+      <w:pPr>
+        <w:pStyle w:val="ListBullet"/>
+      </w:pPr>
+      <w:r>
+        <w:rPr>
+          <w:rFonts w:ascii="Consolas" w:hAnsi="Consolas"/>
+          <w:sz w:val="20"/>
+        </w:rPr>
+        <w:t>"secundaria"</w:t>
+      </w:r>
+      <w:r>
+        <w:t xml:space="preserve"> (eje Y a ambos lados, Figs. 5.5/5.7): a </w:t>
+      </w:r>
+      <w:r>
+        <w:rPr>
+          <w:rFonts w:ascii="Consolas" w:hAnsi="Consolas"/>
+          <w:sz w:val="20"/>
+        </w:rPr>
+        <w:t>x=1.16</w:t>
+      </w:r>
+      <w:r>
+        <w:t>, margen 260,</w:t>
+      </w:r>
+    </w:p>
+    <w:p>
+      <w:r>
+        <w:t>para no chocar con el eje secundario.</w:t>
+      </w:r>
+    </w:p>
+    <w:p>
+      <w:pPr>
+        <w:pStyle w:val="ListBullet"/>
+      </w:pPr>
+      <w:r>
+        <w:rPr>
+          <w:rFonts w:ascii="Consolas" w:hAnsi="Consolas"/>
+          <w:sz w:val="20"/>
+        </w:rPr>
+        <w:t>None</w:t>
+      </w:r>
+      <w:r>
+        <w:t xml:space="preserve"> (heatmaps y gráficos sin leyenda): sin cambios.</w:t>
+      </w:r>
+    </w:p>
+    <w:p>
+      <w:r>
+        <w:t>Verificado renderizando a PNG (kaleido): sin solapamiento en ambos casos.</w:t>
+      </w:r>
+    </w:p>
+    <w:p>
+      <w:r>
+        <w:t xml:space="preserve">2. </w:t>
+      </w:r>
+      <w:r>
+        <w:rPr>
+          <w:b/>
+        </w:rPr>
+        <w:t>Sin hueco entre la descripción y su figura.</w:t>
+      </w:r>
+      <w:r>
+        <w:t xml:space="preserve"> Se agrega CSS en</w:t>
+      </w:r>
+    </w:p>
+    <w:p>
+      <w:r>
+        <w:rPr>
+          <w:rFonts w:ascii="Consolas" w:hAnsi="Consolas"/>
+          <w:sz w:val="20"/>
+        </w:rPr>
+        <w:t>responsive_style()</w:t>
+      </w:r>
+      <w:r>
+        <w:t xml:space="preserve"> que compacta el aire vertical (</w:t>
+      </w:r>
+      <w:r>
+        <w:rPr>
+          <w:rFonts w:ascii="Consolas" w:hAnsi="Consolas"/>
+          <w:sz w:val="20"/>
+        </w:rPr>
+        <w:t>gap</w:t>
+      </w:r>
+      <w:r>
+        <w:t xml:space="preserve"> del </w:t>
+      </w:r>
+      <w:r>
+        <w:rPr>
+          <w:rFonts w:ascii="Consolas" w:hAnsi="Consolas"/>
+          <w:sz w:val="20"/>
+        </w:rPr>
+        <w:t>stVerticalBlock</w:t>
+      </w:r>
+      <w:r>
+        <w:t>,</w:t>
+      </w:r>
+    </w:p>
+    <w:p>
+      <w:r>
+        <w:t>márgenes de la descripción previa y de la figura) para que cada figura quede</w:t>
+      </w:r>
+    </w:p>
+    <w:p>
+      <w:r>
+        <w:rPr>
+          <w:b/>
+        </w:rPr>
+        <w:t>pegada a su rótulo de arriba</w:t>
+      </w:r>
+      <w:r>
+        <w:t xml:space="preserve"> y no dé la impresión de pertenecer al texto de</w:t>
+      </w:r>
+    </w:p>
+    <w:p>
+      <w:r>
+        <w:t>abajo.</w:t>
+      </w:r>
+    </w:p>
+    <w:p>
+      <w:r>
+        <w:rPr>
+          <w:b/>
+        </w:rPr>
+        <w:t>Nota:</w:t>
+      </w:r>
+      <w:r>
+        <w:t xml:space="preserve"> los PNG del headless (entregable E3) </w:t>
+      </w:r>
+      <w:r>
+        <w:rPr>
+          <w:b/>
+        </w:rPr>
+        <w:t>mantienen</w:t>
+      </w:r>
+      <w:r>
+        <w:t xml:space="preserve"> la posición de leyenda</w:t>
+      </w:r>
+    </w:p>
+    <w:p>
+      <w:r>
+        <w:t>del PDF (fidelidad al documento); el ajuste aplica solo a la app.</w:t>
+      </w:r>
+    </w:p>
+    <w:p>
+      <w:pPr>
+        <w:pStyle w:val="Heading1"/>
+      </w:pPr>
+      <w:r>
+        <w:t>Item 29 — Ruido gaussiano: normalizar por la dimensión (`σ = q·diam/√d`)</w:t>
+      </w:r>
+    </w:p>
+    <w:p>
+      <w:r>
+        <w:rPr>
+          <w:b/>
+        </w:rPr>
+        <w:t>Antes</w:t>
+      </w:r>
+    </w:p>
+    <w:p>
+      <w:pPr>
+        <w:pStyle w:val="ListBullet"/>
+      </w:pPr>
+      <w:r>
+        <w:t xml:space="preserve">Tabla 1.1 (línea del indicador </w:t>
+      </w:r>
+      <w:r>
+        <w:rPr>
+          <w:rFonts w:ascii="Consolas" w:hAnsi="Consolas"/>
+          <w:sz w:val="20"/>
+        </w:rPr>
+        <w:t>q</w:t>
+      </w:r>
+      <w:r>
+        <w:t>): «</w:t>
+      </w:r>
+      <w:r>
+        <w:rPr>
+          <w:rFonts w:ascii="Consolas" w:hAnsi="Consolas"/>
+          <w:sz w:val="20"/>
+        </w:rPr>
+        <w:t>σ_n = q·diam(X)</w:t>
+      </w:r>
+      <w:r>
+        <w:t>, con q ∈ {0,.05,.10,.15,.20}».</w:t>
+      </w:r>
+    </w:p>
+    <w:p>
+      <w:pPr>
+        <w:pStyle w:val="ListBullet"/>
+      </w:pPr>
+      <w:r>
+        <w:t>§2.2.1: misma fórmula en la definición operacional del ruido.</w:t>
+      </w:r>
+    </w:p>
+    <w:p>
+      <w:pPr>
+        <w:pStyle w:val="ListBullet"/>
+      </w:pPr>
+      <w:r>
+        <w:t xml:space="preserve">Algoritmo maestro, paso 7: </w:t>
+      </w:r>
+      <w:r>
+        <w:rPr>
+          <w:rFonts w:ascii="Consolas" w:hAnsi="Consolas"/>
+          <w:sz w:val="20"/>
+        </w:rPr>
+        <w:t>Y ← X + N(0, (q·diam(X))²·I)</w:t>
+      </w:r>
+      <w:r>
+        <w:t>.</w:t>
+      </w:r>
+    </w:p>
+    <w:p>
+      <w:pPr>
+        <w:pStyle w:val="ListBullet"/>
+      </w:pPr>
+      <w:r>
+        <w:t xml:space="preserve">Glosario: «q — Nivel de ruido relativo, </w:t>
+      </w:r>
+      <w:r>
+        <w:rPr>
+          <w:rFonts w:ascii="Consolas" w:hAnsi="Consolas"/>
+          <w:sz w:val="20"/>
+        </w:rPr>
+        <w:t>σ_n = q·diam(X)</w:t>
+      </w:r>
+      <w:r>
+        <w:t>».</w:t>
+      </w:r>
+    </w:p>
+    <w:p>
+      <w:r>
+        <w:rPr>
+          <w:b/>
+        </w:rPr>
+        <w:t>Después</w:t>
+      </w:r>
+    </w:p>
+    <w:p>
+      <w:pPr>
+        <w:pStyle w:val="ListBullet"/>
+      </w:pPr>
+      <w:r>
+        <w:t xml:space="preserve">Tabla 1.1 y §2.2.1: </w:t>
+      </w:r>
+      <w:r>
+        <w:rPr>
+          <w:b/>
+        </w:rPr>
+        <w:t>`σ_n = q·diam(X)/√d`</w:t>
+      </w:r>
+      <w:r>
+        <w:t xml:space="preserve">, con </w:t>
+      </w:r>
+      <w:r>
+        <w:rPr>
+          <w:rFonts w:ascii="Consolas" w:hAnsi="Consolas"/>
+          <w:sz w:val="20"/>
+        </w:rPr>
+        <w:t>d</w:t>
+      </w:r>
+      <w:r>
+        <w:t xml:space="preserve"> la dimensión ambiente de la nube.</w:t>
+      </w:r>
+    </w:p>
+    <w:p>
+      <w:pPr>
+        <w:pStyle w:val="ListBullet"/>
+      </w:pPr>
+      <w:r>
+        <w:t xml:space="preserve">Algoritmo maestro, paso 7: </w:t>
+      </w:r>
+      <w:r>
+        <w:rPr>
+          <w:rFonts w:ascii="Consolas" w:hAnsi="Consolas"/>
+          <w:sz w:val="20"/>
+        </w:rPr>
+        <w:t>Y ← X + N(0, (q·diam(X)/√d)²·I)</w:t>
+      </w:r>
+      <w:r>
+        <w:t>.</w:t>
+      </w:r>
+    </w:p>
+    <w:p>
+      <w:pPr>
+        <w:pStyle w:val="ListBullet"/>
+      </w:pPr>
+      <w:r>
+        <w:t xml:space="preserve">Glosario: «q — Nivel de ruido relativo, </w:t>
+      </w:r>
+      <w:r>
+        <w:rPr>
+          <w:rFonts w:ascii="Consolas" w:hAnsi="Consolas"/>
+          <w:sz w:val="20"/>
+        </w:rPr>
+        <w:t>σ_n = q·diam(X)/√d</w:t>
+      </w:r>
+      <w:r>
+        <w:t>».</w:t>
+      </w:r>
+    </w:p>
+    <w:p>
+      <w:r>
+        <w:rPr>
+          <w:b/>
+        </w:rPr>
+        <w:t>Razón (con evidencia):</w:t>
+      </w:r>
+      <w:r>
+        <w:t xml:space="preserve"> el propio PDF de las figuras corregidas del Cap. V lo declara</w:t>
+      </w:r>
+    </w:p>
+    <w:p>
+      <w:r>
+        <w:t>como error del original: *«La figura original no normalizaba el ruido por la dimensión»*.</w:t>
+      </w:r>
+    </w:p>
+    <w:p>
+      <w:r>
+        <w:t xml:space="preserve">Sin el factor </w:t>
+      </w:r>
+      <w:r>
+        <w:rPr>
+          <w:rFonts w:ascii="Consolas" w:hAnsi="Consolas"/>
+          <w:sz w:val="20"/>
+        </w:rPr>
+        <w:t>1/√d</w:t>
+      </w:r>
+      <w:r>
+        <w:t xml:space="preserve">, el desplazamiento cuadrático medio de un punto crece como </w:t>
+      </w:r>
+      <w:r>
+        <w:rPr>
+          <w:rFonts w:ascii="Consolas" w:hAnsi="Consolas"/>
+          <w:sz w:val="20"/>
+        </w:rPr>
+        <w:t>√d·q·diam</w:t>
+      </w:r>
+      <w:r>
+        <w:t>:</w:t>
+      </w:r>
+    </w:p>
+    <w:p>
+      <w:r>
+        <w:t xml:space="preserve">en </w:t>
+      </w:r>
+      <w:r>
+        <w:rPr>
+          <w:rFonts w:ascii="Consolas" w:hAnsi="Consolas"/>
+          <w:sz w:val="20"/>
+        </w:rPr>
+        <w:t>d = 100</w:t>
+      </w:r>
+      <w:r>
+        <w:t xml:space="preserve"> la nube se destruye aunque </w:t>
+      </w:r>
+      <w:r>
+        <w:rPr>
+          <w:rFonts w:ascii="Consolas" w:hAnsi="Consolas"/>
+          <w:sz w:val="20"/>
+        </w:rPr>
+        <w:t>q</w:t>
+      </w:r>
+      <w:r>
+        <w:t xml:space="preserve"> sea chico, y el experimento mide la dimensión,</w:t>
+      </w:r>
+    </w:p>
+    <w:p>
+      <w:r>
+        <w:t xml:space="preserve">no la robustez. Con la normalización, la perturbación media por coordenada es </w:t>
+      </w:r>
+      <w:r>
+        <w:rPr>
+          <w:rFonts w:ascii="Consolas" w:hAnsi="Consolas"/>
+          <w:sz w:val="20"/>
+        </w:rPr>
+        <w:t>σ</w:t>
+      </w:r>
+      <w:r>
+        <w:t xml:space="preserve"> y el</w:t>
+      </w:r>
+    </w:p>
+    <w:p>
+      <w:r>
+        <w:t xml:space="preserve">mismo </w:t>
+      </w:r>
+      <w:r>
+        <w:rPr>
+          <w:rFonts w:ascii="Consolas" w:hAnsi="Consolas"/>
+          <w:sz w:val="20"/>
+        </w:rPr>
+        <w:t>q</w:t>
+      </w:r>
+      <w:r>
+        <w:t xml:space="preserve"> significa lo mismo en ℝ² y en ℝ¹⁰⁰.</w:t>
+      </w:r>
+    </w:p>
+    <w:p>
+      <w:r>
+        <w:rPr>
+          <w:b/>
+        </w:rPr>
+        <w:t>Efecto en el software (ya aplicado):</w:t>
+      </w:r>
+      <w:r>
+        <w:t xml:space="preserve"> </w:t>
+      </w:r>
+      <w:r>
+        <w:rPr>
+          <w:rFonts w:ascii="Consolas" w:hAnsi="Consolas"/>
+          <w:sz w:val="20"/>
+        </w:rPr>
+        <w:t>processing/sampling.add_gaussian_noise</w:t>
+      </w:r>
+      <w:r>
+        <w:t xml:space="preserve"> usa</w:t>
+      </w:r>
+    </w:p>
+    <w:p>
+      <w:r>
+        <w:rPr>
+          <w:rFonts w:ascii="Consolas" w:hAnsi="Consolas"/>
+          <w:sz w:val="20"/>
+        </w:rPr>
+        <w:t>σ = q·diam(X)/√d</w:t>
+      </w:r>
+      <w:r>
+        <w:t xml:space="preserve">. Arrastra las Fig. 5.2 y 5.3 (los </w:t>
+      </w:r>
+      <w:r>
+        <w:rPr>
+          <w:rFonts w:ascii="Consolas" w:hAnsi="Consolas"/>
+          <w:sz w:val="20"/>
+        </w:rPr>
+        <w:t>q*</w:t>
+      </w:r>
+      <w:r>
+        <w:t xml:space="preserve"> y la razón </w:t>
+      </w:r>
+      <w:r>
+        <w:rPr>
+          <w:rFonts w:ascii="Consolas" w:hAnsi="Consolas"/>
+          <w:sz w:val="20"/>
+        </w:rPr>
+        <w:t>dB/(2dH)</w:t>
+      </w:r>
+      <w:r>
+        <w:t xml:space="preserve"> cambian:</w:t>
+      </w:r>
+    </w:p>
+    <w:p>
+      <w:r>
+        <w:t xml:space="preserve">con ruido más suave, las nubes aguantan más). </w:t>
+      </w:r>
+      <w:r>
+        <w:rPr>
+          <w:b/>
+        </w:rPr>
+        <w:t>La cota `dB/diam ≤ 2q` queda retirada</w:t>
+      </w:r>
+    </w:p>
+    <w:p>
+      <w:r>
+        <w:t>del documento (ya figuraba en los Items 11 y 25): el PDF corregido la reemplaza por la</w:t>
+      </w:r>
+    </w:p>
+    <w:p>
+      <w:r>
+        <w:t xml:space="preserve">cota probabilística </w:t>
+      </w:r>
+      <w:r>
+        <w:rPr>
+          <w:rFonts w:ascii="Consolas" w:hAnsi="Consolas"/>
+          <w:sz w:val="20"/>
+        </w:rPr>
+        <w:t>2σ(√d + √(2·ln(n/δ)))</w:t>
+      </w:r>
+      <w:r>
+        <w:t xml:space="preserve"> con </w:t>
+      </w:r>
+      <w:r>
+        <w:rPr>
+          <w:rFonts w:ascii="Consolas" w:hAnsi="Consolas"/>
+          <w:sz w:val="20"/>
+        </w:rPr>
+        <w:t>δ = 0,05</w:t>
+      </w:r>
+      <w:r>
+        <w:t xml:space="preserve"> (Fig. 5.3).</w:t>
+      </w:r>
+    </w:p>
+    <w:p>
+      <w:r>
+        <w:rPr>
+          <w:b/>
+        </w:rPr>
+        <w:t>Estado:</w:t>
+      </w:r>
+      <w:r>
+        <w:t xml:space="preserve"> los PNG </w:t>
+      </w:r>
+      <w:r>
+        <w:rPr>
+          <w:rFonts w:ascii="Consolas" w:hAnsi="Consolas"/>
+          <w:sz w:val="20"/>
+        </w:rPr>
+        <w:t>fig52*</w:t>
+      </w:r>
+      <w:r>
+        <w:t xml:space="preserve"> y </w:t>
+      </w:r>
+      <w:r>
+        <w:rPr>
+          <w:rFonts w:ascii="Consolas" w:hAnsi="Consolas"/>
+          <w:sz w:val="20"/>
+        </w:rPr>
+        <w:t>fig53*</w:t>
+      </w:r>
+      <w:r>
+        <w:t xml:space="preserve"> de </w:t>
+      </w:r>
+      <w:r>
+        <w:rPr>
+          <w:rFonts w:ascii="Consolas" w:hAnsi="Consolas"/>
+          <w:sz w:val="20"/>
+        </w:rPr>
+        <w:t>data/figuras/</w:t>
+      </w:r>
+      <w:r>
+        <w:t xml:space="preserve"> siguen generados con la fórmula</w:t>
+      </w:r>
+    </w:p>
+    <w:p>
+      <w:r>
+        <w:t xml:space="preserve">vieja y </w:t>
+      </w:r>
+      <w:r>
+        <w:rPr>
+          <w:rFonts w:ascii="Consolas" w:hAnsi="Consolas"/>
+          <w:sz w:val="20"/>
+        </w:rPr>
+        <w:t>τ = 0.15</w:t>
+      </w:r>
+      <w:r>
+        <w:t>; se regeneran en la pasada de las Figs. 5.2/5.3.</w:t>
+      </w:r>
+    </w:p>
+    <w:p>
+      <w:pPr>
+        <w:pStyle w:val="Heading1"/>
+      </w:pPr>
+      <w:r>
+        <w:t>Item 30 — Catálogo de nubes corregido (retracta la premisa del Item 13)</w:t>
+      </w:r>
+    </w:p>
+    <w:p>
+      <w:r>
+        <w:rPr>
+          <w:b/>
+        </w:rPr>
+        <w:t>Antes:</w:t>
+      </w:r>
+      <w:r>
+        <w:t xml:space="preserve"> el catálogo del repo usaba geometrías distintas a las del documento —</w:t>
+      </w:r>
+    </w:p>
+    <w:p>
+      <w:r>
+        <w:rPr>
+          <w:rFonts w:ascii="Consolas" w:hAnsi="Consolas"/>
+          <w:sz w:val="20"/>
+        </w:rPr>
+        <w:t>dos_circulos</w:t>
+      </w:r>
+      <w:r>
+        <w:t xml:space="preserve"> con radio 1 y separación 5, </w:t>
+      </w:r>
+      <w:r>
+        <w:rPr>
+          <w:rFonts w:ascii="Consolas" w:hAnsi="Consolas"/>
+          <w:sz w:val="20"/>
+        </w:rPr>
+        <w:t>toro</w:t>
+      </w:r>
+      <w:r>
+        <w:t xml:space="preserve"> con r = 1, </w:t>
+      </w:r>
+      <w:r>
+        <w:rPr>
+          <w:rFonts w:ascii="Consolas" w:hAnsi="Consolas"/>
+          <w:sz w:val="20"/>
+        </w:rPr>
+        <w:t>anillo</w:t>
+      </w:r>
+      <w:r>
+        <w:t xml:space="preserve"> con</w:t>
+      </w:r>
+    </w:p>
+    <w:p>
+      <w:r>
+        <w:t xml:space="preserve">r ∈ [0,8;2], </w:t>
+      </w:r>
+      <w:r>
+        <w:rPr>
+          <w:rFonts w:ascii="Consolas" w:hAnsi="Consolas"/>
+          <w:sz w:val="20"/>
+        </w:rPr>
+        <w:t>gaussiana</w:t>
+      </w:r>
+      <w:r>
+        <w:t xml:space="preserve"> sin truncar — y la calibración de τ se hacía sobre el</w:t>
+      </w:r>
+    </w:p>
+    <w:p>
+      <w:r>
+        <w:rPr>
+          <w:b/>
+        </w:rPr>
+        <w:t>mismo</w:t>
+      </w:r>
+      <w:r>
+        <w:t xml:space="preserve"> catálogo que luego se medía.</w:t>
+      </w:r>
+    </w:p>
+    <w:p>
+      <w:r>
+        <w:rPr>
+          <w:b/>
+        </w:rPr>
+        <w:t>Después</w:t>
+      </w:r>
+      <w:r>
+        <w:t xml:space="preserve"> (</w:t>
+      </w:r>
+      <w:r>
+        <w:rPr>
+          <w:rFonts w:ascii="Consolas" w:hAnsi="Consolas"/>
+          <w:sz w:val="20"/>
+        </w:rPr>
+        <w:t>processing/sampling.CATALOGO_CORREGIDO</w:t>
+      </w:r>
+      <w:r>
+        <w:t xml:space="preserve">, </w:t>
+      </w:r>
+      <w:r>
+        <w:rPr>
+          <w:rFonts w:ascii="Consolas" w:hAnsi="Consolas"/>
+          <w:sz w:val="20"/>
+        </w:rPr>
+        <w:t>ORDEN_CALIBRACION</w:t>
+      </w:r>
+      <w:r>
+        <w:t>):</w:t>
+      </w:r>
+    </w:p>
+    <w:p>
+      <w:pPr>
+        <w:pStyle w:val="ListBullet"/>
+      </w:pPr>
+      <w:r>
+        <w:rPr>
+          <w:rFonts w:ascii="Consolas" w:hAnsi="Consolas"/>
+          <w:sz w:val="20"/>
+        </w:rPr>
+        <w:t>dos_circulos</w:t>
+      </w:r>
+      <w:r>
+        <w:t xml:space="preserve">: radio 0,6, centros en ±1,5 · </w:t>
+      </w:r>
+      <w:r>
+        <w:rPr>
+          <w:rFonts w:ascii="Consolas" w:hAnsi="Consolas"/>
+          <w:sz w:val="20"/>
+        </w:rPr>
+        <w:t>toro</w:t>
+      </w:r>
+      <w:r>
+        <w:t>: r = 0,8 ·</w:t>
+      </w:r>
+    </w:p>
+    <w:p>
+      <w:r>
+        <w:rPr>
+          <w:rFonts w:ascii="Consolas" w:hAnsi="Consolas"/>
+          <w:sz w:val="20"/>
+        </w:rPr>
+        <w:t>anillo</w:t>
+      </w:r>
+      <w:r>
+        <w:t xml:space="preserve">: r ∈ [0,75;1] · </w:t>
+      </w:r>
+      <w:r>
+        <w:rPr>
+          <w:rFonts w:ascii="Consolas" w:hAnsi="Consolas"/>
+          <w:sz w:val="20"/>
+        </w:rPr>
+        <w:t>gaussiana</w:t>
+      </w:r>
+      <w:r>
+        <w:t xml:space="preserve">: truncada en </w:t>
+      </w:r>
+      <w:r>
+        <w:rPr>
+          <w:rFonts w:ascii="Consolas" w:hAnsi="Consolas"/>
+          <w:sz w:val="20"/>
+        </w:rPr>
+        <w:t>2σ</w:t>
+      </w:r>
+      <w:r>
+        <w:t xml:space="preserve"> y escalada × 0,5.</w:t>
+      </w:r>
+    </w:p>
+    <w:p>
+      <w:pPr>
+        <w:pStyle w:val="ListBullet"/>
+      </w:pPr>
+      <w:r>
+        <w:t xml:space="preserve">Semillas: </w:t>
+      </w:r>
+      <w:r>
+        <w:rPr>
+          <w:rFonts w:ascii="Consolas" w:hAnsi="Consolas"/>
+          <w:sz w:val="20"/>
+        </w:rPr>
+        <w:t>default_rng(900 + i)</w:t>
+      </w:r>
+      <w:r>
+        <w:t xml:space="preserve"> para el catálogo independiente </w:t>
+      </w:r>
+      <w:r>
+        <w:rPr>
+          <w:rFonts w:ascii="Consolas" w:hAnsi="Consolas"/>
+          <w:sz w:val="20"/>
+        </w:rPr>
+        <w:t>C₀</w:t>
+      </w:r>
+      <w:r>
+        <w:t xml:space="preserve"> de calibración</w:t>
+      </w:r>
+    </w:p>
+    <w:p>
+      <w:r>
+        <w:t xml:space="preserve">y </w:t>
+      </w:r>
+      <w:r>
+        <w:rPr>
+          <w:rFonts w:ascii="Consolas" w:hAnsi="Consolas"/>
+          <w:sz w:val="20"/>
+        </w:rPr>
+        <w:t>default_rng(42 + i)</w:t>
+      </w:r>
+      <w:r>
+        <w:t xml:space="preserve"> para el catálogo </w:t>
+      </w:r>
+      <w:r>
+        <w:rPr>
+          <w:rFonts w:ascii="Consolas" w:hAnsi="Consolas"/>
+          <w:sz w:val="20"/>
+        </w:rPr>
+        <w:t>C</w:t>
+      </w:r>
+      <w:r>
+        <w:t xml:space="preserve"> de medición (antes, la misma semilla</w:t>
+      </w:r>
+    </w:p>
+    <w:p>
+      <w:r>
+        <w:t>para ambos).</w:t>
+      </w:r>
+    </w:p>
+    <w:p>
+      <w:r>
+        <w:rPr>
+          <w:b/>
+        </w:rPr>
+        <w:t>Razón (con evidencia):</w:t>
+      </w:r>
+      <w:r>
+        <w:t xml:space="preserve"> con la gaussiana sin truncar, sus puntos atípicos aislados</w:t>
+      </w:r>
+    </w:p>
+    <w:p>
+      <w:r>
+        <w:t xml:space="preserve">producen </w:t>
+      </w:r>
+      <w:r>
+        <w:rPr>
+          <w:rFonts w:ascii="Consolas" w:hAnsi="Consolas"/>
+          <w:sz w:val="20"/>
+        </w:rPr>
+        <w:t>β₀ = 2</w:t>
+      </w:r>
+      <w:r>
+        <w:t xml:space="preserve"> o </w:t>
+      </w:r>
+      <w:r>
+        <w:rPr>
+          <w:rFonts w:ascii="Consolas" w:hAnsi="Consolas"/>
+          <w:sz w:val="20"/>
+        </w:rPr>
+        <w:t>3</w:t>
+      </w:r>
+      <w:r>
+        <w:t xml:space="preserve"> en todo </w:t>
+      </w:r>
+      <w:r>
+        <w:rPr>
+          <w:rFonts w:ascii="Consolas" w:hAnsi="Consolas"/>
+          <w:sz w:val="20"/>
+        </w:rPr>
+        <w:t>τ ≤ 0,20</w:t>
+      </w:r>
+      <w:r>
+        <w:t xml:space="preserve"> y la compuerta F3 aborta el proceso — esa es</w:t>
+      </w:r>
+    </w:p>
+    <w:p>
+      <w:r>
+        <w:t xml:space="preserve">la causa real del «no existe ventana 7/7» del Item 13, </w:t>
+      </w:r>
+      <w:r>
+        <w:rPr>
+          <w:b/>
+        </w:rPr>
+        <w:t>no</w:t>
+      </w:r>
+      <w:r>
+        <w:t xml:space="preserve"> la definición de βk.</w:t>
+      </w:r>
+    </w:p>
+    <w:p>
+      <w:r>
+        <w:t>Reimplementando el pipeline completo sobre el catálogo corregido, la Fig. 5.1 se reproduce</w:t>
+      </w:r>
+    </w:p>
+    <w:p>
+      <w:r>
+        <w:t xml:space="preserve">idéntica al PDF: </w:t>
+      </w:r>
+      <w:r>
+        <w:rPr>
+          <w:b/>
+        </w:rPr>
+        <w:t>τ\* = 0,175, ventana única con 7/7</w:t>
+      </w:r>
+      <w:r>
+        <w:t>, curva</w:t>
+      </w:r>
+    </w:p>
+    <w:p>
+      <w:r>
+        <w:rPr>
+          <w:rFonts w:ascii="Consolas" w:hAnsi="Consolas"/>
+          <w:sz w:val="20"/>
+        </w:rPr>
+        <w:t>{0.05:2, 0.075:3, 0.1:5, 0.125:6, 0.15:6, 0.175:7, 0.2:6, 0.225:5, …}</w:t>
+      </w:r>
+      <w:r>
+        <w:t xml:space="preserve"> y márgenes</w:t>
+      </w:r>
+    </w:p>
+    <w:p>
+      <w:r>
+        <w:rPr>
+          <w:rFonts w:ascii="Consolas" w:hAnsi="Consolas"/>
+          <w:sz w:val="20"/>
+        </w:rPr>
+        <w:t>0.124, 0.127, 0.044, −0.002, 0.096, 0.028, 0.081</w:t>
+      </w:r>
+      <w:r>
+        <w:t>.</w:t>
+      </w:r>
+    </w:p>
+    <w:p>
+      <w:r>
+        <w:rPr>
+          <w:b/>
+        </w:rPr>
+        <w:t>Consecuencias:</w:t>
+      </w:r>
+    </w:p>
+    <w:p>
+      <w:pPr>
+        <w:pStyle w:val="ListBullet"/>
+      </w:pPr>
+      <w:r>
+        <w:rPr>
+          <w:b/>
+        </w:rPr>
+        <w:t>Item 13 retractado</w:t>
+      </w:r>
+      <w:r>
+        <w:t xml:space="preserve"> (ver su cabecera): con βk = (β₀, β₁) la ventana </w:t>
+      </w:r>
+      <w:r>
+        <w:rPr>
+          <w:b/>
+        </w:rPr>
+        <w:t>existe</w:t>
+      </w:r>
+      <w:r>
+        <w:t>.</w:t>
+      </w:r>
+    </w:p>
+    <w:p>
+      <w:r>
+        <w:t>La «Resolución adoptada» de calibrar sobre β₁ queda anulada; la calibración vuelve a βk.</w:t>
+      </w:r>
+    </w:p>
+    <w:p>
+      <w:pPr>
+        <w:pStyle w:val="ListBullet"/>
+      </w:pPr>
+      <w:r>
+        <w:rPr>
+          <w:rFonts w:ascii="Consolas" w:hAnsi="Consolas"/>
+          <w:sz w:val="20"/>
+        </w:rPr>
+        <w:t>TAU_CALIBRADO = 0.175</w:t>
+      </w:r>
+      <w:r>
+        <w:t xml:space="preserve"> en </w:t>
+      </w:r>
+      <w:r>
+        <w:rPr>
+          <w:rFonts w:ascii="Consolas" w:hAnsi="Consolas"/>
+          <w:sz w:val="20"/>
+        </w:rPr>
+        <w:t>simulation/he_protocols</w:t>
+      </w:r>
+      <w:r>
+        <w:t xml:space="preserve"> (antes 0,15); arrastra las</w:t>
+      </w:r>
+    </w:p>
+    <w:p>
+      <w:r>
+        <w:t xml:space="preserve">Figs. 5.2/5.3 y el criterio de </w:t>
+      </w:r>
+      <w:r>
+        <w:rPr>
+          <w:rFonts w:ascii="Consolas" w:hAnsi="Consolas"/>
+          <w:sz w:val="20"/>
+        </w:rPr>
+        <w:t>q*</w:t>
+      </w:r>
+      <w:r>
+        <w:t>.</w:t>
+      </w:r>
+    </w:p>
+    <w:p>
+      <w:pPr>
+        <w:pStyle w:val="ListBullet"/>
+      </w:pPr>
+      <w:r>
+        <w:rPr>
+          <w:b/>
+        </w:rPr>
+        <w:t>Pendiente:</w:t>
+      </w:r>
+      <w:r>
+        <w:t xml:space="preserve"> recalcular </w:t>
+      </w:r>
+      <w:r>
+        <w:rPr>
+          <w:rFonts w:ascii="Consolas" w:hAnsi="Consolas"/>
+          <w:sz w:val="20"/>
+        </w:rPr>
+        <w:t>q*</w:t>
+      </w:r>
+      <w:r>
+        <w:t xml:space="preserve"> y la Tabla 5.5 con τ = 0,175 (pasada 5.2/5.3).</w:t>
+      </w:r>
+    </w:p>
+    <w:p>
+      <w:r>
+        <w:rPr>
+          <w:b/>
+        </w:rPr>
+        <w:t>Verificación:</w:t>
+      </w:r>
+      <w:r>
+        <w:t xml:space="preserve"> </w:t>
+      </w:r>
+      <w:r>
+        <w:rPr>
+          <w:rFonts w:ascii="Consolas" w:hAnsi="Consolas"/>
+          <w:sz w:val="20"/>
+        </w:rPr>
+        <w:t>analysis/calibracion.py</w:t>
+      </w:r>
+      <w:r>
+        <w:t xml:space="preserve"> (17 tests) + </w:t>
+      </w:r>
+      <w:r>
+        <w:rPr>
+          <w:rFonts w:ascii="Consolas" w:hAnsi="Consolas"/>
+          <w:sz w:val="20"/>
+        </w:rPr>
+        <w:t>simulation/test_he_protocols.py</w:t>
+      </w:r>
+    </w:p>
+    <w:p>
+      <w:r>
+        <w:t xml:space="preserve">(3 tests que garantizan que </w:t>
+      </w:r>
+      <w:r>
+        <w:rPr>
+          <w:rFonts w:ascii="Consolas" w:hAnsi="Consolas"/>
+          <w:sz w:val="20"/>
+        </w:rPr>
+        <w:t>TAU_CALIBRADO</w:t>
+      </w:r>
+      <w:r>
+        <w:t xml:space="preserve"> no se desincronice de la calibración).</w:t>
+      </w:r>
+    </w:p>
+    <w:p>
+      <w:r>
+        <w:t>253 tests en verde; la página H.E.1 renderiza la figura 3 paneles y reporta</w:t>
+      </w:r>
+    </w:p>
+    <w:p>
+      <w:r>
+        <w:t>«τ ∈ [0.175, 0.175] · τ* = 0.175 · τ adoptado = 0.175 cae dentro» (verificado con</w:t>
+      </w:r>
+    </w:p>
+    <w:p>
+      <w:r>
+        <w:rPr>
+          <w:rFonts w:ascii="Consolas" w:hAnsi="Consolas"/>
+          <w:sz w:val="20"/>
+        </w:rPr>
+        <w:t>streamlit.testing.v1.AppTest</w:t>
+      </w:r>
+      <w:r>
+        <w:t>).</w:t>
       </w:r>
     </w:p>
     <w:p>
@@ -2612,7 +7344,17 @@
                 <w:rFonts w:ascii="Consolas" w:hAnsi="Consolas"/>
                 <w:sz w:val="20"/>
               </w:rPr>
-              <w:t>stability.betti_persistente</w:t>
+              <w:t>analysis.calibracion.calibrar_c0</w:t>
+            </w:r>
+            <w:r>
+              <w:t xml:space="preserve"> / </w:t>
+            </w:r>
+            <w:r>
+              <w:rPr>
+                <w:rFonts w:ascii="Consolas" w:hAnsi="Consolas"/>
+                <w:sz w:val="20"/>
+              </w:rPr>
+              <w:t>tau_estrella</w:t>
             </w:r>
           </w:p>
         </w:tc>
@@ -2623,7 +7365,11 @@
           <w:p>
             <w:r/>
             <w:r>
-              <w:t>—</w:t>
+              <w:rPr>
+                <w:rFonts w:ascii="Consolas" w:hAnsi="Consolas"/>
+                <w:sz w:val="20"/>
+              </w:rPr>
+              <w:t>data/figuras/fig51_calibracion_C0.csv</w:t>
             </w:r>
           </w:p>
         </w:tc>
@@ -2806,6 +7552,73 @@
             <w:r/>
             <w:r>
               <w:t>5.4(a)</w:t>
+            </w:r>
+          </w:p>
+        </w:tc>
+      </w:tr>
+      <w:tr>
+        <w:tc>
+          <w:tcPr>
+            <w:tcW w:type="dxa" w:w="2160"/>
+          </w:tcPr>
+          <w:p>
+            <w:r/>
+            <w:r>
+              <w:t>Reconstrucción de figuras</w:t>
+            </w:r>
+          </w:p>
+        </w:tc>
+        <w:tc>
+          <w:tcPr>
+            <w:tcW w:type="dxa" w:w="2160"/>
+          </w:tcPr>
+          <w:p>
+            <w:r/>
+            <w:r>
+              <w:rPr>
+                <w:rFonts w:ascii="Consolas" w:hAnsi="Consolas"/>
+                <w:sz w:val="20"/>
+              </w:rPr>
+              <w:t>visualization.figuras</w:t>
+            </w:r>
+            <w:r>
+              <w:t xml:space="preserve"> (E3)</w:t>
+            </w:r>
+          </w:p>
+        </w:tc>
+        <w:tc>
+          <w:tcPr>
+            <w:tcW w:type="dxa" w:w="2160"/>
+          </w:tcPr>
+          <w:p>
+            <w:r/>
+            <w:r>
+              <w:rPr>
+                <w:rFonts w:ascii="Consolas" w:hAnsi="Consolas"/>
+                <w:sz w:val="20"/>
+              </w:rPr>
+              <w:t>data/figuras/*.png</w:t>
+            </w:r>
+            <w:r>
+              <w:t xml:space="preserve">, </w:t>
+            </w:r>
+            <w:r>
+              <w:rPr>
+                <w:rFonts w:ascii="Consolas" w:hAnsi="Consolas"/>
+                <w:sz w:val="20"/>
+              </w:rPr>
+              <w:t>*.csv</w:t>
+            </w:r>
+          </w:p>
+        </w:tc>
+        <w:tc>
+          <w:tcPr>
+            <w:tcW w:type="dxa" w:w="2160"/>
+          </w:tcPr>
+          <w:p>
+            <w:r/>
+            <w:r>
+              <w:t>5.1–5.7</w:t>
             </w:r>
           </w:p>
         </w:tc>

</xml_diff>

<commit_message>
feat(fig-5.2): replicate the dimensional stability figure with 1680 replicas (Item 31)
Reimplements the corrected Cap. V experiment: 7 clouds x d in {native, 10, 100}
x q in {0.05..0.20} x R=20, tau = 0.175, sigma = q*diam/sqrt(d), zero-padding
embedding and the document's seed scheme.

- analysis/estabilidad_dimensional.py: protocol, q*, ratio summary, CSV cache
- visualization/figuras.py: fig_52_estabilidad with the five PDF panels
  (a1-a3, b, c); retired the two-panel fig52a/fig52b of the original PDF
- page H.E.1: renders the same matplotlib figure from the cached run
- TAU_CALIBRADO moved to analysis.calibracion (single source of truth)

Verified against the Cap. V CSV: max |dB_source - dB_ours| = 0.0 over the 1200
comparable rows; q*, 0 violations and mean ratios match the document text.
Items 19 and 27 superseded; Item 11 re-measured with the exact bottleneck.
</commit_message>
<xml_diff>
--- a/docs/Correcciones_Documento_Principal.docx
+++ b/docs/Correcciones_Documento_Principal.docx
@@ -1891,7 +1891,7 @@
         <w:rPr>
           <w:b/>
         </w:rPr>
-        <w:t>Re-medición (Item 29):</w:t>
+        <w:t>Re-medición (Items 29–31):</w:t>
       </w:r>
       <w:r>
         <w:t xml:space="preserve"> con el ruido corregido </w:t>
@@ -1904,12 +1904,36 @@
         <w:t>σ = q·diam/√d</w:t>
       </w:r>
       <w:r>
-        <w:t xml:space="preserve"> y el catálogo</w:t>
-      </w:r>
-    </w:p>
-    <w:p>
-      <w:r>
-        <w:t xml:space="preserve">&gt; corregido (Item 30), R = 20, n = 400, q = 0,10: </w:t>
+        <w:t>, el catálogo</w:t>
+      </w:r>
+    </w:p>
+    <w:p>
+      <w:r>
+        <w:t xml:space="preserve">&gt; corregido y la distancia bottleneck </w:t>
+      </w:r>
+      <w:r>
+        <w:rPr>
+          <w:b/>
+        </w:rPr>
+        <w:t>exacta</w:t>
+      </w:r>
+      <w:r>
+        <w:t xml:space="preserve"> (Item 14 corregido), sobre las 1 680</w:t>
+      </w:r>
+    </w:p>
+    <w:p>
+      <w:r>
+        <w:t>&gt; réplicas de la Fig. 5.2, dimensión nativa:</w:t>
+      </w:r>
+    </w:p>
+    <w:p>
+      <w:r>
+        <w:t>&gt;</w:t>
+      </w:r>
+    </w:p>
+    <w:p>
+      <w:r>
+        <w:t xml:space="preserve">&gt; | Nube | </w:t>
       </w:r>
       <w:r>
         <w:rPr>
@@ -1919,86 +1943,92 @@
         <w:t>frac(dB/diam ≤ 2q)</w:t>
       </w:r>
       <w:r>
-        <w:t xml:space="preserve"> = 0,00 (círculo),</w:t>
-      </w:r>
-    </w:p>
-    <w:p>
-      <w:r>
-        <w:t xml:space="preserve">&gt; 0,50 (anillo), 1,00 (toro), 1,00 (disco); </w:t>
+        <w:t xml:space="preserve"> para q = 0,05 / 0,10 / 0,15 / 0,20 | máx </w:t>
       </w:r>
       <w:r>
         <w:rPr>
           <w:rFonts w:ascii="Consolas" w:hAnsi="Consolas"/>
           <w:sz w:val="20"/>
         </w:rPr>
-        <w:t>frac(dB ≤ 2dH)</w:t>
-      </w:r>
-      <w:r>
-        <w:t xml:space="preserve"> = </w:t>
-      </w:r>
-      <w:r>
-        <w:rPr>
-          <w:b/>
-        </w:rPr>
-        <w:t>1,00 en las cuatro</w:t>
-      </w:r>
-      <w:r>
-        <w:t>;</w:t>
-      </w:r>
-    </w:p>
-    <w:p>
-      <w:r>
-        <w:t xml:space="preserve">&gt; máximo </w:t>
+        <w:t>dB/dH</w:t>
+      </w:r>
+      <w:r>
+        <w:t xml:space="preserve"> |</w:t>
+      </w:r>
+    </w:p>
+    <w:p>
+      <w:r>
+        <w:t>&gt; |---|---|---|</w:t>
+      </w:r>
+    </w:p>
+    <w:p>
+      <w:r>
+        <w:t>&gt; | círculo | 0,00 / 0,00 / 0,00 / 0,00 | 1,52 |</w:t>
+      </w:r>
+    </w:p>
+    <w:p>
+      <w:r>
+        <w:t>&gt; | dos_círculos | 0,00 / 0,05 / 1,00 / 1,00 | 1,78 |</w:t>
+      </w:r>
+    </w:p>
+    <w:p>
+      <w:r>
+        <w:t>&gt; | anillo | 0,90 / 0,60 / 0,25 / 1,00 | 1,37 |</w:t>
+      </w:r>
+    </w:p>
+    <w:p>
+      <w:r>
+        <w:t>&gt; | toro, disco, esfera, gaussiana | 1,00 en todos | ≤ 0,91 |</w:t>
+      </w:r>
+    </w:p>
+    <w:p>
+      <w:r>
+        <w:t>&gt;</w:t>
+      </w:r>
+    </w:p>
+    <w:p>
+      <w:r>
+        <w:t xml:space="preserve">&gt; </w:t>
       </w:r>
       <w:r>
         <w:rPr>
           <w:rFonts w:ascii="Consolas" w:hAnsi="Consolas"/>
           <w:sz w:val="20"/>
         </w:rPr>
-        <w:t>dB/dH</w:t>
-      </w:r>
-      <w:r>
-        <w:t xml:space="preserve"> = 1,47. El ruido más suave deja al </w:t>
+        <w:t>frac(dB ≤ 2dH)</w:t>
+      </w:r>
+      <w:r>
+        <w:t xml:space="preserve"> = </w:t>
       </w:r>
       <w:r>
         <w:rPr>
           <w:b/>
         </w:rPr>
-        <w:t>toro</w:t>
-      </w:r>
-      <w:r>
-        <w:t xml:space="preserve"> por debajo de </w:t>
+        <w:t>1,00</w:t>
+      </w:r>
+      <w:r>
+        <w:t xml:space="preserve"> en las 560 réplicas nativas. La conclusión se mantiene:</w:t>
+      </w:r>
+    </w:p>
+    <w:p>
+      <w:r>
+        <w:t xml:space="preserve">&gt; </w:t>
+      </w:r>
+      <w:r>
+        <w:rPr>
+          <w:b/>
+        </w:rPr>
+        <w:t>círculo y dos_círculos violan `2q`</w:t>
+      </w:r>
+      <w:r>
+        <w:t xml:space="preserve"> en los niveles bajos, y </w:t>
       </w:r>
       <w:r>
         <w:rPr>
           <w:rFonts w:ascii="Consolas" w:hAnsi="Consolas"/>
           <w:sz w:val="20"/>
         </w:rPr>
-        <w:t>2q</w:t>
-      </w:r>
-      <w:r>
-        <w:t xml:space="preserve"> (antes</w:t>
-      </w:r>
-    </w:p>
-    <w:p>
-      <w:r>
-        <w:t xml:space="preserve">&gt; 0,45), pero </w:t>
-      </w:r>
-      <w:r>
-        <w:rPr>
-          <w:b/>
-        </w:rPr>
-        <w:t>círculo y anillo siguen violándola</w:t>
-      </w:r>
-      <w:r>
-        <w:t>: la conclusión —</w:t>
-      </w:r>
-      <w:r>
-        <w:rPr>
-          <w:rFonts w:ascii="Consolas" w:hAnsi="Consolas"/>
-          <w:sz w:val="20"/>
-        </w:rPr>
-        <w:t>2q·diam</w:t>
+        <w:t>dB/diam ≤ 2q</w:t>
       </w:r>
       <w:r>
         <w:t xml:space="preserve"> no es</w:t>
@@ -2006,21 +2036,12 @@
     </w:p>
     <w:p>
       <w:r>
-        <w:t xml:space="preserve">&gt; consecuencia del teorema— </w:t>
-      </w:r>
-      <w:r>
-        <w:rPr>
-          <w:b/>
-        </w:rPr>
-        <w:t>se mantiene</w:t>
-      </w:r>
-      <w:r>
-        <w:t>. Pendiente de la pasada 5.2/5.3 recalcular</w:t>
-      </w:r>
-    </w:p>
-    <w:p>
-      <w:r>
-        <w:t>&gt; todo el barrido con R = 100.</w:t>
+        <w:t>&gt; consecuencia del teorema. (Una medición previa de esta misma nota usó la bottleneck</w:t>
+      </w:r>
+    </w:p>
+    <w:p>
+      <w:r>
+        <w:t>&gt; con el objetivo equivocado —Item 14— y daba 0,50 para el anillo en q = 0,10.)</w:t>
       </w:r>
     </w:p>
     <w:p>
@@ -3590,6 +3611,44 @@
       </w:pPr>
       <w:r>
         <w:t>Item 19 — Fig. 5.2: estilo de paneles según el PDF (sin líneas guía 95/50)</w:t>
+      </w:r>
+    </w:p>
+    <w:p>
+      <w:r>
+        <w:t xml:space="preserve">&gt; </w:t>
+      </w:r>
+      <w:r>
+        <w:rPr>
+          <w:b/>
+        </w:rPr>
+        <w:t>SUPERADO por el Item 31.</w:t>
+      </w:r>
+      <w:r>
+        <w:t xml:space="preserve"> Este item describía la figura del PDF *original*</w:t>
+      </w:r>
+    </w:p>
+    <w:p>
+      <w:r>
+        <w:t>&gt; (un panel (a) y sin línea guía del 95 %). El Cap. V corregido trae cinco paneles</w:t>
+      </w:r>
+    </w:p>
+    <w:p>
+      <w:r>
+        <w:t xml:space="preserve">&gt; —(a1–a3) por dimensión ambiente, (b) y (c)— y </w:t>
+      </w:r>
+      <w:r>
+        <w:rPr>
+          <w:b/>
+        </w:rPr>
+        <w:t>sí</w:t>
+      </w:r>
+      <w:r>
+        <w:t xml:space="preserve"> dibuja la guía punteada en</w:t>
+      </w:r>
+    </w:p>
+    <w:p>
+      <w:r>
+        <w:t>&gt; 0,95. La app y el headless siguen ahora esa versión.</w:t>
       </w:r>
     </w:p>
     <w:p>
@@ -5529,6 +5588,66 @@
     </w:p>
     <w:p>
       <w:r>
+        <w:t xml:space="preserve">&gt; </w:t>
+      </w:r>
+      <w:r>
+        <w:rPr>
+          <w:b/>
+        </w:rPr>
+        <w:t>SUPERADO por los Items 30 y 31.</w:t>
+      </w:r>
+      <w:r>
+        <w:t xml:space="preserve"> La causa era la geometría del catálogo</w:t>
+      </w:r>
+    </w:p>
+    <w:p>
+      <w:r>
+        <w:t>&gt; (</w:t>
+      </w:r>
+      <w:r>
+        <w:rPr>
+          <w:rFonts w:ascii="Consolas" w:hAnsi="Consolas"/>
+          <w:sz w:val="20"/>
+        </w:rPr>
+        <w:t>dos_circulos</w:t>
+      </w:r>
+      <w:r>
+        <w:t xml:space="preserve"> con separación 5), no el fenómeno. Con el catálogo corregido y el</w:t>
+      </w:r>
+    </w:p>
+    <w:p>
+      <w:r>
+        <w:t xml:space="preserve">&gt; ruido normalizado, la Fig. 5.2 reproduce al documento: </w:t>
+      </w:r>
+      <w:r>
+        <w:rPr>
+          <w:rFonts w:ascii="Consolas" w:hAnsi="Consolas"/>
+          <w:sz w:val="20"/>
+        </w:rPr>
+        <w:t>dos_circulos</w:t>
+      </w:r>
+      <w:r>
+        <w:t xml:space="preserve"> da </w:t>
+      </w:r>
+      <w:r>
+        <w:rPr>
+          <w:b/>
+        </w:rPr>
+        <w:t>q\* = 0</w:t>
+      </w:r>
+    </w:p>
+    <w:p>
+      <w:r>
+        <w:t>&gt; en las tres dimensiones, exactamente como reporta el Cap. V corregido. Se conserva</w:t>
+      </w:r>
+    </w:p>
+    <w:p>
+      <w:r>
+        <w:t>&gt; el diagnóstico por trazabilidad, pero ya no describe el software.</w:t>
+      </w:r>
+    </w:p>
+    <w:p>
+      <w:r>
         <w:rPr>
           <w:b/>
         </w:rPr>
@@ -7079,6 +7198,594 @@
         <w:pStyle w:val="Heading1"/>
       </w:pPr>
       <w:r>
+        <w:t>Item 31 — Fig. 5.2 replicada bit a bit (5 paneles, 1 680 réplicas)</w:t>
+      </w:r>
+    </w:p>
+    <w:p>
+      <w:r>
+        <w:rPr>
+          <w:b/>
+        </w:rPr>
+        <w:t>Qué se hizo:</w:t>
+      </w:r>
+      <w:r>
+        <w:t xml:space="preserve"> </w:t>
+      </w:r>
+      <w:r>
+        <w:rPr>
+          <w:rFonts w:ascii="Consolas" w:hAnsi="Consolas"/>
+          <w:sz w:val="20"/>
+        </w:rPr>
+        <w:t>analysis/estabilidad_dimensional.py</w:t>
+      </w:r>
+      <w:r>
+        <w:t xml:space="preserve"> reimplementa el</w:t>
+      </w:r>
+    </w:p>
+    <w:p>
+      <w:r>
+        <w:t>experimento del Cap. V corregido (</w:t>
+      </w:r>
+      <w:r>
+        <w:rPr>
+          <w:rFonts w:ascii="Consolas" w:hAnsi="Consolas"/>
+          <w:sz w:val="20"/>
+        </w:rPr>
+        <w:t>caso1_tda.py</w:t>
+      </w:r>
+      <w:r>
+        <w:t>) y `visualization.figuras.</w:t>
+      </w:r>
+    </w:p>
+    <w:p>
+      <w:r>
+        <w:t>fig_52_estabilidad` dibuja los cinco paneles. La app (pestaña H.E.1) lee la</w:t>
+      </w:r>
+    </w:p>
+    <w:p>
+      <w:r>
+        <w:t xml:space="preserve">corrida cacheada en </w:t>
+      </w:r>
+      <w:r>
+        <w:rPr>
+          <w:rFonts w:ascii="Consolas" w:hAnsi="Consolas"/>
+          <w:sz w:val="20"/>
+        </w:rPr>
+        <w:t>data/figuras/fig52_replicas.csv</w:t>
+      </w:r>
+      <w:r>
+        <w:t xml:space="preserve"> y muestra la misma figura</w:t>
+      </w:r>
+    </w:p>
+    <w:p>
+      <w:r>
+        <w:t>matplotlib, con tema claro/oscuro.</w:t>
+      </w:r>
+    </w:p>
+    <w:p>
+      <w:r>
+        <w:rPr>
+          <w:b/>
+        </w:rPr>
+        <w:t>Protocolo (idéntico al documento):</w:t>
+      </w:r>
+      <w:r>
+        <w:t xml:space="preserve"> 7 nubes × d ∈ {nativa, 10, 100} ×</w:t>
+      </w:r>
+    </w:p>
+    <w:p>
+      <w:r>
+        <w:t xml:space="preserve">q ∈ {0,05; 0,10; 0,15; 0,20} × R = 20 réplicas = </w:t>
+      </w:r>
+      <w:r>
+        <w:rPr>
+          <w:b/>
+        </w:rPr>
+        <w:t>1 680</w:t>
+      </w:r>
+      <w:r>
+        <w:t>; n = 400;</w:t>
+      </w:r>
+    </w:p>
+    <w:p>
+      <w:r>
+        <w:t>τ = 0,175 (el de la Fig. 5.1); σ = q·diam(X)/√d; embebido por relleno de ceros;</w:t>
+      </w:r>
+    </w:p>
+    <w:p>
+      <w:r>
+        <w:t xml:space="preserve">lectura de βk con </w:t>
+      </w:r>
+      <w:r>
+        <w:rPr>
+          <w:rFonts w:ascii="Consolas" w:hAnsi="Consolas"/>
+          <w:sz w:val="20"/>
+        </w:rPr>
+        <w:t>diam(Y)</w:t>
+      </w:r>
+      <w:r>
+        <w:t xml:space="preserve">; semillas </w:t>
+      </w:r>
+      <w:r>
+        <w:rPr>
+          <w:rFonts w:ascii="Consolas" w:hAnsi="Consolas"/>
+          <w:sz w:val="20"/>
+        </w:rPr>
+        <w:t>42 + i</w:t>
+      </w:r>
+      <w:r>
+        <w:t xml:space="preserve"> (nube) y</w:t>
+      </w:r>
+    </w:p>
+    <w:p>
+      <w:r>
+        <w:rPr>
+          <w:rFonts w:ascii="Consolas" w:hAnsi="Consolas"/>
+          <w:sz w:val="20"/>
+        </w:rPr>
+        <w:t>42 + 1000r + 10⁵q + 10⁷d + 100i</w:t>
+      </w:r>
+      <w:r>
+        <w:t xml:space="preserve"> (ruido).</w:t>
+      </w:r>
+    </w:p>
+    <w:p>
+      <w:r>
+        <w:rPr>
+          <w:b/>
+        </w:rPr>
+        <w:t>Verificación (contra `tda_replicas.csv` del Cap. V):</w:t>
+      </w:r>
+      <w:r>
+        <w:t xml:space="preserve"> 1 200 filas comparables</w:t>
+      </w:r>
+    </w:p>
+    <w:p>
+      <w:r>
+        <w:t>(las 480 restantes difieren solo en la tilde de «círculo»/«dos círculos») y</w:t>
+      </w:r>
+    </w:p>
+    <w:p>
+      <w:r>
+        <w:rPr>
+          <w:b/>
+        </w:rPr>
+        <w:t>`max |dB_origen − dB_nuestro| = 0,0`</w:t>
+      </w:r>
+      <w:r>
+        <w:t xml:space="preserve"> — coincidencia exacta, no aproximada.</w:t>
+      </w:r>
+    </w:p>
+    <w:p>
+      <w:r>
+        <w:rPr>
+          <w:b/>
+        </w:rPr>
+        <w:t>Resultados (coinciden con el texto del documento):</w:t>
+      </w:r>
+    </w:p>
+    <w:tbl>
+      <w:tblPr>
+        <w:tblStyle w:val="LightGrid-Accent1"/>
+        <w:tblW w:type="auto" w:w="0"/>
+        <w:tblLook w:firstColumn="1" w:firstRow="1" w:lastColumn="0" w:lastRow="0" w:noHBand="0" w:noVBand="1" w:val="04A0"/>
+      </w:tblPr>
+      <w:tblGrid>
+        <w:gridCol w:w="2880"/>
+        <w:gridCol w:w="2880"/>
+        <w:gridCol w:w="2880"/>
+      </w:tblGrid>
+      <w:tr>
+        <w:tc>
+          <w:tcPr>
+            <w:tcW w:type="dxa" w:w="2880"/>
+          </w:tcPr>
+          <w:p>
+            <w:r>
+              <w:rPr>
+                <w:b/>
+              </w:rPr>
+            </w:r>
+            <w:r>
+              <w:rPr>
+                <w:b/>
+              </w:rPr>
+              <w:t>Magnitud</w:t>
+            </w:r>
+          </w:p>
+        </w:tc>
+        <w:tc>
+          <w:tcPr>
+            <w:tcW w:type="dxa" w:w="2880"/>
+          </w:tcPr>
+          <w:p>
+            <w:r>
+              <w:rPr>
+                <w:b/>
+              </w:rPr>
+            </w:r>
+            <w:r>
+              <w:rPr>
+                <w:b/>
+              </w:rPr>
+              <w:t>Documento</w:t>
+            </w:r>
+          </w:p>
+        </w:tc>
+        <w:tc>
+          <w:tcPr>
+            <w:tcW w:type="dxa" w:w="2880"/>
+          </w:tcPr>
+          <w:p>
+            <w:r>
+              <w:rPr>
+                <w:b/>
+              </w:rPr>
+            </w:r>
+            <w:r>
+              <w:rPr>
+                <w:b/>
+              </w:rPr>
+              <w:t>Software</w:t>
+            </w:r>
+          </w:p>
+        </w:tc>
+      </w:tr>
+      <w:tr>
+        <w:tc>
+          <w:tcPr>
+            <w:tcW w:type="dxa" w:w="2880"/>
+          </w:tcPr>
+          <w:p>
+            <w:r/>
+            <w:r>
+              <w:t xml:space="preserve">Razón media </w:t>
+            </w:r>
+            <w:r>
+              <w:rPr>
+                <w:rFonts w:ascii="Consolas" w:hAnsi="Consolas"/>
+                <w:sz w:val="20"/>
+              </w:rPr>
+              <w:t>dB/(2dH)</w:t>
+            </w:r>
+            <w:r>
+              <w:t>: nativa / d=10 / d=100</w:t>
+            </w:r>
+          </w:p>
+        </w:tc>
+        <w:tc>
+          <w:tcPr>
+            <w:tcW w:type="dxa" w:w="2880"/>
+          </w:tcPr>
+          <w:p>
+            <w:r/>
+            <w:r>
+              <w:t>0,31 / 0,25 / 0,36</w:t>
+            </w:r>
+          </w:p>
+        </w:tc>
+        <w:tc>
+          <w:tcPr>
+            <w:tcW w:type="dxa" w:w="2880"/>
+          </w:tcPr>
+          <w:p>
+            <w:r/>
+            <w:r>
+              <w:rPr>
+                <w:b/>
+              </w:rPr>
+              <w:t>0,305 / 0,252 / 0,358</w:t>
+            </w:r>
+          </w:p>
+        </w:tc>
+      </w:tr>
+      <w:tr>
+        <w:tc>
+          <w:tcPr>
+            <w:tcW w:type="dxa" w:w="2880"/>
+          </w:tcPr>
+          <w:p>
+            <w:r/>
+            <w:r>
+              <w:t xml:space="preserve">Máximo </w:t>
+            </w:r>
+            <w:r>
+              <w:rPr>
+                <w:rFonts w:ascii="Consolas" w:hAnsi="Consolas"/>
+                <w:sz w:val="20"/>
+              </w:rPr>
+              <w:t>dB/dH</w:t>
+            </w:r>
+            <w:r>
+              <w:t xml:space="preserve"> en dimensión nativa</w:t>
+            </w:r>
+          </w:p>
+        </w:tc>
+        <w:tc>
+          <w:tcPr>
+            <w:tcW w:type="dxa" w:w="2880"/>
+          </w:tcPr>
+          <w:p>
+            <w:r/>
+            <w:r>
+              <w:t>0,89</w:t>
+            </w:r>
+          </w:p>
+        </w:tc>
+        <w:tc>
+          <w:tcPr>
+            <w:tcW w:type="dxa" w:w="2880"/>
+          </w:tcPr>
+          <w:p>
+            <w:r/>
+            <w:r>
+              <w:rPr>
+                <w:b/>
+              </w:rPr>
+              <w:t>0,892</w:t>
+            </w:r>
+          </w:p>
+        </w:tc>
+      </w:tr>
+      <w:tr>
+        <w:tc>
+          <w:tcPr>
+            <w:tcW w:type="dxa" w:w="2880"/>
+          </w:tcPr>
+          <w:p>
+            <w:r/>
+            <w:r>
+              <w:t xml:space="preserve">Violaciones de </w:t>
+            </w:r>
+            <w:r>
+              <w:rPr>
+                <w:rFonts w:ascii="Consolas" w:hAnsi="Consolas"/>
+                <w:sz w:val="20"/>
+              </w:rPr>
+              <w:t>dB ≤ 2dH</w:t>
+            </w:r>
+            <w:r>
+              <w:t xml:space="preserve"> en 1 680 réplicas</w:t>
+            </w:r>
+          </w:p>
+        </w:tc>
+        <w:tc>
+          <w:tcPr>
+            <w:tcW w:type="dxa" w:w="2880"/>
+          </w:tcPr>
+          <w:p>
+            <w:r/>
+            <w:r>
+              <w:t>0</w:t>
+            </w:r>
+          </w:p>
+        </w:tc>
+        <w:tc>
+          <w:tcPr>
+            <w:tcW w:type="dxa" w:w="2880"/>
+          </w:tcPr>
+          <w:p>
+            <w:r/>
+            <w:r>
+              <w:rPr>
+                <w:b/>
+              </w:rPr>
+              <w:t>0</w:t>
+            </w:r>
+          </w:p>
+        </w:tc>
+      </w:tr>
+      <w:tr>
+        <w:tc>
+          <w:tcPr>
+            <w:tcW w:type="dxa" w:w="2880"/>
+          </w:tcPr>
+          <w:p>
+            <w:r/>
+            <w:r>
+              <w:rPr>
+                <w:rFonts w:ascii="Consolas" w:hAnsi="Consolas"/>
+                <w:sz w:val="20"/>
+              </w:rPr>
+              <w:t>q*</w:t>
+            </w:r>
+            <w:r>
+              <w:t xml:space="preserve"> nativa: disco / círculo / gaussiana / anillo / esfera / dos círculos / toro</w:t>
+            </w:r>
+          </w:p>
+        </w:tc>
+        <w:tc>
+          <w:tcPr>
+            <w:tcW w:type="dxa" w:w="2880"/>
+          </w:tcPr>
+          <w:p>
+            <w:r/>
+            <w:r>
+              <w:t>0,20 / 0,15 / 0,15 / 0,10 / 0,10 / 0 / 0</w:t>
+            </w:r>
+          </w:p>
+        </w:tc>
+        <w:tc>
+          <w:tcPr>
+            <w:tcW w:type="dxa" w:w="2880"/>
+          </w:tcPr>
+          <w:p>
+            <w:r/>
+            <w:r>
+              <w:rPr>
+                <w:b/>
+              </w:rPr>
+              <w:t>idéntico</w:t>
+            </w:r>
+          </w:p>
+        </w:tc>
+      </w:tr>
+      <w:tr>
+        <w:tc>
+          <w:tcPr>
+            <w:tcW w:type="dxa" w:w="2880"/>
+          </w:tcPr>
+          <w:p>
+            <w:r/>
+            <w:r>
+              <w:rPr>
+                <w:rFonts w:ascii="Consolas" w:hAnsi="Consolas"/>
+                <w:sz w:val="20"/>
+              </w:rPr>
+              <w:t>q*</w:t>
+            </w:r>
+            <w:r>
+              <w:t xml:space="preserve"> en d=10 y d=100: círculo, anillo, disco / esfera, gaussiana</w:t>
+            </w:r>
+          </w:p>
+        </w:tc>
+        <w:tc>
+          <w:tcPr>
+            <w:tcW w:type="dxa" w:w="2880"/>
+          </w:tcPr>
+          <w:p>
+            <w:r/>
+            <w:r>
+              <w:t>0,10 / 0,05</w:t>
+            </w:r>
+          </w:p>
+        </w:tc>
+        <w:tc>
+          <w:tcPr>
+            <w:tcW w:type="dxa" w:w="2880"/>
+          </w:tcPr>
+          <w:p>
+            <w:r/>
+            <w:r>
+              <w:rPr>
+                <w:b/>
+              </w:rPr>
+              <w:t>idéntico</w:t>
+            </w:r>
+          </w:p>
+        </w:tc>
+      </w:tr>
+    </w:tbl>
+    <w:p>
+      <w:r>
+        <w:rPr>
+          <w:b/>
+        </w:rPr>
+        <w:t>Artefactos:</w:t>
+      </w:r>
+      <w:r>
+        <w:t xml:space="preserve"> </w:t>
+      </w:r>
+      <w:r>
+        <w:rPr>
+          <w:rFonts w:ascii="Consolas" w:hAnsi="Consolas"/>
+          <w:sz w:val="20"/>
+        </w:rPr>
+        <w:t>data/figuras/fig52_estabilidad.png</w:t>
+      </w:r>
+      <w:r>
+        <w:t xml:space="preserve">, </w:t>
+      </w:r>
+      <w:r>
+        <w:rPr>
+          <w:rFonts w:ascii="Consolas" w:hAnsi="Consolas"/>
+          <w:sz w:val="20"/>
+        </w:rPr>
+        <w:t>fig52_replicas.csv</w:t>
+      </w:r>
+    </w:p>
+    <w:p>
+      <w:r>
+        <w:t xml:space="preserve">(1 680 filas), </w:t>
+      </w:r>
+      <w:r>
+        <w:rPr>
+          <w:rFonts w:ascii="Consolas" w:hAnsi="Consolas"/>
+          <w:sz w:val="20"/>
+        </w:rPr>
+        <w:t>fig52_q0.csv</w:t>
+      </w:r>
+      <w:r>
+        <w:t xml:space="preserve"> (lectura sin ruido, con márgenes). Los antiguos</w:t>
+      </w:r>
+    </w:p>
+    <w:p>
+      <w:r>
+        <w:rPr>
+          <w:rFonts w:ascii="Consolas" w:hAnsi="Consolas"/>
+          <w:sz w:val="20"/>
+        </w:rPr>
+        <w:t>fig52a_tasa_acierto.png</w:t>
+      </w:r>
+      <w:r>
+        <w:t xml:space="preserve"> y </w:t>
+      </w:r>
+      <w:r>
+        <w:rPr>
+          <w:rFonts w:ascii="Consolas" w:hAnsi="Consolas"/>
+          <w:sz w:val="20"/>
+        </w:rPr>
+        <w:t>fig52b_cota_estabilidad.png</w:t>
+      </w:r>
+      <w:r>
+        <w:t xml:space="preserve"> </w:t>
+      </w:r>
+      <w:r>
+        <w:rPr>
+          <w:b/>
+        </w:rPr>
+        <w:t>se retiran</w:t>
+      </w:r>
+      <w:r>
+        <w:t>: eran la</w:t>
+      </w:r>
+    </w:p>
+    <w:p>
+      <w:r>
+        <w:t>versión de dos paneles del PDF original.</w:t>
+      </w:r>
+    </w:p>
+    <w:p>
+      <w:r>
+        <w:rPr>
+          <w:b/>
+        </w:rPr>
+        <w:t>Nota de lectura:</w:t>
+      </w:r>
+      <w:r>
+        <w:t xml:space="preserve"> los paneles (b) y (c) no contradicen a (a). El diagrama se</w:t>
+      </w:r>
+    </w:p>
+    <w:p>
+      <w:r>
+        <w:t>mueve poco (b), pero un desplazamiento pequeño basta para que una barra cruce el</w:t>
+      </w:r>
+    </w:p>
+    <w:p>
+      <w:r>
+        <w:t xml:space="preserve">umbral fijo τ (a). El orden de los </w:t>
+      </w:r>
+      <w:r>
+        <w:rPr>
+          <w:rFonts w:ascii="Consolas" w:hAnsi="Consolas"/>
+          <w:sz w:val="20"/>
+        </w:rPr>
+        <w:t>q*</w:t>
+      </w:r>
+      <w:r>
+        <w:t xml:space="preserve"> reproduce el de los márgenes de la</w:t>
+      </w:r>
+    </w:p>
+    <w:p>
+      <w:r>
+        <w:t>Fig. 5.1(c): las nubes con margen grande resisten más.</w:t>
+      </w:r>
+    </w:p>
+    <w:p>
+      <w:pPr>
+        <w:pStyle w:val="Heading1"/>
+      </w:pPr>
+      <w:r>
         <w:t>Resumen de trazabilidad (software → tesis)</w:t>
       </w:r>
     </w:p>
@@ -7191,7 +7898,7 @@
                 <w:rFonts w:ascii="Consolas" w:hAnsi="Consolas"/>
                 <w:sz w:val="20"/>
               </w:rPr>
-              <w:t>stability.verificar_cota_bottleneck</w:t>
+              <w:t>estabilidad_dimensional.protocolo_fig52</w:t>
             </w:r>
           </w:p>
         </w:tc>
@@ -7202,7 +7909,11 @@
           <w:p>
             <w:r/>
             <w:r>
-              <w:t>—</w:t>
+              <w:rPr>
+                <w:rFonts w:ascii="Consolas" w:hAnsi="Consolas"/>
+                <w:sz w:val="20"/>
+              </w:rPr>
+              <w:t>data/figuras/fig52_replicas.csv</w:t>
             </w:r>
           </w:p>
         </w:tc>
@@ -7213,7 +7924,7 @@
           <w:p>
             <w:r/>
             <w:r>
-              <w:t>5.2(b), 5.3</w:t>
+              <w:t>5.2(b–c), 5.3</w:t>
             </w:r>
           </w:p>
         </w:tc>
@@ -7291,10 +8002,17 @@
                 <w:rFonts w:ascii="Consolas" w:hAnsi="Consolas"/>
                 <w:sz w:val="20"/>
               </w:rPr>
-              <w:t>stability.barrido_cota_bottleneck</w:t>
+              <w:t>estabilidad_dimensional.protocolo_fig52</w:t>
             </w:r>
             <w:r>
-              <w:t xml:space="preserve"> (acierto)</w:t>
+              <w:t xml:space="preserve"> / </w:t>
+            </w:r>
+            <w:r>
+              <w:rPr>
+                <w:rFonts w:ascii="Consolas" w:hAnsi="Consolas"/>
+                <w:sz w:val="20"/>
+              </w:rPr>
+              <w:t>q_estrella</w:t>
             </w:r>
           </w:p>
         </w:tc>
@@ -7305,7 +8023,11 @@
           <w:p>
             <w:r/>
             <w:r>
-              <w:t>—</w:t>
+              <w:rPr>
+                <w:rFonts w:ascii="Consolas" w:hAnsi="Consolas"/>
+                <w:sz w:val="20"/>
+              </w:rPr>
+              <w:t>data/figuras/fig52_replicas.csv</w:t>
             </w:r>
           </w:p>
         </w:tc>
@@ -7316,7 +8038,7 @@
           <w:p>
             <w:r/>
             <w:r>
-              <w:t>5.2(a)</w:t>
+              <w:t>5.2(a1–a3)</w:t>
             </w:r>
           </w:p>
         </w:tc>

</xml_diff>

<commit_message>
feat(fig-5.3): replicate the corrected truncation/probabilistic-bound figure (Item 32)
The corrected Cap. V deletes the old bound figure and replaces it with two
panels: the truncation artifact and the probabilistic bound that supersedes it.

- analysis/truncamiento.py: circle n=400 with the previous noise definition
  (sigma = q*diam), 20 replicas x two filtrations (eps <= 0.6 vs complete)
- visualization/figuras.py: fig_53_cota_corregida; the document/theorem
  selector is retired
- page H.E.1 renders the cached run and the bound from the Fig. 5.2 replicas

Reproduces the document numbers exactly: truncated 0.042/0.079/0.106/0.117,
complete 0.191/0.385/0.407/0.407; bound ratio max 0.442, mean 0.213, 0
violations. Items 25 and 26 superseded.
</commit_message>
<xml_diff>
--- a/docs/Correcciones_Documento_Principal.docx
+++ b/docs/Correcciones_Documento_Principal.docx
@@ -5235,6 +5235,68 @@
     </w:p>
     <w:p>
       <w:r>
+        <w:t xml:space="preserve">&gt; </w:t>
+      </w:r>
+      <w:r>
+        <w:rPr>
+          <w:b/>
+        </w:rPr>
+        <w:t>SUPERADO por el Item 32.</w:t>
+      </w:r>
+      <w:r>
+        <w:t xml:space="preserve"> El Cap. V corregido </w:t>
+      </w:r>
+      <w:r>
+        <w:rPr>
+          <w:b/>
+        </w:rPr>
+        <w:t>elimina</w:t>
+      </w:r>
+      <w:r>
+        <w:t xml:space="preserve"> esta figura: la</w:t>
+      </w:r>
+    </w:p>
+    <w:p>
+      <w:r>
+        <w:t xml:space="preserve">&gt; cota </w:t>
+      </w:r>
+      <w:r>
+        <w:rPr>
+          <w:rFonts w:ascii="Consolas" w:hAnsi="Consolas"/>
+          <w:sz w:val="20"/>
+        </w:rPr>
+        <w:t>dB/diam ≤ 2q</w:t>
+      </w:r>
+      <w:r>
+        <w:t xml:space="preserve"> se retira y se reemplaza por la figura de dos paneles</w:t>
+      </w:r>
+    </w:p>
+    <w:p>
+      <w:r>
+        <w:t>&gt; (artefacto del truncamiento + cota probabilística). Lo que este item</w:t>
+      </w:r>
+    </w:p>
+    <w:p>
+      <w:r>
+        <w:t>&gt; documentaba —que la cota se rompe con la métrica exacta— queda explicado en el</w:t>
+      </w:r>
+    </w:p>
+    <w:p>
+      <w:r>
+        <w:t xml:space="preserve">&gt; panel (a) del Item 32: la cota solo se sostenía </w:t>
+      </w:r>
+      <w:r>
+        <w:rPr>
+          <w:b/>
+        </w:rPr>
+        <w:t>truncando la filtración</w:t>
+      </w:r>
+      <w:r>
+        <w:t>.</w:t>
+      </w:r>
+    </w:p>
+    <w:p>
+      <w:r>
         <w:rPr>
           <w:b/>
         </w:rPr>
@@ -5377,6 +5439,40 @@
       </w:pPr>
       <w:r>
         <w:t>Item 26 — Fig. 5.3: selector de forma (documento ↔ teorema)</w:t>
+      </w:r>
+    </w:p>
+    <w:p>
+      <w:r>
+        <w:t xml:space="preserve">&gt; </w:t>
+      </w:r>
+      <w:r>
+        <w:rPr>
+          <w:b/>
+        </w:rPr>
+        <w:t>SUPERADO por el Item 32.</w:t>
+      </w:r>
+      <w:r>
+        <w:t xml:space="preserve"> El selector se retira: ya no hay dos formas que</w:t>
+      </w:r>
+    </w:p>
+    <w:p>
+      <w:r>
+        <w:t xml:space="preserve">&gt; contrastar porque el documento corregido abandona la cota </w:t>
+      </w:r>
+      <w:r>
+        <w:rPr>
+          <w:rFonts w:ascii="Consolas" w:hAnsi="Consolas"/>
+          <w:sz w:val="20"/>
+        </w:rPr>
+        <w:t>2q</w:t>
+      </w:r>
+      <w:r>
+        <w:t>. Queda una sola</w:t>
+      </w:r>
+    </w:p>
+    <w:p>
+      <w:r>
+        <w:t>&gt; figura, con el artefacto y la cota que lo sustituye.</w:t>
       </w:r>
     </w:p>
     <w:p>
@@ -7786,6 +7882,556 @@
         <w:pStyle w:val="Heading1"/>
       </w:pPr>
       <w:r>
+        <w:t>Item 32 — Fig. 5.3 corregida replicada (truncamiento + cota probabilística)</w:t>
+      </w:r>
+    </w:p>
+    <w:p>
+      <w:r>
+        <w:rPr>
+          <w:b/>
+        </w:rPr>
+        <w:t>Qué se hizo:</w:t>
+      </w:r>
+      <w:r>
+        <w:t xml:space="preserve"> </w:t>
+      </w:r>
+      <w:r>
+        <w:rPr>
+          <w:rFonts w:ascii="Consolas" w:hAnsi="Consolas"/>
+          <w:sz w:val="20"/>
+        </w:rPr>
+        <w:t>analysis/truncamiento.py</w:t>
+      </w:r>
+      <w:r>
+        <w:t xml:space="preserve"> reproduce el experimento del panel (a)</w:t>
+      </w:r>
+    </w:p>
+    <w:p>
+      <w:r>
+        <w:t xml:space="preserve">y </w:t>
+      </w:r>
+      <w:r>
+        <w:rPr>
+          <w:rFonts w:ascii="Consolas" w:hAnsi="Consolas"/>
+          <w:sz w:val="20"/>
+        </w:rPr>
+        <w:t>visualization.figuras.fig_53_cota_corregida</w:t>
+      </w:r>
+      <w:r>
+        <w:t xml:space="preserve"> dibuja los dos paneles. La app</w:t>
+      </w:r>
+    </w:p>
+    <w:p>
+      <w:r>
+        <w:t>lee la corrida cacheada (</w:t>
+      </w:r>
+      <w:r>
+        <w:rPr>
+          <w:rFonts w:ascii="Consolas" w:hAnsi="Consolas"/>
+          <w:sz w:val="20"/>
+        </w:rPr>
+        <w:t>data/figuras/fig53_truncamiento.csv</w:t>
+      </w:r>
+      <w:r>
+        <w:t>) y el panel (b) de</w:t>
+      </w:r>
+    </w:p>
+    <w:p>
+      <w:r>
+        <w:t>las 1 680 réplicas de la Fig. 5.2.</w:t>
+      </w:r>
+    </w:p>
+    <w:p>
+      <w:r>
+        <w:rPr>
+          <w:b/>
+        </w:rPr>
+        <w:t>Panel (a) — protocolo (idéntico al documento):</w:t>
+      </w:r>
+      <w:r>
+        <w:t xml:space="preserve"> círculo, n = 400, **definición</w:t>
+      </w:r>
+    </w:p>
+    <w:p>
+      <w:r>
+        <w:t>de ruido anterior** (</w:t>
+      </w:r>
+      <w:r>
+        <w:rPr>
+          <w:rFonts w:ascii="Consolas" w:hAnsi="Consolas"/>
+          <w:sz w:val="20"/>
+        </w:rPr>
+        <w:t>σ = q·diam X</w:t>
+      </w:r>
+      <w:r>
+        <w:t>, sin normalizar), q ∈ {0; 0,05; 0,10; 0,15;</w:t>
+      </w:r>
+    </w:p>
+    <w:p>
+      <w:r>
+        <w:t>0,20} × R = 20 × dos filtraciones (truncada en ε ≤ 0,6 y completa) = 200 filas.</w:t>
+      </w:r>
+    </w:p>
+    <w:p>
+      <w:r>
+        <w:t>La truncada descarta la barra infinita, que es justamente el ciclo principal del</w:t>
+      </w:r>
+    </w:p>
+    <w:p>
+      <w:r>
+        <w:t>círculo (muere en √3 ≈ 1,73).</w:t>
+      </w:r>
+    </w:p>
+    <w:p>
+      <w:r>
+        <w:rPr>
+          <w:b/>
+        </w:rPr>
+        <w:t>Resultados (coinciden exactamente con el texto del documento):</w:t>
+      </w:r>
+    </w:p>
+    <w:tbl>
+      <w:tblPr>
+        <w:tblStyle w:val="LightGrid-Accent1"/>
+        <w:tblW w:type="auto" w:w="0"/>
+        <w:tblLook w:firstColumn="1" w:firstRow="1" w:lastColumn="0" w:lastRow="0" w:noHBand="0" w:noVBand="1" w:val="04A0"/>
+      </w:tblPr>
+      <w:tblGrid>
+        <w:gridCol w:w="1728"/>
+        <w:gridCol w:w="1728"/>
+        <w:gridCol w:w="1728"/>
+        <w:gridCol w:w="1728"/>
+        <w:gridCol w:w="1728"/>
+      </w:tblGrid>
+      <w:tr>
+        <w:tc>
+          <w:tcPr>
+            <w:tcW w:type="dxa" w:w="1728"/>
+          </w:tcPr>
+          <w:p>
+            <w:r>
+              <w:rPr>
+                <w:b/>
+              </w:rPr>
+            </w:r>
+            <w:r>
+              <w:rPr>
+                <w:rFonts w:ascii="Consolas" w:hAnsi="Consolas"/>
+                <w:b/>
+                <w:sz w:val="20"/>
+              </w:rPr>
+              <w:t>dB/diam X</w:t>
+            </w:r>
+          </w:p>
+        </w:tc>
+        <w:tc>
+          <w:tcPr>
+            <w:tcW w:type="dxa" w:w="1728"/>
+          </w:tcPr>
+          <w:p>
+            <w:r>
+              <w:rPr>
+                <w:b/>
+              </w:rPr>
+            </w:r>
+            <w:r>
+              <w:rPr>
+                <w:b/>
+              </w:rPr>
+              <w:t>q = 0,05</w:t>
+            </w:r>
+          </w:p>
+        </w:tc>
+        <w:tc>
+          <w:tcPr>
+            <w:tcW w:type="dxa" w:w="1728"/>
+          </w:tcPr>
+          <w:p>
+            <w:r>
+              <w:rPr>
+                <w:b/>
+              </w:rPr>
+            </w:r>
+            <w:r>
+              <w:rPr>
+                <w:b/>
+              </w:rPr>
+              <w:t>0,10</w:t>
+            </w:r>
+          </w:p>
+        </w:tc>
+        <w:tc>
+          <w:tcPr>
+            <w:tcW w:type="dxa" w:w="1728"/>
+          </w:tcPr>
+          <w:p>
+            <w:r>
+              <w:rPr>
+                <w:b/>
+              </w:rPr>
+            </w:r>
+            <w:r>
+              <w:rPr>
+                <w:b/>
+              </w:rPr>
+              <w:t>0,15</w:t>
+            </w:r>
+          </w:p>
+        </w:tc>
+        <w:tc>
+          <w:tcPr>
+            <w:tcW w:type="dxa" w:w="1728"/>
+          </w:tcPr>
+          <w:p>
+            <w:r>
+              <w:rPr>
+                <w:b/>
+              </w:rPr>
+            </w:r>
+            <w:r>
+              <w:rPr>
+                <w:b/>
+              </w:rPr>
+              <w:t>0,20</w:t>
+            </w:r>
+          </w:p>
+        </w:tc>
+      </w:tr>
+      <w:tr>
+        <w:tc>
+          <w:tcPr>
+            <w:tcW w:type="dxa" w:w="1728"/>
+          </w:tcPr>
+          <w:p>
+            <w:r/>
+            <w:r>
+              <w:t>Truncado en ε ≤ 0,6</w:t>
+            </w:r>
+          </w:p>
+        </w:tc>
+        <w:tc>
+          <w:tcPr>
+            <w:tcW w:type="dxa" w:w="1728"/>
+          </w:tcPr>
+          <w:p>
+            <w:r/>
+            <w:r>
+              <w:rPr>
+                <w:b/>
+              </w:rPr>
+              <w:t>0,042</w:t>
+            </w:r>
+          </w:p>
+        </w:tc>
+        <w:tc>
+          <w:tcPr>
+            <w:tcW w:type="dxa" w:w="1728"/>
+          </w:tcPr>
+          <w:p>
+            <w:r/>
+            <w:r>
+              <w:rPr>
+                <w:b/>
+              </w:rPr>
+              <w:t>0,079</w:t>
+            </w:r>
+          </w:p>
+        </w:tc>
+        <w:tc>
+          <w:tcPr>
+            <w:tcW w:type="dxa" w:w="1728"/>
+          </w:tcPr>
+          <w:p>
+            <w:r/>
+            <w:r>
+              <w:rPr>
+                <w:b/>
+              </w:rPr>
+              <w:t>0,106</w:t>
+            </w:r>
+          </w:p>
+        </w:tc>
+        <w:tc>
+          <w:tcPr>
+            <w:tcW w:type="dxa" w:w="1728"/>
+          </w:tcPr>
+          <w:p>
+            <w:r/>
+            <w:r>
+              <w:rPr>
+                <w:b/>
+              </w:rPr>
+              <w:t>0,117</w:t>
+            </w:r>
+          </w:p>
+        </w:tc>
+      </w:tr>
+      <w:tr>
+        <w:tc>
+          <w:tcPr>
+            <w:tcW w:type="dxa" w:w="1728"/>
+          </w:tcPr>
+          <w:p>
+            <w:r/>
+            <w:r>
+              <w:t>Completo (sin truncar)</w:t>
+            </w:r>
+          </w:p>
+        </w:tc>
+        <w:tc>
+          <w:tcPr>
+            <w:tcW w:type="dxa" w:w="1728"/>
+          </w:tcPr>
+          <w:p>
+            <w:r/>
+            <w:r>
+              <w:rPr>
+                <w:b/>
+              </w:rPr>
+              <w:t>0,191</w:t>
+            </w:r>
+          </w:p>
+        </w:tc>
+        <w:tc>
+          <w:tcPr>
+            <w:tcW w:type="dxa" w:w="1728"/>
+          </w:tcPr>
+          <w:p>
+            <w:r/>
+            <w:r>
+              <w:rPr>
+                <w:b/>
+              </w:rPr>
+              <w:t>0,385</w:t>
+            </w:r>
+          </w:p>
+        </w:tc>
+        <w:tc>
+          <w:tcPr>
+            <w:tcW w:type="dxa" w:w="1728"/>
+          </w:tcPr>
+          <w:p>
+            <w:r/>
+            <w:r>
+              <w:rPr>
+                <w:b/>
+              </w:rPr>
+              <w:t>0,407</w:t>
+            </w:r>
+          </w:p>
+        </w:tc>
+        <w:tc>
+          <w:tcPr>
+            <w:tcW w:type="dxa" w:w="1728"/>
+          </w:tcPr>
+          <w:p>
+            <w:r/>
+            <w:r>
+              <w:rPr>
+                <w:b/>
+              </w:rPr>
+              <w:t>0,407</w:t>
+            </w:r>
+          </w:p>
+        </w:tc>
+      </w:tr>
+    </w:tbl>
+    <w:p>
+      <w:pPr>
+        <w:pStyle w:val="ListBullet"/>
+      </w:pPr>
+      <w:r>
+        <w:t xml:space="preserve">Con truncamiento queda </w:t>
+      </w:r>
+      <w:r>
+        <w:rPr>
+          <w:b/>
+        </w:rPr>
+        <w:t>bajo `2q` en las 80 réplicas</w:t>
+      </w:r>
+      <w:r>
+        <w:t xml:space="preserve"> (por eso la figura</w:t>
+      </w:r>
+    </w:p>
+    <w:p>
+      <w:r>
+        <w:t>original lo mostraba como validación de la cota).</w:t>
+      </w:r>
+    </w:p>
+    <w:p>
+      <w:pPr>
+        <w:pStyle w:val="ListBullet"/>
+      </w:pPr>
+      <w:r>
+        <w:t xml:space="preserve">Sin truncar </w:t>
+      </w:r>
+      <w:r>
+        <w:rPr>
+          <w:b/>
+        </w:rPr>
+        <w:t>supera `2q` en las 80 réplicas</w:t>
+      </w:r>
+      <w:r>
+        <w:t xml:space="preserve"> y se satura en 0,407 ≈ la mitad</w:t>
+      </w:r>
+    </w:p>
+    <w:p>
+      <w:r>
+        <w:t>de la persistencia del ciclo: el costo de emparejarlo con la diagonal cuando el</w:t>
+      </w:r>
+    </w:p>
+    <w:p>
+      <w:r>
+        <w:t>ruido lo destruye.</w:t>
+      </w:r>
+    </w:p>
+    <w:p>
+      <w:r>
+        <w:rPr>
+          <w:b/>
+        </w:rPr>
+        <w:t>Panel (b):</w:t>
+      </w:r>
+      <w:r>
+        <w:t xml:space="preserve"> sobre las 1 680 réplicas de la Fig. 5.2, </w:t>
+      </w:r>
+      <w:r>
+        <w:rPr>
+          <w:rFonts w:ascii="Consolas" w:hAnsi="Consolas"/>
+          <w:sz w:val="20"/>
+        </w:rPr>
+        <w:t>dB</w:t>
+      </w:r>
+      <w:r>
+        <w:t xml:space="preserve"> dividida por</w:t>
+      </w:r>
+    </w:p>
+    <w:p>
+      <w:r>
+        <w:rPr>
+          <w:rFonts w:ascii="Consolas" w:hAnsi="Consolas"/>
+          <w:sz w:val="20"/>
+        </w:rPr>
+        <w:t>2σ(√d + √(2·ln(n/δ)))</w:t>
+      </w:r>
+      <w:r>
+        <w:t xml:space="preserve"> con δ = 0,05: **máximo 0,442, media 0,213, 0</w:t>
+      </w:r>
+    </w:p>
+    <w:p>
+      <w:r>
+        <w:t>violaciones** (documento: 0,44 y 0,21; tolerancia teórica del 5 %).</w:t>
+      </w:r>
+    </w:p>
+    <w:p>
+      <w:r>
+        <w:rPr>
+          <w:b/>
+        </w:rPr>
+        <w:t>Consecuencia:</w:t>
+      </w:r>
+      <w:r>
+        <w:t xml:space="preserve"> la cota </w:t>
+      </w:r>
+      <w:r>
+        <w:rPr>
+          <w:rFonts w:ascii="Consolas" w:hAnsi="Consolas"/>
+          <w:sz w:val="20"/>
+        </w:rPr>
+        <w:t>dB/diam ≤ 2q</w:t>
+      </w:r>
+      <w:r>
+        <w:t xml:space="preserve"> </w:t>
+      </w:r>
+      <w:r>
+        <w:rPr>
+          <w:b/>
+        </w:rPr>
+        <w:t>no tenía respaldo teórico</w:t>
+      </w:r>
+      <w:r>
+        <w:t>; la que sí</w:t>
+      </w:r>
+    </w:p>
+    <w:p>
+      <w:r>
+        <w:t>lo tiene (Proposición 4.3) es la probabilística, y se cumple con holgura. Los</w:t>
+      </w:r>
+    </w:p>
+    <w:p>
+      <w:r>
+        <w:t xml:space="preserve">Items 25 y 26 quedan superados; los PNG </w:t>
+      </w:r>
+      <w:r>
+        <w:rPr>
+          <w:rFonts w:ascii="Consolas" w:hAnsi="Consolas"/>
+          <w:sz w:val="20"/>
+        </w:rPr>
+        <w:t>fig53a_forma_documento.png</w:t>
+      </w:r>
+      <w:r>
+        <w:t xml:space="preserve"> y</w:t>
+      </w:r>
+    </w:p>
+    <w:p>
+      <w:r>
+        <w:rPr>
+          <w:rFonts w:ascii="Consolas" w:hAnsi="Consolas"/>
+          <w:sz w:val="20"/>
+        </w:rPr>
+        <w:t>fig53b_forma_teorema.png</w:t>
+      </w:r>
+      <w:r>
+        <w:t xml:space="preserve"> </w:t>
+      </w:r>
+      <w:r>
+        <w:rPr>
+          <w:b/>
+        </w:rPr>
+        <w:t>se retiran</w:t>
+      </w:r>
+      <w:r>
+        <w:t>.</w:t>
+      </w:r>
+    </w:p>
+    <w:p>
+      <w:r>
+        <w:rPr>
+          <w:b/>
+        </w:rPr>
+        <w:t>Artefactos:</w:t>
+      </w:r>
+      <w:r>
+        <w:t xml:space="preserve"> </w:t>
+      </w:r>
+      <w:r>
+        <w:rPr>
+          <w:rFonts w:ascii="Consolas" w:hAnsi="Consolas"/>
+          <w:sz w:val="20"/>
+        </w:rPr>
+        <w:t>data/figuras/fig53_cota_corregida.png</w:t>
+      </w:r>
+      <w:r>
+        <w:t>,</w:t>
+      </w:r>
+    </w:p>
+    <w:p>
+      <w:r>
+        <w:rPr>
+          <w:rFonts w:ascii="Consolas" w:hAnsi="Consolas"/>
+          <w:sz w:val="20"/>
+        </w:rPr>
+        <w:t>data/figuras/fig53_truncamiento.csv</w:t>
+      </w:r>
+      <w:r>
+        <w:t>.</w:t>
+      </w:r>
+    </w:p>
+    <w:p>
+      <w:pPr>
+        <w:pStyle w:val="Heading1"/>
+      </w:pPr>
+      <w:r>
         <w:t>Resumen de trazabilidad (software → tesis)</w:t>
       </w:r>
     </w:p>
@@ -7924,7 +8570,61 @@
           <w:p>
             <w:r/>
             <w:r>
-              <w:t>5.2(b–c), 5.3</w:t>
+              <w:t>5.2(b–c), 5.3(b)</w:t>
+            </w:r>
+          </w:p>
+        </w:tc>
+      </w:tr>
+      <w:tr>
+        <w:tc>
+          <w:tcPr>
+            <w:tcW w:type="dxa" w:w="2160"/>
+          </w:tcPr>
+          <w:p>
+            <w:r/>
+            <w:r>
+              <w:t>Artefacto del truncamiento</w:t>
+            </w:r>
+          </w:p>
+        </w:tc>
+        <w:tc>
+          <w:tcPr>
+            <w:tcW w:type="dxa" w:w="2160"/>
+          </w:tcPr>
+          <w:p>
+            <w:r/>
+            <w:r>
+              <w:rPr>
+                <w:rFonts w:ascii="Consolas" w:hAnsi="Consolas"/>
+                <w:sz w:val="20"/>
+              </w:rPr>
+              <w:t>truncamiento.analisis_truncamiento</w:t>
+            </w:r>
+          </w:p>
+        </w:tc>
+        <w:tc>
+          <w:tcPr>
+            <w:tcW w:type="dxa" w:w="2160"/>
+          </w:tcPr>
+          <w:p>
+            <w:r/>
+            <w:r>
+              <w:rPr>
+                <w:rFonts w:ascii="Consolas" w:hAnsi="Consolas"/>
+                <w:sz w:val="20"/>
+              </w:rPr>
+              <w:t>data/figuras/fig53_truncamiento.csv</w:t>
+            </w:r>
+          </w:p>
+        </w:tc>
+        <w:tc>
+          <w:tcPr>
+            <w:tcW w:type="dxa" w:w="2160"/>
+          </w:tcPr>
+          <w:p>
+            <w:r/>
+            <w:r>
+              <w:t>5.3(a)</w:t>
             </w:r>
           </w:p>
         </w:tc>

</xml_diff>

<commit_message>
docs: add Items 33, 34 and 35 to Correcciones_Documento_Principal.md and regenerate docx
Documented:
- Item 33: the critical minimax fix in bottleneck_distance (max-flow).
- Item 34: full UI alignment and backend figure integration for H.E.1 and H.E.2.
- Item 35: the repaired H.G. integration consuming correct session state keys.
Updated the docx artifact accordingly.
</commit_message>
<xml_diff>
--- a/docs/Correcciones_Documento_Principal.docx
+++ b/docs/Correcciones_Documento_Principal.docx
@@ -8425,6 +8425,255 @@
       </w:r>
       <w:r>
         <w:t>.</w:t>
+      </w:r>
+    </w:p>
+    <w:p>
+      <w:pPr>
+        <w:pStyle w:val="Heading1"/>
+      </w:pPr>
+      <w:r>
+        <w:t>Item 33 — Corrección crítica: distancia bottleneck exacta (minimax)</w:t>
+      </w:r>
+    </w:p>
+    <w:p>
+      <w:r>
+        <w:rPr>
+          <w:b/>
+        </w:rPr>
+        <w:t>Qué se hizo:</w:t>
+      </w:r>
+      <w:r>
+        <w:t xml:space="preserve"> se reemplazó la implementación de </w:t>
+      </w:r>
+      <w:r>
+        <w:rPr>
+          <w:rFonts w:ascii="Consolas" w:hAnsi="Consolas"/>
+          <w:sz w:val="20"/>
+        </w:rPr>
+        <w:t>bottleneck_distance</w:t>
+      </w:r>
+      <w:r>
+        <w:t xml:space="preserve"> en </w:t>
+      </w:r>
+      <w:r>
+        <w:rPr>
+          <w:rFonts w:ascii="Consolas" w:hAnsi="Consolas"/>
+          <w:sz w:val="20"/>
+        </w:rPr>
+        <w:t>src/tda/core/topology.py</w:t>
+      </w:r>
+      <w:r>
+        <w:t xml:space="preserve">. Usaba </w:t>
+      </w:r>
+      <w:r>
+        <w:rPr>
+          <w:rFonts w:ascii="Consolas" w:hAnsi="Consolas"/>
+          <w:sz w:val="20"/>
+        </w:rPr>
+        <w:t>scipy.optimize.linear_sum_assignment</w:t>
+      </w:r>
+      <w:r>
+        <w:t xml:space="preserve"> (que minimiza la </w:t>
+      </w:r>
+      <w:r>
+        <w:rPr>
+          <w:b/>
+        </w:rPr>
+        <w:t>suma</w:t>
+      </w:r>
+      <w:r>
+        <w:t xml:space="preserve"> de costos); la distancia bottleneck exige minimizar el </w:t>
+      </w:r>
+      <w:r>
+        <w:rPr>
+          <w:b/>
+        </w:rPr>
+        <w:t>máximo</w:t>
+      </w:r>
+      <w:r>
+        <w:t xml:space="preserve"> costo (</w:t>
+      </w:r>
+      <w:r>
+        <w:rPr>
+          <w:b/>
+        </w:rPr>
+        <w:t>minimax</w:t>
+      </w:r>
+      <w:r>
+        <w:t>).</w:t>
+      </w:r>
+    </w:p>
+    <w:p>
+      <w:r>
+        <w:rPr>
+          <w:b/>
+        </w:rPr>
+        <w:t>Impacto y evidencia:</w:t>
+      </w:r>
+      <w:r>
+        <w:t xml:space="preserve"> medido en 150 diagramas aleatorios, el código viejo presentaba </w:t>
+      </w:r>
+      <w:r>
+        <w:rPr>
+          <w:b/>
+        </w:rPr>
+        <w:t>52 errores de sobreestimación</w:t>
+      </w:r>
+      <w:r>
+        <w:t xml:space="preserve"> (hasta +0,27), ocultos porque los tests anteriores solo verificaban dimensiones de salida (</w:t>
+      </w:r>
+      <w:r>
+        <w:rPr>
+          <w:rFonts w:ascii="Consolas" w:hAnsi="Consolas"/>
+          <w:sz w:val="20"/>
+        </w:rPr>
+        <w:t>shape</w:t>
+      </w:r>
+      <w:r>
+        <w:t>). Se sustituyó por búsqueda binaria sobre costos candidatos evaluada con el algoritmo de flujo máximo (</w:t>
+      </w:r>
+      <w:r>
+        <w:rPr>
+          <w:rFonts w:ascii="Consolas" w:hAnsi="Consolas"/>
+          <w:sz w:val="20"/>
+        </w:rPr>
+        <w:t>scipy.sparse.csgraph.maximum_flow</w:t>
+      </w:r>
+      <w:r>
+        <w:t>), exacto y ~3000× más rápido en grafos densos de comodines. Validado contra enumeración exacta (*brute-force*, 150/150) y GUDHI (</w:t>
+      </w:r>
+      <w:r>
+        <w:rPr>
+          <w:rFonts w:ascii="Consolas" w:hAnsi="Consolas"/>
+          <w:sz w:val="20"/>
+        </w:rPr>
+        <w:t>e=0.0</w:t>
+      </w:r>
+      <w:r>
+        <w:t>).</w:t>
+      </w:r>
+    </w:p>
+    <w:p>
+      <w:pPr>
+        <w:pStyle w:val="Heading1"/>
+      </w:pPr>
+      <w:r>
+        <w:t>Item 34 — Unificación de las páginas H.E.1 y H.E.2 en la app Streamlit</w:t>
+      </w:r>
+    </w:p>
+    <w:p>
+      <w:r>
+        <w:rPr>
+          <w:b/>
+        </w:rPr>
+        <w:t>Qué se hizo:</w:t>
+      </w:r>
+    </w:p>
+    <w:p>
+      <w:pPr>
+        <w:pStyle w:val="ListBullet"/>
+      </w:pPr>
+      <w:r>
+        <w:rPr>
+          <w:b/>
+        </w:rPr>
+        <w:t>Página H.E.1:</w:t>
+      </w:r>
+      <w:r>
+        <w:t xml:space="preserve"> Se reestructuró con el mismo diseño formal que H.E.2 (secciones numeradas 1 a 5, botón maestro unificado sin recargas automáticas de disco, presentación secuencial de H.E.1a, H.E.1b con barras de exactitud, H.E.1c con mapa de calor de q*, tabla de veredicto 5.5, exportador ZIP e interactivo pedagógico al pie).</w:t>
+      </w:r>
+    </w:p>
+    <w:p>
+      <w:pPr>
+        <w:pStyle w:val="ListBullet"/>
+      </w:pPr>
+      <w:r>
+        <w:rPr>
+          <w:b/>
+        </w:rPr>
+        <w:t>Página H.E.2:</w:t>
+      </w:r>
+      <w:r>
+        <w:t xml:space="preserve"> Se actualizaron las Figuras 5.4(b), 5.5 (dos paneles apilados), 5.6 (galería de mallas 2D + compliance) y 5.7 (tres paneles: Betti, volumen y diagrama H₁) para invocar directamente a las funciones de renderizado del backend (</w:t>
+      </w:r>
+      <w:r>
+        <w:rPr>
+          <w:rFonts w:ascii="Consolas" w:hAnsi="Consolas"/>
+          <w:sz w:val="20"/>
+        </w:rPr>
+        <w:t>visualization/figuras.py</w:t>
+      </w:r>
+      <w:r>
+        <w:t>) con estricta paridad respecto al PDF corregido.</w:t>
+      </w:r>
+    </w:p>
+    <w:p>
+      <w:pPr>
+        <w:pStyle w:val="Heading1"/>
+      </w:pPr>
+      <w:r>
+        <w:t>Item 35 — Hipótesis General (H.G.) integrada y con protocolo funcional</w:t>
+      </w:r>
+    </w:p>
+    <w:p>
+      <w:r>
+        <w:rPr>
+          <w:b/>
+        </w:rPr>
+        <w:t>Qué se hizo:</w:t>
+      </w:r>
+      <w:r>
+        <w:t xml:space="preserve"> </w:t>
+      </w:r>
+      <w:r>
+        <w:rPr>
+          <w:rFonts w:ascii="Consolas" w:hAnsi="Consolas"/>
+          <w:sz w:val="20"/>
+        </w:rPr>
+        <w:t>3_H.G._Hipotesis_General.py</w:t>
+      </w:r>
+      <w:r>
+        <w:t xml:space="preserve"> se actualizó para consumir las claves unificadas (</w:t>
+      </w:r>
+      <w:r>
+        <w:rPr>
+          <w:rFonts w:ascii="Consolas" w:hAnsi="Consolas"/>
+          <w:sz w:val="20"/>
+        </w:rPr>
+        <w:t>he1_fig52</w:t>
+      </w:r>
+      <w:r>
+        <w:t xml:space="preserve">, </w:t>
+      </w:r>
+      <w:r>
+        <w:rPr>
+          <w:rFonts w:ascii="Consolas" w:hAnsi="Consolas"/>
+          <w:sz w:val="20"/>
+        </w:rPr>
+        <w:t>he1_mcnemar</w:t>
+      </w:r>
+      <w:r>
+        <w:t xml:space="preserve">, </w:t>
+      </w:r>
+      <w:r>
+        <w:rPr>
+          <w:rFonts w:ascii="Consolas" w:hAnsi="Consolas"/>
+          <w:sz w:val="20"/>
+        </w:rPr>
+        <w:t>he1_trunc</w:t>
+      </w:r>
+      <w:r>
+        <w:t>) en lugar de las del protocolo obsoleto. El botón de ejecución automática corre todo el flujo cruzado de TDA y SIMP bajo un contenedor de estado (</w:t>
+      </w:r>
+      <w:r>
+        <w:rPr>
+          <w:rFonts w:ascii="Consolas" w:hAnsi="Consolas"/>
+          <w:sz w:val="20"/>
+        </w:rPr>
+        <w:t>st.status</w:t>
+      </w:r>
+      <w:r>
+        <w:t>), arrojando el semáforo y la Tabla 5.9 completos.</w:t>
       </w:r>
     </w:p>
     <w:p>
@@ -8866,7 +9115,7 @@
           <w:p>
             <w:r/>
             <w:r>
-              <w:t>5.4(b), Tabla 5.6</w:t>
+              <w:t>5.4(a–b), Tabla 5.6</w:t>
             </w:r>
           </w:p>
         </w:tc>
@@ -8894,10 +9143,27 @@
                 <w:rFonts w:ascii="Consolas" w:hAnsi="Consolas"/>
                 <w:sz w:val="20"/>
               </w:rPr>
-              <w:t>experiment_simp</w:t>
+              <w:t>barrido_he2</w:t>
             </w:r>
             <w:r>
-              <w:t xml:space="preserve"> (barridos)</w:t>
+              <w:t xml:space="preserve"> + </w:t>
+            </w:r>
+            <w:r>
+              <w:rPr>
+                <w:rFonts w:ascii="Consolas" w:hAnsi="Consolas"/>
+                <w:sz w:val="20"/>
+              </w:rPr>
+              <w:t>fig_55</w:t>
+            </w:r>
+            <w:r>
+              <w:t>–</w:t>
+            </w:r>
+            <w:r>
+              <w:rPr>
+                <w:rFonts w:ascii="Consolas" w:hAnsi="Consolas"/>
+                <w:sz w:val="20"/>
+              </w:rPr>
+              <w:t>57</w:t>
             </w:r>
           </w:p>
         </w:tc>
@@ -8912,7 +9178,7 @@
                 <w:rFonts w:ascii="Consolas" w:hAnsi="Consolas"/>
                 <w:sz w:val="20"/>
               </w:rPr>
-              <w:t>data/barrido_beta1_HE2b.csv</w:t>
+              <w:t>barrido_HE2b.csv</w:t>
             </w:r>
           </w:p>
         </w:tc>
@@ -8923,7 +9189,7 @@
           <w:p>
             <w:r/>
             <w:r>
-              <w:t>5.5, 5.6, 5.7</w:t>
+              <w:t>5.5(a–b), 5.6(a–b), 5.7(a–c)</w:t>
             </w:r>
           </w:p>
         </w:tc>

</xml_diff>